<commit_message>
Re-organised MS doc to place a section more concretely
</commit_message>
<xml_diff>
--- a/_output/ms.docx
+++ b/_output/ms.docx
@@ -3906,7 +3906,7 @@
     </w:p>
     <w:bookmarkEnd w:id="23"/>
     <w:bookmarkEnd w:id="24"/>
-    <w:bookmarkStart w:id="29" w:name="X46eb6268dcffa0b752ad63ad3dfd63180af2bd8"/>
+    <w:bookmarkStart w:id="30" w:name="X46eb6268dcffa0b752ad63ad3dfd63180af2bd8"/>
     <w:p>
       <w:pPr>
         <w:pStyle w:val="Heading1"/>
@@ -6631,453 +6631,35 @@
         <w:t xml:space="preserve">. Regardless, we recommend using the correction factor as a safeguard. However, computing both the naive and corrected estimates and comparing them is a useful sensitivity check for whether the correction is needed in any given dataset.</w:t>
       </w:r>
     </w:p>
-    <w:bookmarkEnd w:id="29"/>
-    <w:bookmarkStart w:id="34" w:name="X748caa9d6c5389c1517c1b3b0c0fd7ca3896022"/>
-    <w:p>
-      <w:pPr>
-        <w:pStyle w:val="Heading1"/>
-      </w:pPr>
-      <w:r>
-        <w:t xml:space="preserve">Predicting heat injury and survival under dynamic thermal environments</w:t>
-      </w:r>
-    </w:p>
-    <w:p>
-      <w:pPr>
-        <w:pStyle w:val="FirstParagraph"/>
-      </w:pPr>
-      <w:r>
-        <w:t xml:space="preserve">A particularly powerful aspect of TLS models are their ability to translate dynamic temperature times series’ from nature to predict heat injury (HI) accumulation and thus population survival probability</w:t>
-      </w:r>
-      <w:r>
-        <w:t xml:space="preserve"> </w:t>
-      </w:r>
-      <w:r>
-        <w:t xml:space="preserve">(</w:t>
-      </w:r>
-      <w:hyperlink w:anchor="ref-jorgensen_unifying_2021">
-        <w:r>
-          <w:rPr>
-            <w:rStyle w:val="Hyperlink"/>
-          </w:rPr>
-          <w:t xml:space="preserve">Jørgensen</w:t>
-        </w:r>
-        <w:r>
-          <w:rPr>
-            <w:rStyle w:val="Hyperlink"/>
-          </w:rPr>
-          <w:t xml:space="preserve"> </w:t>
-        </w:r>
-        <w:r>
-          <w:rPr>
-            <w:rStyle w:val="Hyperlink"/>
-            <w:i/>
-            <w:iCs/>
-          </w:rPr>
-          <w:t xml:space="preserve">et al.</w:t>
-        </w:r>
-        <w:r>
-          <w:rPr>
-            <w:rStyle w:val="Hyperlink"/>
-          </w:rPr>
-          <w:t xml:space="preserve"> </w:t>
-        </w:r>
-        <w:r>
-          <w:rPr>
-            <w:rStyle w:val="Hyperlink"/>
-          </w:rPr>
-          <w:t xml:space="preserve">2021</w:t>
-        </w:r>
-      </w:hyperlink>
-      <w:r>
-        <w:t xml:space="preserve">;</w:t>
-      </w:r>
-      <w:r>
-        <w:t xml:space="preserve"> </w:t>
-      </w:r>
-      <w:hyperlink w:anchor="ref-li2023">
-        <w:r>
-          <w:rPr>
-            <w:rStyle w:val="Hyperlink"/>
-          </w:rPr>
-          <w:t xml:space="preserve">Li</w:t>
-        </w:r>
-        <w:r>
-          <w:rPr>
-            <w:rStyle w:val="Hyperlink"/>
-          </w:rPr>
-          <w:t xml:space="preserve"> </w:t>
-        </w:r>
-        <w:r>
-          <w:rPr>
-            <w:rStyle w:val="Hyperlink"/>
-            <w:i/>
-            <w:iCs/>
-          </w:rPr>
-          <w:t xml:space="preserve">et al.</w:t>
-        </w:r>
-        <w:r>
-          <w:rPr>
-            <w:rStyle w:val="Hyperlink"/>
-          </w:rPr>
-          <w:t xml:space="preserve"> </w:t>
-        </w:r>
-        <w:r>
-          <w:rPr>
-            <w:rStyle w:val="Hyperlink"/>
-          </w:rPr>
-          <w:t xml:space="preserve">2023</w:t>
-        </w:r>
-      </w:hyperlink>
-      <w:r>
-        <w:t xml:space="preserve">;</w:t>
-      </w:r>
-      <w:r>
-        <w:t xml:space="preserve"> </w:t>
-      </w:r>
-      <w:hyperlink w:anchor="ref-orsted_finding_2022">
-        <w:r>
-          <w:rPr>
-            <w:rStyle w:val="Hyperlink"/>
-          </w:rPr>
-          <w:t xml:space="preserve">Ørsted</w:t>
-        </w:r>
-        <w:r>
-          <w:rPr>
-            <w:rStyle w:val="Hyperlink"/>
-          </w:rPr>
-          <w:t xml:space="preserve"> </w:t>
-        </w:r>
-        <w:r>
-          <w:rPr>
-            <w:rStyle w:val="Hyperlink"/>
-            <w:i/>
-            <w:iCs/>
-          </w:rPr>
-          <w:t xml:space="preserve">et al.</w:t>
-        </w:r>
-        <w:r>
-          <w:rPr>
-            <w:rStyle w:val="Hyperlink"/>
-          </w:rPr>
-          <w:t xml:space="preserve"> </w:t>
-        </w:r>
-        <w:r>
-          <w:rPr>
-            <w:rStyle w:val="Hyperlink"/>
-          </w:rPr>
-          <w:t xml:space="preserve">2022</w:t>
-        </w:r>
-      </w:hyperlink>
-      <w:r>
-        <w:t xml:space="preserve">,</w:t>
-      </w:r>
-      <w:r>
-        <w:t xml:space="preserve"> </w:t>
-      </w:r>
-      <w:hyperlink w:anchor="ref-orsted_suzukii_2024">
-        <w:r>
-          <w:rPr>
-            <w:rStyle w:val="Hyperlink"/>
-          </w:rPr>
-          <w:t xml:space="preserve">2024</w:t>
-        </w:r>
-      </w:hyperlink>
-      <w:r>
-        <w:t xml:space="preserve">;</w:t>
-      </w:r>
-      <w:r>
-        <w:t xml:space="preserve"> </w:t>
-      </w:r>
-      <w:hyperlink w:anchor="ref-rezende_drosophila_mortality_2020">
-        <w:r>
-          <w:rPr>
-            <w:rStyle w:val="Hyperlink"/>
-          </w:rPr>
-          <w:t xml:space="preserve">Rezende</w:t>
-        </w:r>
-        <w:r>
-          <w:rPr>
-            <w:rStyle w:val="Hyperlink"/>
-          </w:rPr>
-          <w:t xml:space="preserve"> </w:t>
-        </w:r>
-        <w:r>
-          <w:rPr>
-            <w:rStyle w:val="Hyperlink"/>
-            <w:i/>
-            <w:iCs/>
-          </w:rPr>
-          <w:t xml:space="preserve">et al.</w:t>
-        </w:r>
-        <w:r>
-          <w:rPr>
-            <w:rStyle w:val="Hyperlink"/>
-          </w:rPr>
-          <w:t xml:space="preserve"> </w:t>
-        </w:r>
-        <w:r>
-          <w:rPr>
-            <w:rStyle w:val="Hyperlink"/>
-          </w:rPr>
-          <w:t xml:space="preserve">2020</w:t>
-        </w:r>
-      </w:hyperlink>
-      <w:r>
-        <w:t xml:space="preserve">)</w:t>
-      </w:r>
-      <w:r>
-        <w:t xml:space="preserve">. Heat injury accumulates as the time spent at a given temperature divided by the median lethal time at that temperature, integrated across the temperature trajectory</w:t>
-      </w:r>
-      <w:r>
-        <w:t xml:space="preserve"> </w:t>
-      </w:r>
-      <m:oMath>
-        <m:r>
-          <m:t>T</m:t>
-        </m:r>
-        <m:d>
-          <m:dPr>
-            <m:begChr m:val="("/>
-            <m:sepChr m:val=""/>
-            <m:endChr m:val=")"/>
-            <m:grow/>
-          </m:dPr>
-          <m:e>
-            <m:r>
-              <m:t>i</m:t>
-            </m:r>
-          </m:e>
-        </m:d>
-      </m:oMath>
-      <w:r>
-        <w:t xml:space="preserve"> </w:t>
-      </w:r>
-      <w:r>
-        <w:t xml:space="preserve">as follows:</w:t>
-      </w:r>
-    </w:p>
     <w:p>
       <w:pPr>
         <w:pStyle w:val="BodyText"/>
       </w:pPr>
-      <w:bookmarkStart w:id="30" w:name="eq-hi"/>
-      <m:oMathPara>
-        <m:oMathParaPr>
-          <m:jc m:val="center"/>
-        </m:oMathParaPr>
-        <m:oMath>
-          <m:r>
-            <m:t>H</m:t>
-          </m:r>
-          <m:r>
-            <m:t>I</m:t>
-          </m:r>
-          <m:d>
-            <m:dPr>
-              <m:begChr m:val="("/>
-              <m:sepChr m:val=""/>
-              <m:endChr m:val=")"/>
-              <m:grow/>
-            </m:dPr>
-            <m:e>
-              <m:r>
-                <m:t>t</m:t>
-              </m:r>
-            </m:e>
-          </m:d>
-          <m:r>
-            <m:t> </m:t>
-          </m:r>
-          <m:r>
-            <m:rPr>
-              <m:sty m:val="p"/>
-            </m:rPr>
-            <m:t>=</m:t>
-          </m:r>
-          <m:r>
-            <m:t> </m:t>
-          </m:r>
-          <m:r>
-            <m:t>100</m:t>
-          </m:r>
-          <m:nary>
-            <m:naryPr>
-              <m:chr m:val="∫"/>
-              <m:limLoc m:val="subSup"/>
-              <m:subHide m:val="off"/>
-              <m:supHide m:val="off"/>
-            </m:naryPr>
-            <m:sub>
-              <m:r>
-                <m:t>0</m:t>
-              </m:r>
-            </m:sub>
-            <m:sup>
-              <m:r>
-                <m:t>t</m:t>
-              </m:r>
-            </m:sup>
-            <m:e>
-              <m:sSup>
-                <m:e>
-                  <m:r>
-                    <m:t>10</m:t>
-                  </m:r>
-                </m:e>
-                <m:sup>
-                  <m:r>
-                    <m:t> </m:t>
-                  </m:r>
-                  <m:d>
-                    <m:dPr>
-                      <m:begChr m:val="("/>
-                      <m:sepChr m:val=""/>
-                      <m:endChr m:val=")"/>
-                      <m:grow/>
-                    </m:dPr>
-                    <m:e>
-                      <m:r>
-                        <m:t>T</m:t>
-                      </m:r>
-                      <m:d>
-                        <m:dPr>
-                          <m:begChr m:val="("/>
-                          <m:sepChr m:val=""/>
-                          <m:endChr m:val=")"/>
-                          <m:grow/>
-                        </m:dPr>
-                        <m:e>
-                          <m:r>
-                            <m:t>i</m:t>
-                          </m:r>
-                        </m:e>
-                      </m:d>
-                      <m:r>
-                        <m:t> </m:t>
-                      </m:r>
-                      <m:r>
-                        <m:rPr>
-                          <m:sty m:val="p"/>
-                        </m:rPr>
-                        <m:t>−</m:t>
-                      </m:r>
-                      <m:r>
-                        <m:t> </m:t>
-                      </m:r>
-                      <m:r>
-                        <m:t>C</m:t>
-                      </m:r>
-                      <m:sSub>
-                        <m:e>
-                          <m:r>
-                            <m:t>T</m:t>
-                          </m:r>
-                        </m:e>
-                        <m:sub>
-                          <m:r>
-                            <m:t>m</m:t>
-                          </m:r>
-                          <m:r>
-                            <m:t>a</m:t>
-                          </m:r>
-                          <m:sSub>
-                            <m:e>
-                              <m:r>
-                                <m:t>x</m:t>
-                              </m:r>
-                            </m:e>
-                            <m:sub>
-                              <m:r>
-                                <m:t>1</m:t>
-                              </m:r>
-                              <m:r>
-                                <m:rPr>
-                                  <m:nor/>
-                                  <m:sty m:val="p"/>
-                                </m:rPr>
-                                <m:t>hr</m:t>
-                              </m:r>
-                            </m:sub>
-                          </m:sSub>
-                        </m:sub>
-                      </m:sSub>
-                    </m:e>
-                  </m:d>
-                  <m:r>
-                    <m:rPr>
-                      <m:sty m:val="p"/>
-                    </m:rPr>
-                    <m:t>/</m:t>
-                  </m:r>
-                  <m:r>
-                    <m:t>z</m:t>
-                  </m:r>
-                </m:sup>
-              </m:sSup>
-            </m:e>
-          </m:nary>
-          <m:r>
-            <m:t> </m:t>
-          </m:r>
-          <m:r>
-            <m:t>d</m:t>
-          </m:r>
-          <m:r>
-            <m:t>i</m:t>
-          </m:r>
-          <m:r>
-            <m:rPr>
-              <m:sty m:val="p"/>
-            </m:rPr>
-            <m:t>,</m:t>
-          </m:r>
-          <m:r>
-            <m:t>  </m:t>
-          </m:r>
-          <m:d>
-            <m:dPr>
-              <m:begChr m:val="("/>
-              <m:sepChr m:val=""/>
-              <m:endChr m:val=")"/>
-              <m:grow/>
-            </m:dPr>
-            <m:e>
-              <m:r>
-                <m:t>7</m:t>
-              </m:r>
-            </m:e>
-          </m:d>
-        </m:oMath>
-      </m:oMathPara>
-      <w:bookmarkEnd w:id="30"/>
-    </w:p>
-    <w:p>
-      <w:pPr>
-        <w:pStyle w:val="FirstParagraph"/>
-      </w:pPr>
-      <w:r>
-        <w:t xml:space="preserve">where</w:t>
+      <w:r>
+        <w:t xml:space="preserve">The same derivation generalises beyond the median: the Bayesian dose-response fit gives access to</w:t>
+      </w:r>
+      <w:r>
+        <w:t xml:space="preserve"> </w:t>
+      </w:r>
+      <w:r>
+        <w:rPr>
+          <w:i/>
+          <w:iCs/>
+        </w:rPr>
+        <w:t xml:space="preserve">any</w:t>
+      </w:r>
+      <w:r>
+        <w:t xml:space="preserve"> </w:t>
+      </w:r>
+      <w:r>
+        <w:t xml:space="preserve">mortality percentile, not just</w:t>
       </w:r>
       <w:r>
         <w:t xml:space="preserve"> </w:t>
       </w:r>
       <m:oMath>
         <m:r>
-          <m:t>z</m:t>
-        </m:r>
-      </m:oMath>
-      <w:r>
-        <w:t xml:space="preserve"> </w:t>
-      </w:r>
-      <w:r>
-        <w:t xml:space="preserve">is the thermal sensitivity and</w:t>
-      </w:r>
-      <w:r>
-        <w:t xml:space="preserve"> </w:t>
-      </w:r>
-      <m:oMath>
-        <m:r>
-          <m:t>C</m:t>
+          <m:t>L</m:t>
         </m:r>
         <m:sSub>
           <m:e>
@@ -7087,30 +6669,8 @@
           </m:e>
           <m:sub>
             <m:r>
-              <m:t>m</m:t>
-            </m:r>
-            <m:r>
-              <m:t>a</m:t>
-            </m:r>
-            <m:sSub>
-              <m:e>
-                <m:r>
-                  <m:t>x</m:t>
-                </m:r>
-              </m:e>
-              <m:sub>
-                <m:r>
-                  <m:t>1</m:t>
-                </m:r>
-                <m:r>
-                  <m:rPr>
-                    <m:nor/>
-                    <m:sty m:val="p"/>
-                  </m:rPr>
-                  <m:t>hr</m:t>
-                </m:r>
-              </m:sub>
-            </m:sSub>
+              <m:t>50</m:t>
+            </m:r>
           </m:sub>
         </m:sSub>
       </m:oMath>
@@ -7118,31 +6678,107 @@
         <w:t xml:space="preserve"> </w:t>
       </w:r>
       <w:r>
-        <w:t xml:space="preserve">is the static temperature at which 50% of the population reaches the assayed endpoint after one hour of exposure. When</w:t>
+        <w:t xml:space="preserve">(</w:t>
+      </w:r>
+      <w:hyperlink w:anchor="ref-jorgensen_unifying_2021">
+        <w:r>
+          <w:rPr>
+            <w:rStyle w:val="Hyperlink"/>
+          </w:rPr>
+          <w:t xml:space="preserve">Jørgensen</w:t>
+        </w:r>
+        <w:r>
+          <w:rPr>
+            <w:rStyle w:val="Hyperlink"/>
+          </w:rPr>
+          <w:t xml:space="preserve"> </w:t>
+        </w:r>
+        <w:r>
+          <w:rPr>
+            <w:rStyle w:val="Hyperlink"/>
+            <w:i/>
+            <w:iCs/>
+          </w:rPr>
+          <w:t xml:space="preserve">et al.</w:t>
+        </w:r>
+        <w:r>
+          <w:rPr>
+            <w:rStyle w:val="Hyperlink"/>
+          </w:rPr>
+          <w:t xml:space="preserve"> </w:t>
+        </w:r>
+        <w:r>
+          <w:rPr>
+            <w:rStyle w:val="Hyperlink"/>
+          </w:rPr>
+          <w:t xml:space="preserve">2021</w:t>
+        </w:r>
+      </w:hyperlink>
+      <w:r>
+        <w:t xml:space="preserve">;</w:t>
+      </w:r>
+      <w:r>
+        <w:t xml:space="preserve"> </w:t>
+      </w:r>
+      <w:hyperlink w:anchor="ref-rezende_drosophila_mortality_2020">
+        <w:r>
+          <w:rPr>
+            <w:rStyle w:val="Hyperlink"/>
+          </w:rPr>
+          <w:t xml:space="preserve">Rezende</w:t>
+        </w:r>
+        <w:r>
+          <w:rPr>
+            <w:rStyle w:val="Hyperlink"/>
+          </w:rPr>
+          <w:t xml:space="preserve"> </w:t>
+        </w:r>
+        <w:r>
+          <w:rPr>
+            <w:rStyle w:val="Hyperlink"/>
+            <w:i/>
+            <w:iCs/>
+          </w:rPr>
+          <w:t xml:space="preserve">et al.</w:t>
+        </w:r>
+        <w:r>
+          <w:rPr>
+            <w:rStyle w:val="Hyperlink"/>
+          </w:rPr>
+          <w:t xml:space="preserve"> </w:t>
+        </w:r>
+        <w:r>
+          <w:rPr>
+            <w:rStyle w:val="Hyperlink"/>
+          </w:rPr>
+          <w:t xml:space="preserve">2020</w:t>
+        </w:r>
+      </w:hyperlink>
+      <w:r>
+        <w:t xml:space="preserve">)</w:t>
+      </w:r>
+      <w:r>
+        <w:t xml:space="preserve">. Setting</w:t>
       </w:r>
       <w:r>
         <w:t xml:space="preserve"> </w:t>
       </w:r>
       <m:oMath>
-        <m:r>
-          <m:t>H</m:t>
-        </m:r>
-        <m:r>
-          <m:t>I</m:t>
-        </m:r>
-        <m:d>
-          <m:dPr>
-            <m:begChr m:val="("/>
-            <m:sepChr m:val=""/>
-            <m:endChr m:val=")"/>
-            <m:grow/>
-          </m:dPr>
+        <m:sSub>
           <m:e>
             <m:r>
-              <m:t>t</m:t>
+              <m:t>p</m:t>
             </m:r>
           </m:e>
-        </m:d>
+          <m:sub>
+            <m:r>
+              <m:t>i</m:t>
+            </m:r>
+            <m:r>
+              <m:t>j</m:t>
+            </m:r>
+          </m:sub>
+        </m:sSub>
         <m:r>
           <m:rPr>
             <m:sty m:val="p"/>
@@ -7150,17 +6786,40 @@
           <m:t>=</m:t>
         </m:r>
         <m:r>
-          <m:t>100</m:t>
+          <m:t>x</m:t>
         </m:r>
         <m:r>
           <m:rPr>
             <m:sty m:val="p"/>
           </m:rPr>
-          <m:t>%</m:t>
+          <m:t>/</m:t>
+        </m:r>
+        <m:r>
+          <m:t>100</m:t>
         </m:r>
       </m:oMath>
       <w:r>
-        <w:t xml:space="preserve">, the cumulative dose equals one</w:t>
+        <w:t xml:space="preserve"> </w:t>
+      </w:r>
+      <w:r>
+        <w:t xml:space="preserve">in</w:t>
+      </w:r>
+      <w:r>
+        <w:t xml:space="preserve"> </w:t>
+      </w:r>
+      <w:hyperlink w:anchor="eq-4pl">
+        <w:r>
+          <w:rPr>
+            <w:rStyle w:val="Hyperlink"/>
+          </w:rPr>
+          <w:t xml:space="preserve">Equation 2</w:t>
+        </w:r>
+      </w:hyperlink>
+      <w:r>
+        <w:t xml:space="preserve"> </w:t>
+      </w:r>
+      <w:r>
+        <w:t xml:space="preserve">and following the same algebra used for</w:t>
       </w:r>
       <w:r>
         <w:t xml:space="preserve"> </w:t>
@@ -7183,1337 +6842,7 @@
         </m:sSub>
       </m:oMath>
       <w:r>
-        <w:t xml:space="preserve"> </w:t>
-      </w:r>
-      <w:r>
-        <w:t xml:space="preserve">at the 1-hour reference, predicting 50% mortality (or 50% loss of the assayed sublethal endpoint, e.g. fertility;</w:t>
-      </w:r>
-      <w:r>
-        <w:t xml:space="preserve"> </w:t>
-      </w:r>
-      <w:r>
-        <w:t xml:space="preserve">Ørsted</w:t>
-      </w:r>
-      <w:r>
-        <w:t xml:space="preserve"> </w:t>
-      </w:r>
-      <w:r>
-        <w:rPr>
-          <w:i/>
-          <w:iCs/>
-        </w:rPr>
-        <w:t xml:space="preserve">et al.</w:t>
-      </w:r>
-      <w:r>
-        <w:t xml:space="preserve"> </w:t>
-      </w:r>
-      <w:r>
-        <w:t xml:space="preserve">(</w:t>
-      </w:r>
-      <w:hyperlink w:anchor="ref-orsted_suzukii_2024">
-        <w:r>
-          <w:rPr>
-            <w:rStyle w:val="Hyperlink"/>
-          </w:rPr>
-          <w:t xml:space="preserve">2024</w:t>
-        </w:r>
-      </w:hyperlink>
-      <w:r>
-        <w:t xml:space="preserve">)</w:t>
-      </w:r>
-      <w:r>
-        <w:t xml:space="preserve">). Injury accumulates only when</w:t>
-      </w:r>
-      <w:r>
-        <w:t xml:space="preserve"> </w:t>
-      </w:r>
-      <m:oMath>
-        <m:r>
-          <m:t>T</m:t>
-        </m:r>
-        <m:d>
-          <m:dPr>
-            <m:begChr m:val="("/>
-            <m:sepChr m:val=""/>
-            <m:endChr m:val=")"/>
-            <m:grow/>
-          </m:dPr>
-          <m:e>
-            <m:r>
-              <m:t>i</m:t>
-            </m:r>
-          </m:e>
-        </m:d>
-      </m:oMath>
-      <w:r>
-        <w:t xml:space="preserve"> </w:t>
-      </w:r>
-      <w:r>
-        <w:t xml:space="preserve">exceeds a critical temperature</w:t>
-      </w:r>
-      <w:r>
-        <w:t xml:space="preserve"> </w:t>
-      </w:r>
-      <m:oMath>
-        <m:sSub>
-          <m:e>
-            <m:r>
-              <m:t>T</m:t>
-            </m:r>
-          </m:e>
-          <m:sub>
-            <m:r>
-              <m:t>c</m:t>
-            </m:r>
-          </m:sub>
-        </m:sSub>
-      </m:oMath>
-      <w:r>
-        <w:t xml:space="preserve"> </w:t>
-      </w:r>
-      <w:r>
-        <w:t xml:space="preserve">below which damage is repaired as fast as it accrues</w:t>
-      </w:r>
-      <w:r>
-        <w:t xml:space="preserve"> </w:t>
-      </w:r>
-      <w:r>
-        <w:t xml:space="preserve">(</w:t>
-      </w:r>
-      <w:hyperlink w:anchor="ref-jorgensen_unifying_2021">
-        <w:r>
-          <w:rPr>
-            <w:rStyle w:val="Hyperlink"/>
-          </w:rPr>
-          <w:t xml:space="preserve">Jørgensen</w:t>
-        </w:r>
-        <w:r>
-          <w:rPr>
-            <w:rStyle w:val="Hyperlink"/>
-          </w:rPr>
-          <w:t xml:space="preserve"> </w:t>
-        </w:r>
-        <w:r>
-          <w:rPr>
-            <w:rStyle w:val="Hyperlink"/>
-            <w:i/>
-            <w:iCs/>
-          </w:rPr>
-          <w:t xml:space="preserve">et al.</w:t>
-        </w:r>
-        <w:r>
-          <w:rPr>
-            <w:rStyle w:val="Hyperlink"/>
-          </w:rPr>
-          <w:t xml:space="preserve"> </w:t>
-        </w:r>
-        <w:r>
-          <w:rPr>
-            <w:rStyle w:val="Hyperlink"/>
-          </w:rPr>
-          <w:t xml:space="preserve">2021</w:t>
-        </w:r>
-      </w:hyperlink>
-      <w:r>
-        <w:t xml:space="preserve">;</w:t>
-      </w:r>
-      <w:r>
-        <w:t xml:space="preserve"> </w:t>
-      </w:r>
-      <w:hyperlink w:anchor="ref-orsted_finding_2022">
-        <w:r>
-          <w:rPr>
-            <w:rStyle w:val="Hyperlink"/>
-          </w:rPr>
-          <w:t xml:space="preserve">Ørsted</w:t>
-        </w:r>
-        <w:r>
-          <w:rPr>
-            <w:rStyle w:val="Hyperlink"/>
-          </w:rPr>
-          <w:t xml:space="preserve"> </w:t>
-        </w:r>
-        <w:r>
-          <w:rPr>
-            <w:rStyle w:val="Hyperlink"/>
-            <w:i/>
-            <w:iCs/>
-          </w:rPr>
-          <w:t xml:space="preserve">et al.</w:t>
-        </w:r>
-        <w:r>
-          <w:rPr>
-            <w:rStyle w:val="Hyperlink"/>
-          </w:rPr>
-          <w:t xml:space="preserve"> </w:t>
-        </w:r>
-        <w:r>
-          <w:rPr>
-            <w:rStyle w:val="Hyperlink"/>
-          </w:rPr>
-          <w:t xml:space="preserve">2022</w:t>
-        </w:r>
-      </w:hyperlink>
-      <w:r>
-        <w:t xml:space="preserve">)</w:t>
-      </w:r>
-      <w:r>
-        <w:t xml:space="preserve">. Field temperature records are typically available at hourly resolution.</w:t>
-      </w:r>
-      <w:r>
-        <w:t xml:space="preserve"> </w:t>
-      </w:r>
-      <w:hyperlink w:anchor="eq-hi">
-        <w:r>
-          <w:rPr>
-            <w:rStyle w:val="Hyperlink"/>
-          </w:rPr>
-          <w:t xml:space="preserve">Equation 7</w:t>
-        </w:r>
-      </w:hyperlink>
-      <w:r>
-        <w:t xml:space="preserve"> </w:t>
-      </w:r>
-      <w:r>
-        <w:t xml:space="preserve">can then be evaluated by summing</w:t>
-      </w:r>
-      <w:r>
-        <w:t xml:space="preserve"> </w:t>
-      </w:r>
-      <m:oMath>
-        <m:r>
-          <m:t>100</m:t>
-        </m:r>
-        <m:r>
-          <m:rPr>
-            <m:sty m:val="p"/>
-          </m:rPr>
-          <m:t>⋅</m:t>
-        </m:r>
-        <m:sSup>
-          <m:e>
-            <m:r>
-              <m:t>10</m:t>
-            </m:r>
-          </m:e>
-          <m:sup>
-            <m:d>
-              <m:dPr>
-                <m:begChr m:val="("/>
-                <m:sepChr m:val=""/>
-                <m:endChr m:val=")"/>
-                <m:grow/>
-              </m:dPr>
-              <m:e>
-                <m:sSub>
-                  <m:e>
-                    <m:r>
-                      <m:t>T</m:t>
-                    </m:r>
-                  </m:e>
-                  <m:sub>
-                    <m:r>
-                      <m:t>i</m:t>
-                    </m:r>
-                  </m:sub>
-                </m:sSub>
-                <m:r>
-                  <m:rPr>
-                    <m:sty m:val="p"/>
-                  </m:rPr>
-                  <m:t>−</m:t>
-                </m:r>
-                <m:r>
-                  <m:t>C</m:t>
-                </m:r>
-                <m:sSub>
-                  <m:e>
-                    <m:r>
-                      <m:t>T</m:t>
-                    </m:r>
-                  </m:e>
-                  <m:sub>
-                    <m:r>
-                      <m:t>m</m:t>
-                    </m:r>
-                    <m:r>
-                      <m:t>a</m:t>
-                    </m:r>
-                    <m:sSub>
-                      <m:e>
-                        <m:r>
-                          <m:t>x</m:t>
-                        </m:r>
-                      </m:e>
-                      <m:sub>
-                        <m:r>
-                          <m:t>1</m:t>
-                        </m:r>
-                        <m:r>
-                          <m:rPr>
-                            <m:nor/>
-                            <m:sty m:val="p"/>
-                          </m:rPr>
-                          <m:t>hr</m:t>
-                        </m:r>
-                      </m:sub>
-                    </m:sSub>
-                  </m:sub>
-                </m:sSub>
-              </m:e>
-            </m:d>
-            <m:r>
-              <m:rPr>
-                <m:sty m:val="p"/>
-              </m:rPr>
-              <m:t>/</m:t>
-            </m:r>
-            <m:r>
-              <m:t>z</m:t>
-            </m:r>
-          </m:sup>
-        </m:sSup>
-      </m:oMath>
-      <w:r>
-        <w:t xml:space="preserve"> </w:t>
-      </w:r>
-      <w:r>
-        <w:t xml:space="preserve">across each hourly interval whose temperature</w:t>
-      </w:r>
-      <w:r>
-        <w:t xml:space="preserve"> </w:t>
-      </w:r>
-      <m:oMath>
-        <m:sSub>
-          <m:e>
-            <m:r>
-              <m:t>T</m:t>
-            </m:r>
-          </m:e>
-          <m:sub>
-            <m:r>
-              <m:t>i</m:t>
-            </m:r>
-          </m:sub>
-        </m:sSub>
-      </m:oMath>
-      <w:r>
-        <w:t xml:space="preserve"> </w:t>
-      </w:r>
-      <w:r>
-        <w:t xml:space="preserve">exceeds</w:t>
-      </w:r>
-      <w:r>
-        <w:t xml:space="preserve"> </w:t>
-      </w:r>
-      <m:oMath>
-        <m:sSub>
-          <m:e>
-            <m:r>
-              <m:t>T</m:t>
-            </m:r>
-          </m:e>
-          <m:sub>
-            <m:r>
-              <m:t>c</m:t>
-            </m:r>
-          </m:sub>
-        </m:sSub>
-      </m:oMath>
-      <w:r>
-        <w:t xml:space="preserve">, following the implementations in</w:t>
-      </w:r>
-      <w:r>
-        <w:t xml:space="preserve"> </w:t>
-      </w:r>
-      <w:r>
-        <w:t xml:space="preserve">Jørgensen</w:t>
-      </w:r>
-      <w:r>
-        <w:t xml:space="preserve"> </w:t>
-      </w:r>
-      <w:r>
-        <w:rPr>
-          <w:i/>
-          <w:iCs/>
-        </w:rPr>
-        <w:t xml:space="preserve">et al.</w:t>
-      </w:r>
-      <w:r>
-        <w:t xml:space="preserve"> </w:t>
-      </w:r>
-      <w:r>
-        <w:t xml:space="preserve">(</w:t>
-      </w:r>
-      <w:hyperlink w:anchor="ref-jorgensen_unifying_2021">
-        <w:r>
-          <w:rPr>
-            <w:rStyle w:val="Hyperlink"/>
-          </w:rPr>
-          <w:t xml:space="preserve">2021</w:t>
-        </w:r>
-      </w:hyperlink>
-      <w:r>
-        <w:t xml:space="preserve">)</w:t>
-      </w:r>
-      <w:r>
-        <w:t xml:space="preserve">,</w:t>
-      </w:r>
-      <w:r>
-        <w:t xml:space="preserve"> </w:t>
-      </w:r>
-      <w:r>
-        <w:t xml:space="preserve">Ørsted</w:t>
-      </w:r>
-      <w:r>
-        <w:t xml:space="preserve"> </w:t>
-      </w:r>
-      <w:r>
-        <w:rPr>
-          <w:i/>
-          <w:iCs/>
-        </w:rPr>
-        <w:t xml:space="preserve">et al.</w:t>
-      </w:r>
-      <w:r>
-        <w:t xml:space="preserve"> </w:t>
-      </w:r>
-      <w:r>
-        <w:t xml:space="preserve">(</w:t>
-      </w:r>
-      <w:hyperlink w:anchor="ref-orsted_suzukii_2024">
-        <w:r>
-          <w:rPr>
-            <w:rStyle w:val="Hyperlink"/>
-          </w:rPr>
-          <w:t xml:space="preserve">2024</w:t>
-        </w:r>
-      </w:hyperlink>
-      <w:r>
-        <w:t xml:space="preserve">)</w:t>
-      </w:r>
-      <w:r>
-        <w:t xml:space="preserve">, and</w:t>
-      </w:r>
-      <w:r>
-        <w:t xml:space="preserve"> </w:t>
-      </w:r>
-      <w:r>
-        <w:t xml:space="preserve">Li</w:t>
-      </w:r>
-      <w:r>
-        <w:t xml:space="preserve"> </w:t>
-      </w:r>
-      <w:r>
-        <w:rPr>
-          <w:i/>
-          <w:iCs/>
-        </w:rPr>
-        <w:t xml:space="preserve">et al.</w:t>
-      </w:r>
-      <w:r>
-        <w:t xml:space="preserve"> </w:t>
-      </w:r>
-      <w:r>
-        <w:t xml:space="preserve">(</w:t>
-      </w:r>
-      <w:hyperlink w:anchor="ref-li2023">
-        <w:r>
-          <w:rPr>
-            <w:rStyle w:val="Hyperlink"/>
-          </w:rPr>
-          <w:t xml:space="preserve">2023</w:t>
-        </w:r>
-      </w:hyperlink>
-      <w:r>
-        <w:t xml:space="preserve">)</w:t>
-      </w:r>
-      <w:r>
-        <w:t xml:space="preserve">. To propagate uncertainty,</w:t>
-      </w:r>
-      <w:r>
-        <w:t xml:space="preserve"> </w:t>
-      </w:r>
-      <m:oMath>
-        <m:r>
-          <m:t>z</m:t>
-        </m:r>
-      </m:oMath>
-      <w:r>
-        <w:t xml:space="preserve"> </w:t>
-      </w:r>
-      <w:r>
-        <w:t xml:space="preserve">and</w:t>
-      </w:r>
-      <w:r>
-        <w:t xml:space="preserve"> </w:t>
-      </w:r>
-      <m:oMath>
-        <m:r>
-          <m:t>C</m:t>
-        </m:r>
-        <m:sSub>
-          <m:e>
-            <m:r>
-              <m:t>T</m:t>
-            </m:r>
-          </m:e>
-          <m:sub>
-            <m:r>
-              <m:t>m</m:t>
-            </m:r>
-            <m:r>
-              <m:t>a</m:t>
-            </m:r>
-            <m:sSub>
-              <m:e>
-                <m:r>
-                  <m:t>x</m:t>
-                </m:r>
-              </m:e>
-              <m:sub>
-                <m:r>
-                  <m:t>1</m:t>
-                </m:r>
-                <m:r>
-                  <m:rPr>
-                    <m:nor/>
-                    <m:sty m:val="p"/>
-                  </m:rPr>
-                  <m:t>hr</m:t>
-                </m:r>
-              </m:sub>
-            </m:sSub>
-          </m:sub>
-        </m:sSub>
-      </m:oMath>
-      <w:r>
-        <w:t xml:space="preserve">, calculated from our Bayesian dose-response model can be used to calculate</w:t>
-      </w:r>
-      <w:r>
-        <w:t xml:space="preserve"> </w:t>
-      </w:r>
-      <m:oMath>
-        <m:r>
-          <m:t>H</m:t>
-        </m:r>
-        <m:r>
-          <m:t>I</m:t>
-        </m:r>
-        <m:d>
-          <m:dPr>
-            <m:begChr m:val="("/>
-            <m:sepChr m:val=""/>
-            <m:endChr m:val=")"/>
-            <m:grow/>
-          </m:dPr>
-          <m:e>
-            <m:r>
-              <m:t>t</m:t>
-            </m:r>
-          </m:e>
-        </m:d>
-      </m:oMath>
-      <w:r>
-        <w:t xml:space="preserve"> </w:t>
-      </w:r>
-      <w:r>
-        <w:t xml:space="preserve">through time by substituting samples from the posterior distribution for each parameter into</w:t>
-      </w:r>
-      <w:r>
-        <w:t xml:space="preserve"> </w:t>
-      </w:r>
-      <w:hyperlink w:anchor="eq-hi">
-        <w:r>
-          <w:rPr>
-            <w:rStyle w:val="Hyperlink"/>
-          </w:rPr>
-          <w:t xml:space="preserve">Equation 7</w:t>
-        </w:r>
-      </w:hyperlink>
-      <w:r>
-        <w:t xml:space="preserve">.</w:t>
-      </w:r>
-    </w:p>
-    <w:p>
-      <w:pPr>
-        <w:pStyle w:val="BodyText"/>
-      </w:pPr>
-      <w:r>
-        <w:t xml:space="preserve">A more natural prediction to make may instead be the population-level survival probability over time. This has the advantage of allowing for a direct connection to population dynamical models which typically use survival, growth and fecundity as vital rates for population-level predictions</w:t>
-      </w:r>
-      <w:r>
-        <w:t xml:space="preserve"> </w:t>
-      </w:r>
-      <w:r>
-        <w:t xml:space="preserve">(</w:t>
-      </w:r>
-      <w:hyperlink w:anchor="ref-noble2026">
-        <w:r>
-          <w:rPr>
-            <w:rStyle w:val="Hyperlink"/>
-          </w:rPr>
-          <w:t xml:space="preserve">Noble</w:t>
-        </w:r>
-        <w:r>
-          <w:rPr>
-            <w:rStyle w:val="Hyperlink"/>
-          </w:rPr>
-          <w:t xml:space="preserve"> </w:t>
-        </w:r>
-        <w:r>
-          <w:rPr>
-            <w:rStyle w:val="Hyperlink"/>
-            <w:i/>
-            <w:iCs/>
-          </w:rPr>
-          <w:t xml:space="preserve">et al.</w:t>
-        </w:r>
-        <w:r>
-          <w:rPr>
-            <w:rStyle w:val="Hyperlink"/>
-          </w:rPr>
-          <w:t xml:space="preserve"> </w:t>
-        </w:r>
-        <w:r>
-          <w:rPr>
-            <w:rStyle w:val="Hyperlink"/>
-          </w:rPr>
-          <w:t xml:space="preserve">2026</w:t>
-        </w:r>
-      </w:hyperlink>
-      <w:r>
-        <w:t xml:space="preserve">)</w:t>
-      </w:r>
-      <w:r>
-        <w:t xml:space="preserve">. To predict survival, we can calculate the</w:t>
-      </w:r>
-      <w:r>
-        <w:t xml:space="preserve"> </w:t>
-      </w:r>
-      <w:r>
-        <w:rPr>
-          <w:i/>
-          <w:iCs/>
-        </w:rPr>
-        <w:t xml:space="preserve">effective exposure time</w:t>
-      </w:r>
-      <w:r>
-        <w:t xml:space="preserve"> </w:t>
-      </w:r>
-      <w:r>
-        <w:t xml:space="preserve">at a chosen reference temperature</w:t>
-      </w:r>
-      <w:r>
-        <w:t xml:space="preserve"> </w:t>
-      </w:r>
-      <m:oMath>
-        <m:sSub>
-          <m:e>
-            <m:r>
-              <m:t>T</m:t>
-            </m:r>
-          </m:e>
-          <m:sub>
-            <m:r>
-              <m:rPr>
-                <m:nor/>
-                <m:sty m:val="p"/>
-              </m:rPr>
-              <m:t>ref</m:t>
-            </m:r>
-          </m:sub>
-        </m:sSub>
-      </m:oMath>
-      <w:r>
-        <w:t xml:space="preserve">. More effective time is accumulated at hot temperatures and less at cool ones, in proportion to the scaling factor</w:t>
-      </w:r>
-      <w:r>
-        <w:t xml:space="preserve"> </w:t>
-      </w:r>
-      <m:oMath>
-        <m:sSup>
-          <m:e>
-            <m:r>
-              <m:t>10</m:t>
-            </m:r>
-          </m:e>
-          <m:sup>
-            <m:d>
-              <m:dPr>
-                <m:begChr m:val="("/>
-                <m:sepChr m:val=""/>
-                <m:endChr m:val=")"/>
-                <m:grow/>
-              </m:dPr>
-              <m:e>
-                <m:r>
-                  <m:t>T</m:t>
-                </m:r>
-                <m:d>
-                  <m:dPr>
-                    <m:begChr m:val="("/>
-                    <m:sepChr m:val=""/>
-                    <m:endChr m:val=")"/>
-                    <m:grow/>
-                  </m:dPr>
-                  <m:e>
-                    <m:r>
-                      <m:t>i</m:t>
-                    </m:r>
-                  </m:e>
-                </m:d>
-                <m:r>
-                  <m:rPr>
-                    <m:sty m:val="p"/>
-                  </m:rPr>
-                  <m:t>−</m:t>
-                </m:r>
-                <m:sSub>
-                  <m:e>
-                    <m:r>
-                      <m:t>T</m:t>
-                    </m:r>
-                  </m:e>
-                  <m:sub>
-                    <m:r>
-                      <m:rPr>
-                        <m:nor/>
-                        <m:sty m:val="p"/>
-                      </m:rPr>
-                      <m:t>ref</m:t>
-                    </m:r>
-                  </m:sub>
-                </m:sSub>
-              </m:e>
-            </m:d>
-            <m:r>
-              <m:rPr>
-                <m:sty m:val="p"/>
-              </m:rPr>
-              <m:t>/</m:t>
-            </m:r>
-            <m:r>
-              <m:t>z</m:t>
-            </m:r>
-          </m:sup>
-        </m:sSup>
-      </m:oMath>
-      <w:r>
-        <w:t xml:space="preserve">,</w:t>
-      </w:r>
-    </w:p>
-    <w:p>
-      <w:pPr>
-        <w:pStyle w:val="BodyText"/>
-      </w:pPr>
-      <w:bookmarkStart w:id="31" w:name="eq-tau-eff"/>
-      <m:oMathPara>
-        <m:oMathParaPr>
-          <m:jc m:val="center"/>
-        </m:oMathParaPr>
-        <m:oMath>
-          <m:sSub>
-            <m:e>
-              <m:r>
-                <m:t>τ</m:t>
-              </m:r>
-            </m:e>
-            <m:sub>
-              <m:r>
-                <m:rPr>
-                  <m:nor/>
-                  <m:sty m:val="p"/>
-                </m:rPr>
-                <m:t>eff</m:t>
-              </m:r>
-            </m:sub>
-          </m:sSub>
-          <m:d>
-            <m:dPr>
-              <m:begChr m:val="("/>
-              <m:sepChr m:val=""/>
-              <m:endChr m:val=")"/>
-              <m:grow/>
-            </m:dPr>
-            <m:e>
-              <m:r>
-                <m:t>t</m:t>
-              </m:r>
-            </m:e>
-          </m:d>
-          <m:r>
-            <m:t> </m:t>
-          </m:r>
-          <m:r>
-            <m:rPr>
-              <m:sty m:val="p"/>
-            </m:rPr>
-            <m:t>=</m:t>
-          </m:r>
-          <m:r>
-            <m:t> </m:t>
-          </m:r>
-          <m:nary>
-            <m:naryPr>
-              <m:chr m:val="∫"/>
-              <m:limLoc m:val="subSup"/>
-              <m:subHide m:val="off"/>
-              <m:supHide m:val="off"/>
-            </m:naryPr>
-            <m:sub>
-              <m:r>
-                <m:t>0</m:t>
-              </m:r>
-            </m:sub>
-            <m:sup>
-              <m:r>
-                <m:t>t</m:t>
-              </m:r>
-            </m:sup>
-            <m:e>
-              <m:sSup>
-                <m:e>
-                  <m:r>
-                    <m:t>10</m:t>
-                  </m:r>
-                </m:e>
-                <m:sup>
-                  <m:r>
-                    <m:t> </m:t>
-                  </m:r>
-                  <m:d>
-                    <m:dPr>
-                      <m:begChr m:val="("/>
-                      <m:sepChr m:val=""/>
-                      <m:endChr m:val=")"/>
-                      <m:grow/>
-                    </m:dPr>
-                    <m:e>
-                      <m:r>
-                        <m:t>T</m:t>
-                      </m:r>
-                      <m:d>
-                        <m:dPr>
-                          <m:begChr m:val="("/>
-                          <m:sepChr m:val=""/>
-                          <m:endChr m:val=")"/>
-                          <m:grow/>
-                        </m:dPr>
-                        <m:e>
-                          <m:r>
-                            <m:t>i</m:t>
-                          </m:r>
-                        </m:e>
-                      </m:d>
-                      <m:r>
-                        <m:rPr>
-                          <m:sty m:val="p"/>
-                        </m:rPr>
-                        <m:t>−</m:t>
-                      </m:r>
-                      <m:sSub>
-                        <m:e>
-                          <m:r>
-                            <m:t>T</m:t>
-                          </m:r>
-                        </m:e>
-                        <m:sub>
-                          <m:r>
-                            <m:rPr>
-                              <m:nor/>
-                              <m:sty m:val="p"/>
-                            </m:rPr>
-                            <m:t>ref</m:t>
-                          </m:r>
-                        </m:sub>
-                      </m:sSub>
-                    </m:e>
-                  </m:d>
-                  <m:r>
-                    <m:rPr>
-                      <m:sty m:val="p"/>
-                    </m:rPr>
-                    <m:t>/</m:t>
-                  </m:r>
-                  <m:r>
-                    <m:t>z</m:t>
-                  </m:r>
-                </m:sup>
-              </m:sSup>
-            </m:e>
-          </m:nary>
-          <m:r>
-            <m:t> </m:t>
-          </m:r>
-          <m:r>
-            <m:t>d</m:t>
-          </m:r>
-          <m:r>
-            <m:t>i</m:t>
-          </m:r>
-          <m:r>
-            <m:rPr>
-              <m:sty m:val="p"/>
-            </m:rPr>
-            <m:t>,</m:t>
-          </m:r>
-          <m:r>
-            <m:t>  </m:t>
-          </m:r>
-          <m:d>
-            <m:dPr>
-              <m:begChr m:val="("/>
-              <m:sepChr m:val=""/>
-              <m:endChr m:val=")"/>
-              <m:grow/>
-            </m:dPr>
-            <m:e>
-              <m:r>
-                <m:t>8</m:t>
-              </m:r>
-            </m:e>
-          </m:d>
-        </m:oMath>
-      </m:oMathPara>
-      <w:bookmarkEnd w:id="31"/>
-    </w:p>
-    <w:p>
-      <w:pPr>
-        <w:pStyle w:val="FirstParagraph"/>
-      </w:pPr>
-      <w:r>
-        <w:t xml:space="preserve">We can then evaluate the 4PL surface once at the cumulative effective exposure to obtain the predicted population-level survival fraction at every point in the trajectory:</w:t>
-      </w:r>
-    </w:p>
-    <w:p>
-      <w:pPr>
-        <w:pStyle w:val="BodyText"/>
-      </w:pPr>
-      <w:bookmarkStart w:id="32" w:name="eq-S-pred"/>
-      <m:oMathPara>
-        <m:oMathParaPr>
-          <m:jc m:val="center"/>
-        </m:oMathParaPr>
-        <m:oMath>
-          <m:sSub>
-            <m:e>
-              <m:r>
-                <m:t>S</m:t>
-              </m:r>
-            </m:e>
-            <m:sub>
-              <m:r>
-                <m:rPr>
-                  <m:nor/>
-                  <m:sty m:val="p"/>
-                </m:rPr>
-                <m:t>pred</m:t>
-              </m:r>
-            </m:sub>
-          </m:sSub>
-          <m:d>
-            <m:dPr>
-              <m:begChr m:val="("/>
-              <m:sepChr m:val=""/>
-              <m:endChr m:val=")"/>
-              <m:grow/>
-            </m:dPr>
-            <m:e>
-              <m:r>
-                <m:t>t</m:t>
-              </m:r>
-            </m:e>
-          </m:d>
-          <m:r>
-            <m:t> </m:t>
-          </m:r>
-          <m:r>
-            <m:rPr>
-              <m:sty m:val="p"/>
-            </m:rPr>
-            <m:t>=</m:t>
-          </m:r>
-          <m:r>
-            <m:t> </m:t>
-          </m:r>
-          <m:r>
-            <m:t>S</m:t>
-          </m:r>
-          <m:r>
-            <m:t>​</m:t>
-          </m:r>
-          <m:d>
-            <m:dPr>
-              <m:begChr m:val="("/>
-              <m:sepChr m:val=""/>
-              <m:endChr m:val=")"/>
-              <m:grow/>
-            </m:dPr>
-            <m:e>
-              <m:sSub>
-                <m:e>
-                  <m:r>
-                    <m:t>T</m:t>
-                  </m:r>
-                </m:e>
-                <m:sub>
-                  <m:r>
-                    <m:rPr>
-                      <m:nor/>
-                      <m:sty m:val="p"/>
-                    </m:rPr>
-                    <m:t>ref</m:t>
-                  </m:r>
-                </m:sub>
-              </m:sSub>
-              <m:r>
-                <m:rPr>
-                  <m:sty m:val="p"/>
-                </m:rPr>
-                <m:t>,</m:t>
-              </m:r>
-              <m:r>
-                <m:t> </m:t>
-              </m:r>
-              <m:sSub>
-                <m:e>
-                  <m:r>
-                    <m:t>τ</m:t>
-                  </m:r>
-                </m:e>
-                <m:sub>
-                  <m:r>
-                    <m:rPr>
-                      <m:nor/>
-                      <m:sty m:val="p"/>
-                    </m:rPr>
-                    <m:t>eff</m:t>
-                  </m:r>
-                </m:sub>
-              </m:sSub>
-              <m:d>
-                <m:dPr>
-                  <m:begChr m:val="("/>
-                  <m:sepChr m:val=""/>
-                  <m:endChr m:val=")"/>
-                  <m:grow/>
-                </m:dPr>
-                <m:e>
-                  <m:r>
-                    <m:t>t</m:t>
-                  </m:r>
-                </m:e>
-              </m:d>
-            </m:e>
-          </m:d>
-          <m:r>
-            <m:rPr>
-              <m:sty m:val="p"/>
-            </m:rPr>
-            <m:t>.</m:t>
-          </m:r>
-          <m:r>
-            <m:t>  </m:t>
-          </m:r>
-          <m:d>
-            <m:dPr>
-              <m:begChr m:val="("/>
-              <m:sepChr m:val=""/>
-              <m:endChr m:val=")"/>
-              <m:grow/>
-            </m:dPr>
-            <m:e>
-              <m:r>
-                <m:t>9</m:t>
-              </m:r>
-            </m:e>
-          </m:d>
-        </m:oMath>
-      </m:oMathPara>
-      <w:bookmarkEnd w:id="32"/>
-    </w:p>
-    <w:p>
-      <w:pPr>
-        <w:pStyle w:val="FirstParagraph"/>
-      </w:pPr>
-      <w:r>
-        <w:t xml:space="preserve">Here</w:t>
-      </w:r>
-      <w:r>
-        <w:t xml:space="preserve"> </w:t>
-      </w:r>
-      <m:oMath>
-        <m:r>
-          <m:t>S</m:t>
-        </m:r>
-        <m:d>
-          <m:dPr>
-            <m:begChr m:val="("/>
-            <m:sepChr m:val=""/>
-            <m:endChr m:val=")"/>
-            <m:grow/>
-          </m:dPr>
-          <m:e>
-            <m:r>
-              <m:t>T</m:t>
-            </m:r>
-            <m:r>
-              <m:rPr>
-                <m:sty m:val="p"/>
-              </m:rPr>
-              <m:t>,</m:t>
-            </m:r>
-            <m:r>
-              <m:t>τ</m:t>
-            </m:r>
-          </m:e>
-        </m:d>
-      </m:oMath>
-      <w:r>
-        <w:t xml:space="preserve"> </w:t>
-      </w:r>
-      <w:r>
-        <w:t xml:space="preserve">is the survival surface fitted by the dose-response model, so</w:t>
-      </w:r>
-      <w:r>
-        <w:t xml:space="preserve"> </w:t>
-      </w:r>
-      <m:oMath>
-        <m:sSub>
-          <m:e>
-            <m:r>
-              <m:t>S</m:t>
-            </m:r>
-          </m:e>
-          <m:sub>
-            <m:r>
-              <m:rPr>
-                <m:nor/>
-                <m:sty m:val="p"/>
-              </m:rPr>
-              <m:t>pred</m:t>
-            </m:r>
-          </m:sub>
-        </m:sSub>
-        <m:d>
-          <m:dPr>
-            <m:begChr m:val="("/>
-            <m:sepChr m:val=""/>
-            <m:endChr m:val=")"/>
-            <m:grow/>
-          </m:dPr>
-          <m:e>
-            <m:r>
-              <m:t>t</m:t>
-            </m:r>
-          </m:e>
-        </m:d>
-      </m:oMath>
-      <w:r>
-        <w:t xml:space="preserve"> </w:t>
-      </w:r>
-      <w:r>
-        <w:t xml:space="preserve">is the survival probability for an organism held at</w:t>
-      </w:r>
-      <w:r>
-        <w:t xml:space="preserve"> </w:t>
-      </w:r>
-      <w:r>
-        <w:rPr>
-          <w:i/>
-          <w:iCs/>
-        </w:rPr>
-        <w:t xml:space="preserve">constant</w:t>
-      </w:r>
-      <w:r>
-        <w:t xml:space="preserve"> </w:t>
-      </w:r>
-      <m:oMath>
-        <m:sSub>
-          <m:e>
-            <m:r>
-              <m:t>T</m:t>
-            </m:r>
-          </m:e>
-          <m:sub>
-            <m:r>
-              <m:rPr>
-                <m:nor/>
-                <m:sty m:val="p"/>
-              </m:rPr>
-              <m:t>ref</m:t>
-            </m:r>
-          </m:sub>
-        </m:sSub>
-      </m:oMath>
-      <w:r>
-        <w:t xml:space="preserve"> </w:t>
-      </w:r>
-      <w:r>
-        <w:t xml:space="preserve">after exposure duration</w:t>
-      </w:r>
-      <w:r>
-        <w:t xml:space="preserve"> </w:t>
-      </w:r>
-      <m:oMath>
-        <m:sSub>
-          <m:e>
-            <m:r>
-              <m:t>τ</m:t>
-            </m:r>
-          </m:e>
-          <m:sub>
-            <m:r>
-              <m:rPr>
-                <m:nor/>
-                <m:sty m:val="p"/>
-              </m:rPr>
-              <m:t>eff</m:t>
-            </m:r>
-          </m:sub>
-        </m:sSub>
-        <m:d>
-          <m:dPr>
-            <m:begChr m:val="("/>
-            <m:sepChr m:val=""/>
-            <m:endChr m:val=")"/>
-            <m:grow/>
-          </m:dPr>
-          <m:e>
-            <m:r>
-              <m:t>t</m:t>
-            </m:r>
-          </m:e>
-        </m:d>
-      </m:oMath>
-      <w:r>
-        <w:t xml:space="preserve">.</w:t>
-      </w:r>
-    </w:p>
-    <w:p>
-      <w:pPr>
-        <w:pStyle w:val="BodyText"/>
-      </w:pPr>
-      <w:r>
-        <w:t xml:space="preserve">If calculating</w:t>
-      </w:r>
-      <w:r>
-        <w:t xml:space="preserve"> </w:t>
-      </w:r>
-      <m:oMath>
-        <m:r>
-          <m:t>H</m:t>
-        </m:r>
-        <m:r>
-          <m:t>I</m:t>
-        </m:r>
-      </m:oMath>
-      <w:r>
-        <w:t xml:space="preserve">, it is important to realise that the Bayesian dose-response model can also be used directly to calculate</w:t>
-      </w:r>
-      <w:r>
-        <w:t xml:space="preserve"> </w:t>
-      </w:r>
-      <m:oMath>
-        <m:r>
-          <m:t>H</m:t>
-        </m:r>
-        <m:r>
-          <m:t>I</m:t>
-        </m:r>
-      </m:oMath>
-      <w:r>
-        <w:t xml:space="preserve"> </w:t>
-      </w:r>
-      <w:r>
-        <w:t xml:space="preserve">at any survival threshold that is of interest</w:t>
-      </w:r>
-      <w:r>
-        <w:t xml:space="preserve"> </w:t>
-      </w:r>
-      <w:r>
-        <w:t xml:space="preserve">(</w:t>
-      </w:r>
-      <w:hyperlink w:anchor="ref-jorgensen_unifying_2021">
-        <w:r>
-          <w:rPr>
-            <w:rStyle w:val="Hyperlink"/>
-          </w:rPr>
-          <w:t xml:space="preserve">Jørgensen</w:t>
-        </w:r>
-        <w:r>
-          <w:rPr>
-            <w:rStyle w:val="Hyperlink"/>
-          </w:rPr>
-          <w:t xml:space="preserve"> </w:t>
-        </w:r>
-        <w:r>
-          <w:rPr>
-            <w:rStyle w:val="Hyperlink"/>
-            <w:i/>
-            <w:iCs/>
-          </w:rPr>
-          <w:t xml:space="preserve">et al.</w:t>
-        </w:r>
-        <w:r>
-          <w:rPr>
-            <w:rStyle w:val="Hyperlink"/>
-          </w:rPr>
-          <w:t xml:space="preserve"> </w:t>
-        </w:r>
-        <w:r>
-          <w:rPr>
-            <w:rStyle w:val="Hyperlink"/>
-          </w:rPr>
-          <w:t xml:space="preserve">2021</w:t>
-        </w:r>
-      </w:hyperlink>
-      <w:r>
-        <w:t xml:space="preserve">;</w:t>
-      </w:r>
-      <w:r>
-        <w:t xml:space="preserve"> </w:t>
-      </w:r>
-      <w:hyperlink w:anchor="ref-rezende_drosophila_mortality_2020">
-        <w:r>
-          <w:rPr>
-            <w:rStyle w:val="Hyperlink"/>
-          </w:rPr>
-          <w:t xml:space="preserve">Rezende</w:t>
-        </w:r>
-        <w:r>
-          <w:rPr>
-            <w:rStyle w:val="Hyperlink"/>
-          </w:rPr>
-          <w:t xml:space="preserve"> </w:t>
-        </w:r>
-        <w:r>
-          <w:rPr>
-            <w:rStyle w:val="Hyperlink"/>
-            <w:i/>
-            <w:iCs/>
-          </w:rPr>
-          <w:t xml:space="preserve">et al.</w:t>
-        </w:r>
-        <w:r>
-          <w:rPr>
-            <w:rStyle w:val="Hyperlink"/>
-          </w:rPr>
-          <w:t xml:space="preserve"> </w:t>
-        </w:r>
-        <w:r>
-          <w:rPr>
-            <w:rStyle w:val="Hyperlink"/>
-          </w:rPr>
-          <w:t xml:space="preserve">2020</w:t>
-        </w:r>
-      </w:hyperlink>
-      <w:r>
-        <w:t xml:space="preserve">)</w:t>
-      </w:r>
-      <w:r>
-        <w:t xml:space="preserve">. For example, the same posterior samples of</w:t>
+        <w:t xml:space="preserve">, the posterior samples of</w:t>
       </w:r>
       <w:r>
         <w:t xml:space="preserve"> </w:t>
@@ -8580,33 +6909,7 @@
         <w:t xml:space="preserve"> </w:t>
       </w:r>
       <w:r>
-        <w:t xml:space="preserve">give access to any percentile</w:t>
-      </w:r>
-      <w:r>
-        <w:t xml:space="preserve"> </w:t>
-      </w:r>
-      <m:oMath>
-        <m:r>
-          <m:t>L</m:t>
-        </m:r>
-        <m:sSub>
-          <m:e>
-            <m:r>
-              <m:t>T</m:t>
-            </m:r>
-          </m:e>
-          <m:sub>
-            <m:r>
-              <m:t>x</m:t>
-            </m:r>
-          </m:sub>
-        </m:sSub>
-      </m:oMath>
-      <w:r>
-        <w:t xml:space="preserve"> </w:t>
-      </w:r>
-      <w:r>
-        <w:t xml:space="preserve">(the time at which</w:t>
+        <w:t xml:space="preserve">deliver the time at which</w:t>
       </w:r>
       <w:r>
         <w:t xml:space="preserve"> </w:t>
@@ -8626,14 +6929,14 @@
         <w:t xml:space="preserve"> </w:t>
       </w:r>
       <w:r>
-        <w:t xml:space="preserve">of the population reaches the assayed endpoint) as follows:</w:t>
+        <w:t xml:space="preserve">of the population reaches the assayed endpoint:</w:t>
       </w:r>
     </w:p>
     <w:p>
       <w:pPr>
         <w:pStyle w:val="BodyText"/>
       </w:pPr>
-      <w:bookmarkStart w:id="33" w:name="eq-LTx"/>
+      <w:bookmarkStart w:id="29" w:name="eq-LTx"/>
       <m:oMathPara>
         <m:oMathParaPr>
           <m:jc m:val="center"/>
@@ -8821,6 +7124,1722 @@
             </m:dPr>
             <m:e>
               <m:r>
+                <m:t>7</m:t>
+              </m:r>
+            </m:e>
+          </m:d>
+        </m:oMath>
+      </m:oMathPara>
+      <w:bookmarkEnd w:id="29"/>
+    </w:p>
+    <w:p>
+      <w:pPr>
+        <w:pStyle w:val="FirstParagraph"/>
+      </w:pPr>
+      <w:r>
+        <w:t xml:space="preserve">Varying</w:t>
+      </w:r>
+      <w:r>
+        <w:t xml:space="preserve"> </w:t>
+      </w:r>
+      <m:oMath>
+        <m:r>
+          <m:t>x</m:t>
+        </m:r>
+      </m:oMath>
+      <w:r>
+        <w:t xml:space="preserve"> </w:t>
+      </w:r>
+      <w:r>
+        <w:t xml:space="preserve">in</w:t>
+      </w:r>
+      <w:r>
+        <w:t xml:space="preserve"> </w:t>
+      </w:r>
+      <w:hyperlink w:anchor="eq-LTx">
+        <w:r>
+          <w:rPr>
+            <w:rStyle w:val="Hyperlink"/>
+          </w:rPr>
+          <w:t xml:space="preserve">Equation 7</w:t>
+        </w:r>
+      </w:hyperlink>
+      <w:r>
+        <w:t xml:space="preserve"> </w:t>
+      </w:r>
+      <w:r>
+        <w:t xml:space="preserve">then yields any threshold of interest. For instance,</w:t>
+      </w:r>
+      <w:r>
+        <w:t xml:space="preserve"> </w:t>
+      </w:r>
+      <m:oMath>
+        <m:r>
+          <m:t>L</m:t>
+        </m:r>
+        <m:sSub>
+          <m:e>
+            <m:r>
+              <m:t>T</m:t>
+            </m:r>
+          </m:e>
+          <m:sub>
+            <m:r>
+              <m:t>10</m:t>
+            </m:r>
+          </m:sub>
+        </m:sSub>
+      </m:oMath>
+      <w:r>
+        <w:t xml:space="preserve"> </w:t>
+      </w:r>
+      <w:r>
+        <w:t xml:space="preserve">marks the onset of early mortality — useful for risk management — while</w:t>
+      </w:r>
+      <w:r>
+        <w:t xml:space="preserve"> </w:t>
+      </w:r>
+      <m:oMath>
+        <m:r>
+          <m:t>L</m:t>
+        </m:r>
+        <m:sSub>
+          <m:e>
+            <m:r>
+              <m:t>T</m:t>
+            </m:r>
+          </m:e>
+          <m:sub>
+            <m:r>
+              <m:t>90</m:t>
+            </m:r>
+          </m:sub>
+        </m:sSub>
+      </m:oMath>
+      <w:r>
+        <w:t xml:space="preserve"> </w:t>
+      </w:r>
+      <w:r>
+        <w:t xml:space="preserve">is closer to a population-collapse threshold. As with</w:t>
+      </w:r>
+      <w:r>
+        <w:t xml:space="preserve"> </w:t>
+      </w:r>
+      <m:oMath>
+        <m:r>
+          <m:t>L</m:t>
+        </m:r>
+        <m:sSub>
+          <m:e>
+            <m:r>
+              <m:t>T</m:t>
+            </m:r>
+          </m:e>
+          <m:sub>
+            <m:r>
+              <m:t>50</m:t>
+            </m:r>
+          </m:sub>
+        </m:sSub>
+      </m:oMath>
+      <w:r>
+        <w:t xml:space="preserve">, every prediction inherits the joint posterior, so uncertainty bands can be reported alongside the population-level median.</w:t>
+      </w:r>
+    </w:p>
+    <w:bookmarkEnd w:id="30"/>
+    <w:bookmarkStart w:id="34" w:name="X748caa9d6c5389c1517c1b3b0c0fd7ca3896022"/>
+    <w:p>
+      <w:pPr>
+        <w:pStyle w:val="Heading1"/>
+      </w:pPr>
+      <w:r>
+        <w:t xml:space="preserve">Predicting heat injury and survival under dynamic thermal environments</w:t>
+      </w:r>
+    </w:p>
+    <w:p>
+      <w:pPr>
+        <w:pStyle w:val="FirstParagraph"/>
+      </w:pPr>
+      <w:r>
+        <w:t xml:space="preserve">A particularly powerful aspect of TLS models are their ability to translate dynamic temperature times series’ from nature to predict heat injury (HI) accumulation and thus population survival probability</w:t>
+      </w:r>
+      <w:r>
+        <w:t xml:space="preserve"> </w:t>
+      </w:r>
+      <w:r>
+        <w:t xml:space="preserve">(</w:t>
+      </w:r>
+      <w:hyperlink w:anchor="ref-jorgensen_unifying_2021">
+        <w:r>
+          <w:rPr>
+            <w:rStyle w:val="Hyperlink"/>
+          </w:rPr>
+          <w:t xml:space="preserve">Jørgensen</w:t>
+        </w:r>
+        <w:r>
+          <w:rPr>
+            <w:rStyle w:val="Hyperlink"/>
+          </w:rPr>
+          <w:t xml:space="preserve"> </w:t>
+        </w:r>
+        <w:r>
+          <w:rPr>
+            <w:rStyle w:val="Hyperlink"/>
+            <w:i/>
+            <w:iCs/>
+          </w:rPr>
+          <w:t xml:space="preserve">et al.</w:t>
+        </w:r>
+        <w:r>
+          <w:rPr>
+            <w:rStyle w:val="Hyperlink"/>
+          </w:rPr>
+          <w:t xml:space="preserve"> </w:t>
+        </w:r>
+        <w:r>
+          <w:rPr>
+            <w:rStyle w:val="Hyperlink"/>
+          </w:rPr>
+          <w:t xml:space="preserve">2021</w:t>
+        </w:r>
+      </w:hyperlink>
+      <w:r>
+        <w:t xml:space="preserve">;</w:t>
+      </w:r>
+      <w:r>
+        <w:t xml:space="preserve"> </w:t>
+      </w:r>
+      <w:hyperlink w:anchor="ref-li2023">
+        <w:r>
+          <w:rPr>
+            <w:rStyle w:val="Hyperlink"/>
+          </w:rPr>
+          <w:t xml:space="preserve">Li</w:t>
+        </w:r>
+        <w:r>
+          <w:rPr>
+            <w:rStyle w:val="Hyperlink"/>
+          </w:rPr>
+          <w:t xml:space="preserve"> </w:t>
+        </w:r>
+        <w:r>
+          <w:rPr>
+            <w:rStyle w:val="Hyperlink"/>
+            <w:i/>
+            <w:iCs/>
+          </w:rPr>
+          <w:t xml:space="preserve">et al.</w:t>
+        </w:r>
+        <w:r>
+          <w:rPr>
+            <w:rStyle w:val="Hyperlink"/>
+          </w:rPr>
+          <w:t xml:space="preserve"> </w:t>
+        </w:r>
+        <w:r>
+          <w:rPr>
+            <w:rStyle w:val="Hyperlink"/>
+          </w:rPr>
+          <w:t xml:space="preserve">2023</w:t>
+        </w:r>
+      </w:hyperlink>
+      <w:r>
+        <w:t xml:space="preserve">;</w:t>
+      </w:r>
+      <w:r>
+        <w:t xml:space="preserve"> </w:t>
+      </w:r>
+      <w:hyperlink w:anchor="ref-orsted_finding_2022">
+        <w:r>
+          <w:rPr>
+            <w:rStyle w:val="Hyperlink"/>
+          </w:rPr>
+          <w:t xml:space="preserve">Ørsted</w:t>
+        </w:r>
+        <w:r>
+          <w:rPr>
+            <w:rStyle w:val="Hyperlink"/>
+          </w:rPr>
+          <w:t xml:space="preserve"> </w:t>
+        </w:r>
+        <w:r>
+          <w:rPr>
+            <w:rStyle w:val="Hyperlink"/>
+            <w:i/>
+            <w:iCs/>
+          </w:rPr>
+          <w:t xml:space="preserve">et al.</w:t>
+        </w:r>
+        <w:r>
+          <w:rPr>
+            <w:rStyle w:val="Hyperlink"/>
+          </w:rPr>
+          <w:t xml:space="preserve"> </w:t>
+        </w:r>
+        <w:r>
+          <w:rPr>
+            <w:rStyle w:val="Hyperlink"/>
+          </w:rPr>
+          <w:t xml:space="preserve">2022</w:t>
+        </w:r>
+      </w:hyperlink>
+      <w:r>
+        <w:t xml:space="preserve">,</w:t>
+      </w:r>
+      <w:r>
+        <w:t xml:space="preserve"> </w:t>
+      </w:r>
+      <w:hyperlink w:anchor="ref-orsted_suzukii_2024">
+        <w:r>
+          <w:rPr>
+            <w:rStyle w:val="Hyperlink"/>
+          </w:rPr>
+          <w:t xml:space="preserve">2024</w:t>
+        </w:r>
+      </w:hyperlink>
+      <w:r>
+        <w:t xml:space="preserve">;</w:t>
+      </w:r>
+      <w:r>
+        <w:t xml:space="preserve"> </w:t>
+      </w:r>
+      <w:hyperlink w:anchor="ref-rezende_drosophila_mortality_2020">
+        <w:r>
+          <w:rPr>
+            <w:rStyle w:val="Hyperlink"/>
+          </w:rPr>
+          <w:t xml:space="preserve">Rezende</w:t>
+        </w:r>
+        <w:r>
+          <w:rPr>
+            <w:rStyle w:val="Hyperlink"/>
+          </w:rPr>
+          <w:t xml:space="preserve"> </w:t>
+        </w:r>
+        <w:r>
+          <w:rPr>
+            <w:rStyle w:val="Hyperlink"/>
+            <w:i/>
+            <w:iCs/>
+          </w:rPr>
+          <w:t xml:space="preserve">et al.</w:t>
+        </w:r>
+        <w:r>
+          <w:rPr>
+            <w:rStyle w:val="Hyperlink"/>
+          </w:rPr>
+          <w:t xml:space="preserve"> </w:t>
+        </w:r>
+        <w:r>
+          <w:rPr>
+            <w:rStyle w:val="Hyperlink"/>
+          </w:rPr>
+          <w:t xml:space="preserve">2020</w:t>
+        </w:r>
+      </w:hyperlink>
+      <w:r>
+        <w:t xml:space="preserve">)</w:t>
+      </w:r>
+      <w:r>
+        <w:t xml:space="preserve">. Heat injury accumulates as the time spent at a given temperature divided by the median lethal time at that temperature, integrated across the temperature trajectory</w:t>
+      </w:r>
+      <w:r>
+        <w:t xml:space="preserve"> </w:t>
+      </w:r>
+      <m:oMath>
+        <m:r>
+          <m:t>T</m:t>
+        </m:r>
+        <m:d>
+          <m:dPr>
+            <m:begChr m:val="("/>
+            <m:sepChr m:val=""/>
+            <m:endChr m:val=")"/>
+            <m:grow/>
+          </m:dPr>
+          <m:e>
+            <m:r>
+              <m:t>i</m:t>
+            </m:r>
+          </m:e>
+        </m:d>
+      </m:oMath>
+      <w:r>
+        <w:t xml:space="preserve"> </w:t>
+      </w:r>
+      <w:r>
+        <w:t xml:space="preserve">as follows:</w:t>
+      </w:r>
+    </w:p>
+    <w:p>
+      <w:pPr>
+        <w:pStyle w:val="BodyText"/>
+      </w:pPr>
+      <w:bookmarkStart w:id="31" w:name="eq-hi"/>
+      <m:oMathPara>
+        <m:oMathParaPr>
+          <m:jc m:val="center"/>
+        </m:oMathParaPr>
+        <m:oMath>
+          <m:r>
+            <m:t>H</m:t>
+          </m:r>
+          <m:r>
+            <m:t>I</m:t>
+          </m:r>
+          <m:d>
+            <m:dPr>
+              <m:begChr m:val="("/>
+              <m:sepChr m:val=""/>
+              <m:endChr m:val=")"/>
+              <m:grow/>
+            </m:dPr>
+            <m:e>
+              <m:r>
+                <m:t>t</m:t>
+              </m:r>
+            </m:e>
+          </m:d>
+          <m:r>
+            <m:t> </m:t>
+          </m:r>
+          <m:r>
+            <m:rPr>
+              <m:sty m:val="p"/>
+            </m:rPr>
+            <m:t>=</m:t>
+          </m:r>
+          <m:r>
+            <m:t> </m:t>
+          </m:r>
+          <m:r>
+            <m:t>100</m:t>
+          </m:r>
+          <m:nary>
+            <m:naryPr>
+              <m:chr m:val="∫"/>
+              <m:limLoc m:val="subSup"/>
+              <m:subHide m:val="off"/>
+              <m:supHide m:val="off"/>
+            </m:naryPr>
+            <m:sub>
+              <m:r>
+                <m:t>0</m:t>
+              </m:r>
+            </m:sub>
+            <m:sup>
+              <m:r>
+                <m:t>t</m:t>
+              </m:r>
+            </m:sup>
+            <m:e>
+              <m:sSup>
+                <m:e>
+                  <m:r>
+                    <m:t>10</m:t>
+                  </m:r>
+                </m:e>
+                <m:sup>
+                  <m:r>
+                    <m:t> </m:t>
+                  </m:r>
+                  <m:d>
+                    <m:dPr>
+                      <m:begChr m:val="("/>
+                      <m:sepChr m:val=""/>
+                      <m:endChr m:val=")"/>
+                      <m:grow/>
+                    </m:dPr>
+                    <m:e>
+                      <m:r>
+                        <m:t>T</m:t>
+                      </m:r>
+                      <m:d>
+                        <m:dPr>
+                          <m:begChr m:val="("/>
+                          <m:sepChr m:val=""/>
+                          <m:endChr m:val=")"/>
+                          <m:grow/>
+                        </m:dPr>
+                        <m:e>
+                          <m:r>
+                            <m:t>i</m:t>
+                          </m:r>
+                        </m:e>
+                      </m:d>
+                      <m:r>
+                        <m:t> </m:t>
+                      </m:r>
+                      <m:r>
+                        <m:rPr>
+                          <m:sty m:val="p"/>
+                        </m:rPr>
+                        <m:t>−</m:t>
+                      </m:r>
+                      <m:r>
+                        <m:t> </m:t>
+                      </m:r>
+                      <m:r>
+                        <m:t>C</m:t>
+                      </m:r>
+                      <m:sSub>
+                        <m:e>
+                          <m:r>
+                            <m:t>T</m:t>
+                          </m:r>
+                        </m:e>
+                        <m:sub>
+                          <m:r>
+                            <m:t>m</m:t>
+                          </m:r>
+                          <m:r>
+                            <m:t>a</m:t>
+                          </m:r>
+                          <m:sSub>
+                            <m:e>
+                              <m:r>
+                                <m:t>x</m:t>
+                              </m:r>
+                            </m:e>
+                            <m:sub>
+                              <m:r>
+                                <m:t>1</m:t>
+                              </m:r>
+                              <m:r>
+                                <m:rPr>
+                                  <m:nor/>
+                                  <m:sty m:val="p"/>
+                                </m:rPr>
+                                <m:t>hr</m:t>
+                              </m:r>
+                            </m:sub>
+                          </m:sSub>
+                        </m:sub>
+                      </m:sSub>
+                    </m:e>
+                  </m:d>
+                  <m:r>
+                    <m:rPr>
+                      <m:sty m:val="p"/>
+                    </m:rPr>
+                    <m:t>/</m:t>
+                  </m:r>
+                  <m:r>
+                    <m:t>z</m:t>
+                  </m:r>
+                </m:sup>
+              </m:sSup>
+            </m:e>
+          </m:nary>
+          <m:r>
+            <m:t> </m:t>
+          </m:r>
+          <m:r>
+            <m:t>d</m:t>
+          </m:r>
+          <m:r>
+            <m:t>i</m:t>
+          </m:r>
+          <m:r>
+            <m:rPr>
+              <m:sty m:val="p"/>
+            </m:rPr>
+            <m:t>,</m:t>
+          </m:r>
+          <m:r>
+            <m:t>  </m:t>
+          </m:r>
+          <m:d>
+            <m:dPr>
+              <m:begChr m:val="("/>
+              <m:sepChr m:val=""/>
+              <m:endChr m:val=")"/>
+              <m:grow/>
+            </m:dPr>
+            <m:e>
+              <m:r>
+                <m:t>8</m:t>
+              </m:r>
+            </m:e>
+          </m:d>
+        </m:oMath>
+      </m:oMathPara>
+      <w:bookmarkEnd w:id="31"/>
+    </w:p>
+    <w:p>
+      <w:pPr>
+        <w:pStyle w:val="FirstParagraph"/>
+      </w:pPr>
+      <w:r>
+        <w:t xml:space="preserve">where</w:t>
+      </w:r>
+      <w:r>
+        <w:t xml:space="preserve"> </w:t>
+      </w:r>
+      <m:oMath>
+        <m:r>
+          <m:t>z</m:t>
+        </m:r>
+      </m:oMath>
+      <w:r>
+        <w:t xml:space="preserve"> </w:t>
+      </w:r>
+      <w:r>
+        <w:t xml:space="preserve">is the thermal sensitivity and</w:t>
+      </w:r>
+      <w:r>
+        <w:t xml:space="preserve"> </w:t>
+      </w:r>
+      <m:oMath>
+        <m:r>
+          <m:t>C</m:t>
+        </m:r>
+        <m:sSub>
+          <m:e>
+            <m:r>
+              <m:t>T</m:t>
+            </m:r>
+          </m:e>
+          <m:sub>
+            <m:r>
+              <m:t>m</m:t>
+            </m:r>
+            <m:r>
+              <m:t>a</m:t>
+            </m:r>
+            <m:sSub>
+              <m:e>
+                <m:r>
+                  <m:t>x</m:t>
+                </m:r>
+              </m:e>
+              <m:sub>
+                <m:r>
+                  <m:t>1</m:t>
+                </m:r>
+                <m:r>
+                  <m:rPr>
+                    <m:nor/>
+                    <m:sty m:val="p"/>
+                  </m:rPr>
+                  <m:t>hr</m:t>
+                </m:r>
+              </m:sub>
+            </m:sSub>
+          </m:sub>
+        </m:sSub>
+      </m:oMath>
+      <w:r>
+        <w:t xml:space="preserve"> </w:t>
+      </w:r>
+      <w:r>
+        <w:t xml:space="preserve">is the static temperature at which 50% of the population reaches the assayed endpoint after one hour of exposure. When</w:t>
+      </w:r>
+      <w:r>
+        <w:t xml:space="preserve"> </w:t>
+      </w:r>
+      <m:oMath>
+        <m:r>
+          <m:t>H</m:t>
+        </m:r>
+        <m:r>
+          <m:t>I</m:t>
+        </m:r>
+        <m:d>
+          <m:dPr>
+            <m:begChr m:val="("/>
+            <m:sepChr m:val=""/>
+            <m:endChr m:val=")"/>
+            <m:grow/>
+          </m:dPr>
+          <m:e>
+            <m:r>
+              <m:t>t</m:t>
+            </m:r>
+          </m:e>
+        </m:d>
+        <m:r>
+          <m:rPr>
+            <m:sty m:val="p"/>
+          </m:rPr>
+          <m:t>=</m:t>
+        </m:r>
+        <m:r>
+          <m:t>100</m:t>
+        </m:r>
+        <m:r>
+          <m:rPr>
+            <m:sty m:val="p"/>
+          </m:rPr>
+          <m:t>%</m:t>
+        </m:r>
+      </m:oMath>
+      <w:r>
+        <w:t xml:space="preserve">, the cumulative dose equals one</w:t>
+      </w:r>
+      <w:r>
+        <w:t xml:space="preserve"> </w:t>
+      </w:r>
+      <m:oMath>
+        <m:r>
+          <m:t>L</m:t>
+        </m:r>
+        <m:sSub>
+          <m:e>
+            <m:r>
+              <m:t>T</m:t>
+            </m:r>
+          </m:e>
+          <m:sub>
+            <m:r>
+              <m:t>50</m:t>
+            </m:r>
+          </m:sub>
+        </m:sSub>
+      </m:oMath>
+      <w:r>
+        <w:t xml:space="preserve"> </w:t>
+      </w:r>
+      <w:r>
+        <w:t xml:space="preserve">at the 1-hour reference, predicting 50% mortality (or 50% loss of the assayed sublethal endpoint, e.g. fertility;</w:t>
+      </w:r>
+      <w:r>
+        <w:t xml:space="preserve"> </w:t>
+      </w:r>
+      <w:r>
+        <w:t xml:space="preserve">Ørsted</w:t>
+      </w:r>
+      <w:r>
+        <w:t xml:space="preserve"> </w:t>
+      </w:r>
+      <w:r>
+        <w:rPr>
+          <w:i/>
+          <w:iCs/>
+        </w:rPr>
+        <w:t xml:space="preserve">et al.</w:t>
+      </w:r>
+      <w:r>
+        <w:t xml:space="preserve"> </w:t>
+      </w:r>
+      <w:r>
+        <w:t xml:space="preserve">(</w:t>
+      </w:r>
+      <w:hyperlink w:anchor="ref-orsted_suzukii_2024">
+        <w:r>
+          <w:rPr>
+            <w:rStyle w:val="Hyperlink"/>
+          </w:rPr>
+          <w:t xml:space="preserve">2024</w:t>
+        </w:r>
+      </w:hyperlink>
+      <w:r>
+        <w:t xml:space="preserve">)</w:t>
+      </w:r>
+      <w:r>
+        <w:t xml:space="preserve">). Injury accumulates only when</w:t>
+      </w:r>
+      <w:r>
+        <w:t xml:space="preserve"> </w:t>
+      </w:r>
+      <m:oMath>
+        <m:r>
+          <m:t>T</m:t>
+        </m:r>
+        <m:d>
+          <m:dPr>
+            <m:begChr m:val="("/>
+            <m:sepChr m:val=""/>
+            <m:endChr m:val=")"/>
+            <m:grow/>
+          </m:dPr>
+          <m:e>
+            <m:r>
+              <m:t>i</m:t>
+            </m:r>
+          </m:e>
+        </m:d>
+      </m:oMath>
+      <w:r>
+        <w:t xml:space="preserve"> </w:t>
+      </w:r>
+      <w:r>
+        <w:t xml:space="preserve">exceeds a critical temperature</w:t>
+      </w:r>
+      <w:r>
+        <w:t xml:space="preserve"> </w:t>
+      </w:r>
+      <m:oMath>
+        <m:sSub>
+          <m:e>
+            <m:r>
+              <m:t>T</m:t>
+            </m:r>
+          </m:e>
+          <m:sub>
+            <m:r>
+              <m:t>c</m:t>
+            </m:r>
+          </m:sub>
+        </m:sSub>
+      </m:oMath>
+      <w:r>
+        <w:t xml:space="preserve"> </w:t>
+      </w:r>
+      <w:r>
+        <w:t xml:space="preserve">below which damage is repaired as fast as it accrues</w:t>
+      </w:r>
+      <w:r>
+        <w:t xml:space="preserve"> </w:t>
+      </w:r>
+      <w:r>
+        <w:t xml:space="preserve">(</w:t>
+      </w:r>
+      <w:hyperlink w:anchor="ref-jorgensen_unifying_2021">
+        <w:r>
+          <w:rPr>
+            <w:rStyle w:val="Hyperlink"/>
+          </w:rPr>
+          <w:t xml:space="preserve">Jørgensen</w:t>
+        </w:r>
+        <w:r>
+          <w:rPr>
+            <w:rStyle w:val="Hyperlink"/>
+          </w:rPr>
+          <w:t xml:space="preserve"> </w:t>
+        </w:r>
+        <w:r>
+          <w:rPr>
+            <w:rStyle w:val="Hyperlink"/>
+            <w:i/>
+            <w:iCs/>
+          </w:rPr>
+          <w:t xml:space="preserve">et al.</w:t>
+        </w:r>
+        <w:r>
+          <w:rPr>
+            <w:rStyle w:val="Hyperlink"/>
+          </w:rPr>
+          <w:t xml:space="preserve"> </w:t>
+        </w:r>
+        <w:r>
+          <w:rPr>
+            <w:rStyle w:val="Hyperlink"/>
+          </w:rPr>
+          <w:t xml:space="preserve">2021</w:t>
+        </w:r>
+      </w:hyperlink>
+      <w:r>
+        <w:t xml:space="preserve">;</w:t>
+      </w:r>
+      <w:r>
+        <w:t xml:space="preserve"> </w:t>
+      </w:r>
+      <w:hyperlink w:anchor="ref-orsted_finding_2022">
+        <w:r>
+          <w:rPr>
+            <w:rStyle w:val="Hyperlink"/>
+          </w:rPr>
+          <w:t xml:space="preserve">Ørsted</w:t>
+        </w:r>
+        <w:r>
+          <w:rPr>
+            <w:rStyle w:val="Hyperlink"/>
+          </w:rPr>
+          <w:t xml:space="preserve"> </w:t>
+        </w:r>
+        <w:r>
+          <w:rPr>
+            <w:rStyle w:val="Hyperlink"/>
+            <w:i/>
+            <w:iCs/>
+          </w:rPr>
+          <w:t xml:space="preserve">et al.</w:t>
+        </w:r>
+        <w:r>
+          <w:rPr>
+            <w:rStyle w:val="Hyperlink"/>
+          </w:rPr>
+          <w:t xml:space="preserve"> </w:t>
+        </w:r>
+        <w:r>
+          <w:rPr>
+            <w:rStyle w:val="Hyperlink"/>
+          </w:rPr>
+          <w:t xml:space="preserve">2022</w:t>
+        </w:r>
+      </w:hyperlink>
+      <w:r>
+        <w:t xml:space="preserve">)</w:t>
+      </w:r>
+      <w:r>
+        <w:t xml:space="preserve">. Field temperature records are typically available at hourly resolution.</w:t>
+      </w:r>
+      <w:r>
+        <w:t xml:space="preserve"> </w:t>
+      </w:r>
+      <w:hyperlink w:anchor="eq-hi">
+        <w:r>
+          <w:rPr>
+            <w:rStyle w:val="Hyperlink"/>
+          </w:rPr>
+          <w:t xml:space="preserve">Equation 8</w:t>
+        </w:r>
+      </w:hyperlink>
+      <w:r>
+        <w:t xml:space="preserve"> </w:t>
+      </w:r>
+      <w:r>
+        <w:t xml:space="preserve">can then be evaluated by summing</w:t>
+      </w:r>
+      <w:r>
+        <w:t xml:space="preserve"> </w:t>
+      </w:r>
+      <m:oMath>
+        <m:r>
+          <m:t>100</m:t>
+        </m:r>
+        <m:r>
+          <m:rPr>
+            <m:sty m:val="p"/>
+          </m:rPr>
+          <m:t>⋅</m:t>
+        </m:r>
+        <m:sSup>
+          <m:e>
+            <m:r>
+              <m:t>10</m:t>
+            </m:r>
+          </m:e>
+          <m:sup>
+            <m:d>
+              <m:dPr>
+                <m:begChr m:val="("/>
+                <m:sepChr m:val=""/>
+                <m:endChr m:val=")"/>
+                <m:grow/>
+              </m:dPr>
+              <m:e>
+                <m:sSub>
+                  <m:e>
+                    <m:r>
+                      <m:t>T</m:t>
+                    </m:r>
+                  </m:e>
+                  <m:sub>
+                    <m:r>
+                      <m:t>i</m:t>
+                    </m:r>
+                  </m:sub>
+                </m:sSub>
+                <m:r>
+                  <m:rPr>
+                    <m:sty m:val="p"/>
+                  </m:rPr>
+                  <m:t>−</m:t>
+                </m:r>
+                <m:r>
+                  <m:t>C</m:t>
+                </m:r>
+                <m:sSub>
+                  <m:e>
+                    <m:r>
+                      <m:t>T</m:t>
+                    </m:r>
+                  </m:e>
+                  <m:sub>
+                    <m:r>
+                      <m:t>m</m:t>
+                    </m:r>
+                    <m:r>
+                      <m:t>a</m:t>
+                    </m:r>
+                    <m:sSub>
+                      <m:e>
+                        <m:r>
+                          <m:t>x</m:t>
+                        </m:r>
+                      </m:e>
+                      <m:sub>
+                        <m:r>
+                          <m:t>1</m:t>
+                        </m:r>
+                        <m:r>
+                          <m:rPr>
+                            <m:nor/>
+                            <m:sty m:val="p"/>
+                          </m:rPr>
+                          <m:t>hr</m:t>
+                        </m:r>
+                      </m:sub>
+                    </m:sSub>
+                  </m:sub>
+                </m:sSub>
+              </m:e>
+            </m:d>
+            <m:r>
+              <m:rPr>
+                <m:sty m:val="p"/>
+              </m:rPr>
+              <m:t>/</m:t>
+            </m:r>
+            <m:r>
+              <m:t>z</m:t>
+            </m:r>
+          </m:sup>
+        </m:sSup>
+      </m:oMath>
+      <w:r>
+        <w:t xml:space="preserve"> </w:t>
+      </w:r>
+      <w:r>
+        <w:t xml:space="preserve">across each hourly interval whose temperature</w:t>
+      </w:r>
+      <w:r>
+        <w:t xml:space="preserve"> </w:t>
+      </w:r>
+      <m:oMath>
+        <m:sSub>
+          <m:e>
+            <m:r>
+              <m:t>T</m:t>
+            </m:r>
+          </m:e>
+          <m:sub>
+            <m:r>
+              <m:t>i</m:t>
+            </m:r>
+          </m:sub>
+        </m:sSub>
+      </m:oMath>
+      <w:r>
+        <w:t xml:space="preserve"> </w:t>
+      </w:r>
+      <w:r>
+        <w:t xml:space="preserve">exceeds</w:t>
+      </w:r>
+      <w:r>
+        <w:t xml:space="preserve"> </w:t>
+      </w:r>
+      <m:oMath>
+        <m:sSub>
+          <m:e>
+            <m:r>
+              <m:t>T</m:t>
+            </m:r>
+          </m:e>
+          <m:sub>
+            <m:r>
+              <m:t>c</m:t>
+            </m:r>
+          </m:sub>
+        </m:sSub>
+      </m:oMath>
+      <w:r>
+        <w:t xml:space="preserve">, following the implementations in</w:t>
+      </w:r>
+      <w:r>
+        <w:t xml:space="preserve"> </w:t>
+      </w:r>
+      <w:r>
+        <w:t xml:space="preserve">Jørgensen</w:t>
+      </w:r>
+      <w:r>
+        <w:t xml:space="preserve"> </w:t>
+      </w:r>
+      <w:r>
+        <w:rPr>
+          <w:i/>
+          <w:iCs/>
+        </w:rPr>
+        <w:t xml:space="preserve">et al.</w:t>
+      </w:r>
+      <w:r>
+        <w:t xml:space="preserve"> </w:t>
+      </w:r>
+      <w:r>
+        <w:t xml:space="preserve">(</w:t>
+      </w:r>
+      <w:hyperlink w:anchor="ref-jorgensen_unifying_2021">
+        <w:r>
+          <w:rPr>
+            <w:rStyle w:val="Hyperlink"/>
+          </w:rPr>
+          <w:t xml:space="preserve">2021</w:t>
+        </w:r>
+      </w:hyperlink>
+      <w:r>
+        <w:t xml:space="preserve">)</w:t>
+      </w:r>
+      <w:r>
+        <w:t xml:space="preserve">,</w:t>
+      </w:r>
+      <w:r>
+        <w:t xml:space="preserve"> </w:t>
+      </w:r>
+      <w:r>
+        <w:t xml:space="preserve">Ørsted</w:t>
+      </w:r>
+      <w:r>
+        <w:t xml:space="preserve"> </w:t>
+      </w:r>
+      <w:r>
+        <w:rPr>
+          <w:i/>
+          <w:iCs/>
+        </w:rPr>
+        <w:t xml:space="preserve">et al.</w:t>
+      </w:r>
+      <w:r>
+        <w:t xml:space="preserve"> </w:t>
+      </w:r>
+      <w:r>
+        <w:t xml:space="preserve">(</w:t>
+      </w:r>
+      <w:hyperlink w:anchor="ref-orsted_suzukii_2024">
+        <w:r>
+          <w:rPr>
+            <w:rStyle w:val="Hyperlink"/>
+          </w:rPr>
+          <w:t xml:space="preserve">2024</w:t>
+        </w:r>
+      </w:hyperlink>
+      <w:r>
+        <w:t xml:space="preserve">)</w:t>
+      </w:r>
+      <w:r>
+        <w:t xml:space="preserve">, and</w:t>
+      </w:r>
+      <w:r>
+        <w:t xml:space="preserve"> </w:t>
+      </w:r>
+      <w:r>
+        <w:t xml:space="preserve">Li</w:t>
+      </w:r>
+      <w:r>
+        <w:t xml:space="preserve"> </w:t>
+      </w:r>
+      <w:r>
+        <w:rPr>
+          <w:i/>
+          <w:iCs/>
+        </w:rPr>
+        <w:t xml:space="preserve">et al.</w:t>
+      </w:r>
+      <w:r>
+        <w:t xml:space="preserve"> </w:t>
+      </w:r>
+      <w:r>
+        <w:t xml:space="preserve">(</w:t>
+      </w:r>
+      <w:hyperlink w:anchor="ref-li2023">
+        <w:r>
+          <w:rPr>
+            <w:rStyle w:val="Hyperlink"/>
+          </w:rPr>
+          <w:t xml:space="preserve">2023</w:t>
+        </w:r>
+      </w:hyperlink>
+      <w:r>
+        <w:t xml:space="preserve">)</w:t>
+      </w:r>
+      <w:r>
+        <w:t xml:space="preserve">. To propagate uncertainty,</w:t>
+      </w:r>
+      <w:r>
+        <w:t xml:space="preserve"> </w:t>
+      </w:r>
+      <m:oMath>
+        <m:r>
+          <m:t>z</m:t>
+        </m:r>
+      </m:oMath>
+      <w:r>
+        <w:t xml:space="preserve"> </w:t>
+      </w:r>
+      <w:r>
+        <w:t xml:space="preserve">and</w:t>
+      </w:r>
+      <w:r>
+        <w:t xml:space="preserve"> </w:t>
+      </w:r>
+      <m:oMath>
+        <m:r>
+          <m:t>C</m:t>
+        </m:r>
+        <m:sSub>
+          <m:e>
+            <m:r>
+              <m:t>T</m:t>
+            </m:r>
+          </m:e>
+          <m:sub>
+            <m:r>
+              <m:t>m</m:t>
+            </m:r>
+            <m:r>
+              <m:t>a</m:t>
+            </m:r>
+            <m:sSub>
+              <m:e>
+                <m:r>
+                  <m:t>x</m:t>
+                </m:r>
+              </m:e>
+              <m:sub>
+                <m:r>
+                  <m:t>1</m:t>
+                </m:r>
+                <m:r>
+                  <m:rPr>
+                    <m:nor/>
+                    <m:sty m:val="p"/>
+                  </m:rPr>
+                  <m:t>hr</m:t>
+                </m:r>
+              </m:sub>
+            </m:sSub>
+          </m:sub>
+        </m:sSub>
+      </m:oMath>
+      <w:r>
+        <w:t xml:space="preserve">, calculated from our Bayesian dose-response model can be used to calculate</w:t>
+      </w:r>
+      <w:r>
+        <w:t xml:space="preserve"> </w:t>
+      </w:r>
+      <m:oMath>
+        <m:r>
+          <m:t>H</m:t>
+        </m:r>
+        <m:r>
+          <m:t>I</m:t>
+        </m:r>
+        <m:d>
+          <m:dPr>
+            <m:begChr m:val="("/>
+            <m:sepChr m:val=""/>
+            <m:endChr m:val=")"/>
+            <m:grow/>
+          </m:dPr>
+          <m:e>
+            <m:r>
+              <m:t>t</m:t>
+            </m:r>
+          </m:e>
+        </m:d>
+      </m:oMath>
+      <w:r>
+        <w:t xml:space="preserve"> </w:t>
+      </w:r>
+      <w:r>
+        <w:t xml:space="preserve">through time by substituting samples from the posterior distribution for each parameter into</w:t>
+      </w:r>
+      <w:r>
+        <w:t xml:space="preserve"> </w:t>
+      </w:r>
+      <w:hyperlink w:anchor="eq-hi">
+        <w:r>
+          <w:rPr>
+            <w:rStyle w:val="Hyperlink"/>
+          </w:rPr>
+          <w:t xml:space="preserve">Equation 8</w:t>
+        </w:r>
+      </w:hyperlink>
+      <w:r>
+        <w:t xml:space="preserve">.</w:t>
+      </w:r>
+    </w:p>
+    <w:p>
+      <w:pPr>
+        <w:pStyle w:val="BodyText"/>
+      </w:pPr>
+      <w:r>
+        <w:t xml:space="preserve">A more natural prediction to make may instead be the population-level survival probability over time. This has the advantage of allowing for a direct connection to population dynamical models which typically use survival, growth and fecundity as vital rates for population-level predictions</w:t>
+      </w:r>
+      <w:r>
+        <w:t xml:space="preserve"> </w:t>
+      </w:r>
+      <w:r>
+        <w:t xml:space="preserve">(</w:t>
+      </w:r>
+      <w:hyperlink w:anchor="ref-noble2026">
+        <w:r>
+          <w:rPr>
+            <w:rStyle w:val="Hyperlink"/>
+          </w:rPr>
+          <w:t xml:space="preserve">Noble</w:t>
+        </w:r>
+        <w:r>
+          <w:rPr>
+            <w:rStyle w:val="Hyperlink"/>
+          </w:rPr>
+          <w:t xml:space="preserve"> </w:t>
+        </w:r>
+        <w:r>
+          <w:rPr>
+            <w:rStyle w:val="Hyperlink"/>
+            <w:i/>
+            <w:iCs/>
+          </w:rPr>
+          <w:t xml:space="preserve">et al.</w:t>
+        </w:r>
+        <w:r>
+          <w:rPr>
+            <w:rStyle w:val="Hyperlink"/>
+          </w:rPr>
+          <w:t xml:space="preserve"> </w:t>
+        </w:r>
+        <w:r>
+          <w:rPr>
+            <w:rStyle w:val="Hyperlink"/>
+          </w:rPr>
+          <w:t xml:space="preserve">2026</w:t>
+        </w:r>
+      </w:hyperlink>
+      <w:r>
+        <w:t xml:space="preserve">)</w:t>
+      </w:r>
+      <w:r>
+        <w:t xml:space="preserve">. To predict survival, we can calculate the</w:t>
+      </w:r>
+      <w:r>
+        <w:t xml:space="preserve"> </w:t>
+      </w:r>
+      <w:r>
+        <w:rPr>
+          <w:i/>
+          <w:iCs/>
+        </w:rPr>
+        <w:t xml:space="preserve">effective exposure time</w:t>
+      </w:r>
+      <w:r>
+        <w:t xml:space="preserve"> </w:t>
+      </w:r>
+      <w:r>
+        <w:t xml:space="preserve">at a chosen reference temperature</w:t>
+      </w:r>
+      <w:r>
+        <w:t xml:space="preserve"> </w:t>
+      </w:r>
+      <m:oMath>
+        <m:sSub>
+          <m:e>
+            <m:r>
+              <m:t>T</m:t>
+            </m:r>
+          </m:e>
+          <m:sub>
+            <m:r>
+              <m:rPr>
+                <m:nor/>
+                <m:sty m:val="p"/>
+              </m:rPr>
+              <m:t>ref</m:t>
+            </m:r>
+          </m:sub>
+        </m:sSub>
+      </m:oMath>
+      <w:r>
+        <w:t xml:space="preserve">. More effective time is accumulated at hot temperatures and less at cool ones, in proportion to the scaling factor</w:t>
+      </w:r>
+      <w:r>
+        <w:t xml:space="preserve"> </w:t>
+      </w:r>
+      <m:oMath>
+        <m:sSup>
+          <m:e>
+            <m:r>
+              <m:t>10</m:t>
+            </m:r>
+          </m:e>
+          <m:sup>
+            <m:d>
+              <m:dPr>
+                <m:begChr m:val="("/>
+                <m:sepChr m:val=""/>
+                <m:endChr m:val=")"/>
+                <m:grow/>
+              </m:dPr>
+              <m:e>
+                <m:r>
+                  <m:t>T</m:t>
+                </m:r>
+                <m:d>
+                  <m:dPr>
+                    <m:begChr m:val="("/>
+                    <m:sepChr m:val=""/>
+                    <m:endChr m:val=")"/>
+                    <m:grow/>
+                  </m:dPr>
+                  <m:e>
+                    <m:r>
+                      <m:t>i</m:t>
+                    </m:r>
+                  </m:e>
+                </m:d>
+                <m:r>
+                  <m:rPr>
+                    <m:sty m:val="p"/>
+                  </m:rPr>
+                  <m:t>−</m:t>
+                </m:r>
+                <m:sSub>
+                  <m:e>
+                    <m:r>
+                      <m:t>T</m:t>
+                    </m:r>
+                  </m:e>
+                  <m:sub>
+                    <m:r>
+                      <m:rPr>
+                        <m:nor/>
+                        <m:sty m:val="p"/>
+                      </m:rPr>
+                      <m:t>ref</m:t>
+                    </m:r>
+                  </m:sub>
+                </m:sSub>
+              </m:e>
+            </m:d>
+            <m:r>
+              <m:rPr>
+                <m:sty m:val="p"/>
+              </m:rPr>
+              <m:t>/</m:t>
+            </m:r>
+            <m:r>
+              <m:t>z</m:t>
+            </m:r>
+          </m:sup>
+        </m:sSup>
+      </m:oMath>
+      <w:r>
+        <w:t xml:space="preserve">,</w:t>
+      </w:r>
+    </w:p>
+    <w:p>
+      <w:pPr>
+        <w:pStyle w:val="BodyText"/>
+      </w:pPr>
+      <w:bookmarkStart w:id="32" w:name="eq-tau-eff"/>
+      <m:oMathPara>
+        <m:oMathParaPr>
+          <m:jc m:val="center"/>
+        </m:oMathParaPr>
+        <m:oMath>
+          <m:sSub>
+            <m:e>
+              <m:r>
+                <m:t>τ</m:t>
+              </m:r>
+            </m:e>
+            <m:sub>
+              <m:r>
+                <m:rPr>
+                  <m:nor/>
+                  <m:sty m:val="p"/>
+                </m:rPr>
+                <m:t>eff</m:t>
+              </m:r>
+            </m:sub>
+          </m:sSub>
+          <m:d>
+            <m:dPr>
+              <m:begChr m:val="("/>
+              <m:sepChr m:val=""/>
+              <m:endChr m:val=")"/>
+              <m:grow/>
+            </m:dPr>
+            <m:e>
+              <m:r>
+                <m:t>t</m:t>
+              </m:r>
+            </m:e>
+          </m:d>
+          <m:r>
+            <m:t> </m:t>
+          </m:r>
+          <m:r>
+            <m:rPr>
+              <m:sty m:val="p"/>
+            </m:rPr>
+            <m:t>=</m:t>
+          </m:r>
+          <m:r>
+            <m:t> </m:t>
+          </m:r>
+          <m:nary>
+            <m:naryPr>
+              <m:chr m:val="∫"/>
+              <m:limLoc m:val="subSup"/>
+              <m:subHide m:val="off"/>
+              <m:supHide m:val="off"/>
+            </m:naryPr>
+            <m:sub>
+              <m:r>
+                <m:t>0</m:t>
+              </m:r>
+            </m:sub>
+            <m:sup>
+              <m:r>
+                <m:t>t</m:t>
+              </m:r>
+            </m:sup>
+            <m:e>
+              <m:sSup>
+                <m:e>
+                  <m:r>
+                    <m:t>10</m:t>
+                  </m:r>
+                </m:e>
+                <m:sup>
+                  <m:r>
+                    <m:t> </m:t>
+                  </m:r>
+                  <m:d>
+                    <m:dPr>
+                      <m:begChr m:val="("/>
+                      <m:sepChr m:val=""/>
+                      <m:endChr m:val=")"/>
+                      <m:grow/>
+                    </m:dPr>
+                    <m:e>
+                      <m:r>
+                        <m:t>T</m:t>
+                      </m:r>
+                      <m:d>
+                        <m:dPr>
+                          <m:begChr m:val="("/>
+                          <m:sepChr m:val=""/>
+                          <m:endChr m:val=")"/>
+                          <m:grow/>
+                        </m:dPr>
+                        <m:e>
+                          <m:r>
+                            <m:t>i</m:t>
+                          </m:r>
+                        </m:e>
+                      </m:d>
+                      <m:r>
+                        <m:rPr>
+                          <m:sty m:val="p"/>
+                        </m:rPr>
+                        <m:t>−</m:t>
+                      </m:r>
+                      <m:sSub>
+                        <m:e>
+                          <m:r>
+                            <m:t>T</m:t>
+                          </m:r>
+                        </m:e>
+                        <m:sub>
+                          <m:r>
+                            <m:rPr>
+                              <m:nor/>
+                              <m:sty m:val="p"/>
+                            </m:rPr>
+                            <m:t>ref</m:t>
+                          </m:r>
+                        </m:sub>
+                      </m:sSub>
+                    </m:e>
+                  </m:d>
+                  <m:r>
+                    <m:rPr>
+                      <m:sty m:val="p"/>
+                    </m:rPr>
+                    <m:t>/</m:t>
+                  </m:r>
+                  <m:r>
+                    <m:t>z</m:t>
+                  </m:r>
+                </m:sup>
+              </m:sSup>
+            </m:e>
+          </m:nary>
+          <m:r>
+            <m:t> </m:t>
+          </m:r>
+          <m:r>
+            <m:t>d</m:t>
+          </m:r>
+          <m:r>
+            <m:t>i</m:t>
+          </m:r>
+          <m:r>
+            <m:rPr>
+              <m:sty m:val="p"/>
+            </m:rPr>
+            <m:t>,</m:t>
+          </m:r>
+          <m:r>
+            <m:t>  </m:t>
+          </m:r>
+          <m:d>
+            <m:dPr>
+              <m:begChr m:val="("/>
+              <m:sepChr m:val=""/>
+              <m:endChr m:val=")"/>
+              <m:grow/>
+            </m:dPr>
+            <m:e>
+              <m:r>
+                <m:t>9</m:t>
+              </m:r>
+            </m:e>
+          </m:d>
+        </m:oMath>
+      </m:oMathPara>
+      <w:bookmarkEnd w:id="32"/>
+    </w:p>
+    <w:p>
+      <w:pPr>
+        <w:pStyle w:val="FirstParagraph"/>
+      </w:pPr>
+      <w:r>
+        <w:t xml:space="preserve">We can then evaluate the 4PL surface once at the cumulative effective exposure to obtain the predicted population-level survival fraction at every point in the trajectory:</w:t>
+      </w:r>
+    </w:p>
+    <w:p>
+      <w:pPr>
+        <w:pStyle w:val="BodyText"/>
+      </w:pPr>
+      <w:bookmarkStart w:id="33" w:name="eq-S-pred"/>
+      <m:oMathPara>
+        <m:oMathParaPr>
+          <m:jc m:val="center"/>
+        </m:oMathParaPr>
+        <m:oMath>
+          <m:sSub>
+            <m:e>
+              <m:r>
+                <m:t>S</m:t>
+              </m:r>
+            </m:e>
+            <m:sub>
+              <m:r>
+                <m:rPr>
+                  <m:nor/>
+                  <m:sty m:val="p"/>
+                </m:rPr>
+                <m:t>pred</m:t>
+              </m:r>
+            </m:sub>
+          </m:sSub>
+          <m:d>
+            <m:dPr>
+              <m:begChr m:val="("/>
+              <m:sepChr m:val=""/>
+              <m:endChr m:val=")"/>
+              <m:grow/>
+            </m:dPr>
+            <m:e>
+              <m:r>
+                <m:t>t</m:t>
+              </m:r>
+            </m:e>
+          </m:d>
+          <m:r>
+            <m:t> </m:t>
+          </m:r>
+          <m:r>
+            <m:rPr>
+              <m:sty m:val="p"/>
+            </m:rPr>
+            <m:t>=</m:t>
+          </m:r>
+          <m:r>
+            <m:t> </m:t>
+          </m:r>
+          <m:r>
+            <m:t>S</m:t>
+          </m:r>
+          <m:r>
+            <m:t>​</m:t>
+          </m:r>
+          <m:d>
+            <m:dPr>
+              <m:begChr m:val="("/>
+              <m:sepChr m:val=""/>
+              <m:endChr m:val=")"/>
+              <m:grow/>
+            </m:dPr>
+            <m:e>
+              <m:sSub>
+                <m:e>
+                  <m:r>
+                    <m:t>T</m:t>
+                  </m:r>
+                </m:e>
+                <m:sub>
+                  <m:r>
+                    <m:rPr>
+                      <m:nor/>
+                      <m:sty m:val="p"/>
+                    </m:rPr>
+                    <m:t>ref</m:t>
+                  </m:r>
+                </m:sub>
+              </m:sSub>
+              <m:r>
+                <m:rPr>
+                  <m:sty m:val="p"/>
+                </m:rPr>
+                <m:t>,</m:t>
+              </m:r>
+              <m:r>
+                <m:t> </m:t>
+              </m:r>
+              <m:sSub>
+                <m:e>
+                  <m:r>
+                    <m:t>τ</m:t>
+                  </m:r>
+                </m:e>
+                <m:sub>
+                  <m:r>
+                    <m:rPr>
+                      <m:nor/>
+                      <m:sty m:val="p"/>
+                    </m:rPr>
+                    <m:t>eff</m:t>
+                  </m:r>
+                </m:sub>
+              </m:sSub>
+              <m:d>
+                <m:dPr>
+                  <m:begChr m:val="("/>
+                  <m:sepChr m:val=""/>
+                  <m:endChr m:val=")"/>
+                  <m:grow/>
+                </m:dPr>
+                <m:e>
+                  <m:r>
+                    <m:t>t</m:t>
+                  </m:r>
+                </m:e>
+              </m:d>
+            </m:e>
+          </m:d>
+          <m:r>
+            <m:rPr>
+              <m:sty m:val="p"/>
+            </m:rPr>
+            <m:t>.</m:t>
+          </m:r>
+          <m:r>
+            <m:t>  </m:t>
+          </m:r>
+          <m:d>
+            <m:dPr>
+              <m:begChr m:val="("/>
+              <m:sepChr m:val=""/>
+              <m:endChr m:val=")"/>
+              <m:grow/>
+            </m:dPr>
+            <m:e>
+              <m:r>
                 <m:t>10</m:t>
               </m:r>
             </m:e>
@@ -8834,24 +8853,61 @@
         <w:pStyle w:val="FirstParagraph"/>
       </w:pPr>
       <w:r>
-        <w:t xml:space="preserve">Substituting</w:t>
+        <w:t xml:space="preserve">Here</w:t>
       </w:r>
       <w:r>
         <w:t xml:space="preserve"> </w:t>
       </w:r>
       <m:oMath>
         <m:r>
-          <m:t>L</m:t>
+          <m:t>S</m:t>
         </m:r>
+        <m:d>
+          <m:dPr>
+            <m:begChr m:val="("/>
+            <m:sepChr m:val=""/>
+            <m:endChr m:val=")"/>
+            <m:grow/>
+          </m:dPr>
+          <m:e>
+            <m:r>
+              <m:t>T</m:t>
+            </m:r>
+            <m:r>
+              <m:rPr>
+                <m:sty m:val="p"/>
+              </m:rPr>
+              <m:t>,</m:t>
+            </m:r>
+            <m:r>
+              <m:t>τ</m:t>
+            </m:r>
+          </m:e>
+        </m:d>
+      </m:oMath>
+      <w:r>
+        <w:t xml:space="preserve"> </w:t>
+      </w:r>
+      <w:r>
+        <w:t xml:space="preserve">is the survival surface fitted by the dose-response model, so</w:t>
+      </w:r>
+      <w:r>
+        <w:t xml:space="preserve"> </w:t>
+      </w:r>
+      <m:oMath>
         <m:sSub>
           <m:e>
             <m:r>
-              <m:t>T</m:t>
+              <m:t>S</m:t>
             </m:r>
           </m:e>
           <m:sub>
             <m:r>
-              <m:t>x</m:t>
+              <m:rPr>
+                <m:nor/>
+                <m:sty m:val="p"/>
+              </m:rPr>
+              <m:t>pred</m:t>
             </m:r>
           </m:sub>
         </m:sSub>
@@ -8864,7 +8920,7 @@
           </m:dPr>
           <m:e>
             <m:r>
-              <m:t>T</m:t>
+              <m:t>t</m:t>
             </m:r>
           </m:e>
         </m:d>
@@ -8873,15 +8929,22 @@
         <w:t xml:space="preserve"> </w:t>
       </w:r>
       <w:r>
-        <w:t xml:space="preserve">for</w:t>
+        <w:t xml:space="preserve">is the survival probability for an organism held at</w:t>
+      </w:r>
+      <w:r>
+        <w:t xml:space="preserve"> </w:t>
+      </w:r>
+      <w:r>
+        <w:rPr>
+          <w:i/>
+          <w:iCs/>
+        </w:rPr>
+        <w:t xml:space="preserve">constant</w:t>
       </w:r>
       <w:r>
         <w:t xml:space="preserve"> </w:t>
       </w:r>
       <m:oMath>
-        <m:r>
-          <m:t>L</m:t>
-        </m:r>
         <m:sSub>
           <m:e>
             <m:r>
@@ -8890,7 +8953,38 @@
           </m:e>
           <m:sub>
             <m:r>
-              <m:t>50</m:t>
+              <m:rPr>
+                <m:nor/>
+                <m:sty m:val="p"/>
+              </m:rPr>
+              <m:t>ref</m:t>
+            </m:r>
+          </m:sub>
+        </m:sSub>
+      </m:oMath>
+      <w:r>
+        <w:t xml:space="preserve"> </w:t>
+      </w:r>
+      <w:r>
+        <w:t xml:space="preserve">after exposure duration</w:t>
+      </w:r>
+      <w:r>
+        <w:t xml:space="preserve"> </w:t>
+      </w:r>
+      <m:oMath>
+        <m:sSub>
+          <m:e>
+            <m:r>
+              <m:t>τ</m:t>
+            </m:r>
+          </m:e>
+          <m:sub>
+            <m:r>
+              <m:rPr>
+                <m:nor/>
+                <m:sty m:val="p"/>
+              </m:rPr>
+              <m:t>eff</m:t>
             </m:r>
           </m:sub>
         </m:sSub>
@@ -8903,91 +8997,13 @@
           </m:dPr>
           <m:e>
             <m:r>
-              <m:t>T</m:t>
+              <m:t>t</m:t>
             </m:r>
           </m:e>
         </m:d>
       </m:oMath>
       <w:r>
-        <w:t xml:space="preserve"> </w:t>
-      </w:r>
-      <w:r>
-        <w:t xml:space="preserve">in the HI equation returns</w:t>
-      </w:r>
-      <w:r>
-        <w:t xml:space="preserve"> </w:t>
-      </w:r>
-      <m:oMath>
-        <m:r>
-          <m:t>H</m:t>
-        </m:r>
-        <m:sSub>
-          <m:e>
-            <m:r>
-              <m:t>I</m:t>
-            </m:r>
-          </m:e>
-          <m:sub>
-            <m:r>
-              <m:t>x</m:t>
-            </m:r>
-          </m:sub>
-        </m:sSub>
-      </m:oMath>
-      <w:r>
-        <w:t xml:space="preserve"> </w:t>
-      </w:r>
-      <w:r>
-        <w:t xml:space="preserve">for any survival threshold of interest. For example, relaxing x with 0.10 (i.e.,</w:t>
-      </w:r>
-      <w:r>
-        <w:t xml:space="preserve"> </w:t>
-      </w:r>
-      <m:oMath>
-        <m:r>
-          <m:t>L</m:t>
-        </m:r>
-        <m:sSub>
-          <m:e>
-            <m:r>
-              <m:t>T</m:t>
-            </m:r>
-          </m:e>
-          <m:sub>
-            <m:r>
-              <m:t>10</m:t>
-            </m:r>
-          </m:sub>
-        </m:sSub>
-      </m:oMath>
-      <w:r>
-        <w:t xml:space="preserve">) can be used to calculate the onset of early levels of mortality which maybe good for risk management or</w:t>
-      </w:r>
-      <w:r>
-        <w:t xml:space="preserve"> </w:t>
-      </w:r>
-      <m:oMath>
-        <m:r>
-          <m:t>L</m:t>
-        </m:r>
-        <m:sSub>
-          <m:e>
-            <m:r>
-              <m:t>T</m:t>
-            </m:r>
-          </m:e>
-          <m:sub>
-            <m:r>
-              <m:t>90</m:t>
-            </m:r>
-          </m:sub>
-        </m:sSub>
-      </m:oMath>
-      <w:r>
-        <w:t xml:space="preserve"> </w:t>
-      </w:r>
-      <w:r>
-        <w:t xml:space="preserve">which might be more useful for understanding population-collapse thresholds. In each case, uncertainty in any predictions can always be presented alongside population-level averages or medians.</w:t>
+        <w:t xml:space="preserve">.</w:t>
       </w:r>
     </w:p>
     <w:bookmarkEnd w:id="34"/>

</xml_diff>

<commit_message>
Cleaner writing of section
</commit_message>
<xml_diff>
--- a/_output/ms.docx
+++ b/_output/ms.docx
@@ -5615,6 +5615,621 @@
         <w:pStyle w:val="BodyText"/>
       </w:pPr>
       <w:r>
+        <w:t xml:space="preserve">The same derivation generalises beyond the median: the Bayesian dose-response fit gives access to</w:t>
+      </w:r>
+      <w:r>
+        <w:t xml:space="preserve"> </w:t>
+      </w:r>
+      <w:r>
+        <w:rPr>
+          <w:i/>
+          <w:iCs/>
+        </w:rPr>
+        <w:t xml:space="preserve">any</w:t>
+      </w:r>
+      <w:r>
+        <w:t xml:space="preserve"> </w:t>
+      </w:r>
+      <w:r>
+        <w:t xml:space="preserve">mortality percentile, not just</w:t>
+      </w:r>
+      <w:r>
+        <w:t xml:space="preserve"> </w:t>
+      </w:r>
+      <m:oMath>
+        <m:r>
+          <m:t>L</m:t>
+        </m:r>
+        <m:sSub>
+          <m:e>
+            <m:r>
+              <m:t>T</m:t>
+            </m:r>
+          </m:e>
+          <m:sub>
+            <m:r>
+              <m:t>50</m:t>
+            </m:r>
+          </m:sub>
+        </m:sSub>
+      </m:oMath>
+      <w:r>
+        <w:t xml:space="preserve"> </w:t>
+      </w:r>
+      <w:r>
+        <w:t xml:space="preserve">(</w:t>
+      </w:r>
+      <w:hyperlink w:anchor="ref-jorgensen_unifying_2021">
+        <w:r>
+          <w:rPr>
+            <w:rStyle w:val="Hyperlink"/>
+          </w:rPr>
+          <w:t xml:space="preserve">Jørgensen</w:t>
+        </w:r>
+        <w:r>
+          <w:rPr>
+            <w:rStyle w:val="Hyperlink"/>
+          </w:rPr>
+          <w:t xml:space="preserve"> </w:t>
+        </w:r>
+        <w:r>
+          <w:rPr>
+            <w:rStyle w:val="Hyperlink"/>
+            <w:i/>
+            <w:iCs/>
+          </w:rPr>
+          <w:t xml:space="preserve">et al.</w:t>
+        </w:r>
+        <w:r>
+          <w:rPr>
+            <w:rStyle w:val="Hyperlink"/>
+          </w:rPr>
+          <w:t xml:space="preserve"> </w:t>
+        </w:r>
+        <w:r>
+          <w:rPr>
+            <w:rStyle w:val="Hyperlink"/>
+          </w:rPr>
+          <w:t xml:space="preserve">2021</w:t>
+        </w:r>
+      </w:hyperlink>
+      <w:r>
+        <w:t xml:space="preserve">;</w:t>
+      </w:r>
+      <w:r>
+        <w:t xml:space="preserve"> </w:t>
+      </w:r>
+      <w:hyperlink w:anchor="ref-rezende_drosophila_mortality_2020">
+        <w:r>
+          <w:rPr>
+            <w:rStyle w:val="Hyperlink"/>
+          </w:rPr>
+          <w:t xml:space="preserve">Rezende</w:t>
+        </w:r>
+        <w:r>
+          <w:rPr>
+            <w:rStyle w:val="Hyperlink"/>
+          </w:rPr>
+          <w:t xml:space="preserve"> </w:t>
+        </w:r>
+        <w:r>
+          <w:rPr>
+            <w:rStyle w:val="Hyperlink"/>
+            <w:i/>
+            <w:iCs/>
+          </w:rPr>
+          <w:t xml:space="preserve">et al.</w:t>
+        </w:r>
+        <w:r>
+          <w:rPr>
+            <w:rStyle w:val="Hyperlink"/>
+          </w:rPr>
+          <w:t xml:space="preserve"> </w:t>
+        </w:r>
+        <w:r>
+          <w:rPr>
+            <w:rStyle w:val="Hyperlink"/>
+          </w:rPr>
+          <w:t xml:space="preserve">2020</w:t>
+        </w:r>
+      </w:hyperlink>
+      <w:r>
+        <w:t xml:space="preserve">)</w:t>
+      </w:r>
+      <w:r>
+        <w:t xml:space="preserve">. Setting</w:t>
+      </w:r>
+      <w:r>
+        <w:t xml:space="preserve"> </w:t>
+      </w:r>
+      <m:oMath>
+        <m:sSub>
+          <m:e>
+            <m:r>
+              <m:t>p</m:t>
+            </m:r>
+          </m:e>
+          <m:sub>
+            <m:r>
+              <m:t>i</m:t>
+            </m:r>
+            <m:r>
+              <m:t>j</m:t>
+            </m:r>
+          </m:sub>
+        </m:sSub>
+        <m:r>
+          <m:rPr>
+            <m:sty m:val="p"/>
+          </m:rPr>
+          <m:t>=</m:t>
+        </m:r>
+        <m:r>
+          <m:t>x</m:t>
+        </m:r>
+        <m:r>
+          <m:rPr>
+            <m:sty m:val="p"/>
+          </m:rPr>
+          <m:t>/</m:t>
+        </m:r>
+        <m:r>
+          <m:t>100</m:t>
+        </m:r>
+      </m:oMath>
+      <w:r>
+        <w:t xml:space="preserve"> </w:t>
+      </w:r>
+      <w:r>
+        <w:t xml:space="preserve">in</w:t>
+      </w:r>
+      <w:r>
+        <w:t xml:space="preserve"> </w:t>
+      </w:r>
+      <w:hyperlink w:anchor="eq-4pl">
+        <w:r>
+          <w:rPr>
+            <w:rStyle w:val="Hyperlink"/>
+          </w:rPr>
+          <w:t xml:space="preserve">Equation 2</w:t>
+        </w:r>
+      </w:hyperlink>
+      <w:r>
+        <w:t xml:space="preserve"> </w:t>
+      </w:r>
+      <w:r>
+        <w:t xml:space="preserve">and following the same algebra used for</w:t>
+      </w:r>
+      <w:r>
+        <w:t xml:space="preserve"> </w:t>
+      </w:r>
+      <m:oMath>
+        <m:r>
+          <m:t>L</m:t>
+        </m:r>
+        <m:sSub>
+          <m:e>
+            <m:r>
+              <m:t>T</m:t>
+            </m:r>
+          </m:e>
+          <m:sub>
+            <m:r>
+              <m:t>50</m:t>
+            </m:r>
+          </m:sub>
+        </m:sSub>
+      </m:oMath>
+      <w:r>
+        <w:t xml:space="preserve">, the posterior samples of</w:t>
+      </w:r>
+      <w:r>
+        <w:t xml:space="preserve"> </w:t>
+      </w:r>
+      <m:oMath>
+        <m:d>
+          <m:dPr>
+            <m:begChr m:val="("/>
+            <m:sepChr m:val=""/>
+            <m:endChr m:val=")"/>
+            <m:grow/>
+          </m:dPr>
+          <m:e>
+            <m:r>
+              <m:rPr>
+                <m:sty m:val="p"/>
+              </m:rPr>
+              <m:t>ℓ</m:t>
+            </m:r>
+            <m:r>
+              <m:rPr>
+                <m:sty m:val="p"/>
+              </m:rPr>
+              <m:t>,</m:t>
+            </m:r>
+            <m:r>
+              <m:t>u</m:t>
+            </m:r>
+            <m:r>
+              <m:rPr>
+                <m:sty m:val="p"/>
+              </m:rPr>
+              <m:t>,</m:t>
+            </m:r>
+            <m:r>
+              <m:t>k</m:t>
+            </m:r>
+            <m:r>
+              <m:rPr>
+                <m:sty m:val="p"/>
+              </m:rPr>
+              <m:t>,</m:t>
+            </m:r>
+            <m:r>
+              <m:t>m</m:t>
+            </m:r>
+            <m:d>
+              <m:dPr>
+                <m:begChr m:val="("/>
+                <m:sepChr m:val=""/>
+                <m:endChr m:val=")"/>
+                <m:grow/>
+              </m:dPr>
+              <m:e>
+                <m:r>
+                  <m:t>T</m:t>
+                </m:r>
+              </m:e>
+            </m:d>
+          </m:e>
+        </m:d>
+      </m:oMath>
+      <w:r>
+        <w:t xml:space="preserve"> </w:t>
+      </w:r>
+      <w:r>
+        <w:t xml:space="preserve">deliver the time at which</w:t>
+      </w:r>
+      <w:r>
+        <w:t xml:space="preserve"> </w:t>
+      </w:r>
+      <m:oMath>
+        <m:r>
+          <m:t>x</m:t>
+        </m:r>
+        <m:r>
+          <m:rPr>
+            <m:sty m:val="p"/>
+          </m:rPr>
+          <m:t>%</m:t>
+        </m:r>
+      </m:oMath>
+      <w:r>
+        <w:t xml:space="preserve"> </w:t>
+      </w:r>
+      <w:r>
+        <w:t xml:space="preserve">of the population reaches the assayed endpoint:</w:t>
+      </w:r>
+    </w:p>
+    <w:p>
+      <w:pPr>
+        <w:pStyle w:val="BodyText"/>
+      </w:pPr>
+      <w:bookmarkStart w:id="27" w:name="eq-LTx"/>
+      <m:oMathPara>
+        <m:oMathParaPr>
+          <m:jc m:val="center"/>
+        </m:oMathParaPr>
+        <m:oMath>
+          <m:sSub>
+            <m:e>
+              <m:r>
+                <m:rPr>
+                  <m:sty m:val="p"/>
+                </m:rPr>
+                <m:t>log</m:t>
+              </m:r>
+            </m:e>
+            <m:sub>
+              <m:r>
+                <m:t>10</m:t>
+              </m:r>
+            </m:sub>
+          </m:sSub>
+          <m:r>
+            <m:t>L</m:t>
+          </m:r>
+          <m:sSub>
+            <m:e>
+              <m:r>
+                <m:t>T</m:t>
+              </m:r>
+            </m:e>
+            <m:sub>
+              <m:r>
+                <m:t>x</m:t>
+              </m:r>
+            </m:sub>
+          </m:sSub>
+          <m:d>
+            <m:dPr>
+              <m:begChr m:val="("/>
+              <m:sepChr m:val=""/>
+              <m:endChr m:val=")"/>
+              <m:grow/>
+            </m:dPr>
+            <m:e>
+              <m:r>
+                <m:t>T</m:t>
+              </m:r>
+            </m:e>
+          </m:d>
+          <m:r>
+            <m:t> </m:t>
+          </m:r>
+          <m:r>
+            <m:rPr>
+              <m:sty m:val="p"/>
+            </m:rPr>
+            <m:t>=</m:t>
+          </m:r>
+          <m:r>
+            <m:t> </m:t>
+          </m:r>
+          <m:r>
+            <m:t>m</m:t>
+          </m:r>
+          <m:d>
+            <m:dPr>
+              <m:begChr m:val="("/>
+              <m:sepChr m:val=""/>
+              <m:endChr m:val=")"/>
+              <m:grow/>
+            </m:dPr>
+            <m:e>
+              <m:r>
+                <m:t>T</m:t>
+              </m:r>
+            </m:e>
+          </m:d>
+          <m:r>
+            <m:t> </m:t>
+          </m:r>
+          <m:r>
+            <m:rPr>
+              <m:sty m:val="p"/>
+            </m:rPr>
+            <m:t>−</m:t>
+          </m:r>
+          <m:r>
+            <m:t> </m:t>
+          </m:r>
+          <m:f>
+            <m:fPr>
+              <m:type m:val="bar"/>
+            </m:fPr>
+            <m:num>
+              <m:r>
+                <m:t>1</m:t>
+              </m:r>
+            </m:num>
+            <m:den>
+              <m:r>
+                <m:t>k</m:t>
+              </m:r>
+            </m:den>
+          </m:f>
+          <m:r>
+            <m:t> </m:t>
+          </m:r>
+          <m:r>
+            <m:rPr>
+              <m:sty m:val="p"/>
+            </m:rPr>
+            <m:t>ln</m:t>
+          </m:r>
+          <m:r>
+            <m:t>​</m:t>
+          </m:r>
+          <m:f>
+            <m:fPr>
+              <m:type m:val="bar"/>
+            </m:fPr>
+            <m:num>
+              <m:r>
+                <m:t>u</m:t>
+              </m:r>
+              <m:r>
+                <m:rPr>
+                  <m:sty m:val="p"/>
+                </m:rPr>
+                <m:t>−</m:t>
+              </m:r>
+              <m:r>
+                <m:t>x</m:t>
+              </m:r>
+              <m:r>
+                <m:rPr>
+                  <m:sty m:val="p"/>
+                </m:rPr>
+                <m:t>/</m:t>
+              </m:r>
+              <m:r>
+                <m:t>100</m:t>
+              </m:r>
+            </m:num>
+            <m:den>
+              <m:r>
+                <m:t>x</m:t>
+              </m:r>
+              <m:r>
+                <m:rPr>
+                  <m:sty m:val="p"/>
+                </m:rPr>
+                <m:t>/</m:t>
+              </m:r>
+              <m:r>
+                <m:t>100</m:t>
+              </m:r>
+              <m:r>
+                <m:rPr>
+                  <m:sty m:val="p"/>
+                </m:rPr>
+                <m:t>−</m:t>
+              </m:r>
+              <m:r>
+                <m:rPr>
+                  <m:sty m:val="p"/>
+                </m:rPr>
+                <m:t>ℓ</m:t>
+              </m:r>
+            </m:den>
+          </m:f>
+          <m:r>
+            <m:rPr>
+              <m:sty m:val="p"/>
+            </m:rPr>
+            <m:t>,</m:t>
+          </m:r>
+          <m:r>
+            <m:t>  </m:t>
+          </m:r>
+          <m:d>
+            <m:dPr>
+              <m:begChr m:val="("/>
+              <m:sepChr m:val=""/>
+              <m:endChr m:val=")"/>
+              <m:grow/>
+            </m:dPr>
+            <m:e>
+              <m:r>
+                <m:t>5</m:t>
+              </m:r>
+            </m:e>
+          </m:d>
+        </m:oMath>
+      </m:oMathPara>
+      <w:bookmarkEnd w:id="27"/>
+    </w:p>
+    <w:p>
+      <w:pPr>
+        <w:pStyle w:val="FirstParagraph"/>
+      </w:pPr>
+      <w:r>
+        <w:t xml:space="preserve">Varying</w:t>
+      </w:r>
+      <w:r>
+        <w:t xml:space="preserve"> </w:t>
+      </w:r>
+      <m:oMath>
+        <m:r>
+          <m:t>x</m:t>
+        </m:r>
+      </m:oMath>
+      <w:r>
+        <w:t xml:space="preserve"> </w:t>
+      </w:r>
+      <w:r>
+        <w:t xml:space="preserve">in</w:t>
+      </w:r>
+      <w:r>
+        <w:t xml:space="preserve"> </w:t>
+      </w:r>
+      <w:hyperlink w:anchor="eq-LTx">
+        <w:r>
+          <w:rPr>
+            <w:rStyle w:val="Hyperlink"/>
+          </w:rPr>
+          <w:t xml:space="preserve">Equation 5</w:t>
+        </w:r>
+      </w:hyperlink>
+      <w:r>
+        <w:t xml:space="preserve"> </w:t>
+      </w:r>
+      <w:r>
+        <w:t xml:space="preserve">then yields any threshold of interest. For instance,</w:t>
+      </w:r>
+      <w:r>
+        <w:t xml:space="preserve"> </w:t>
+      </w:r>
+      <m:oMath>
+        <m:r>
+          <m:t>L</m:t>
+        </m:r>
+        <m:sSub>
+          <m:e>
+            <m:r>
+              <m:t>T</m:t>
+            </m:r>
+          </m:e>
+          <m:sub>
+            <m:r>
+              <m:t>10</m:t>
+            </m:r>
+          </m:sub>
+        </m:sSub>
+      </m:oMath>
+      <w:r>
+        <w:t xml:space="preserve"> </w:t>
+      </w:r>
+      <w:r>
+        <w:t xml:space="preserve">marks the onset of early mortality — useful for risk management — while</w:t>
+      </w:r>
+      <w:r>
+        <w:t xml:space="preserve"> </w:t>
+      </w:r>
+      <m:oMath>
+        <m:r>
+          <m:t>L</m:t>
+        </m:r>
+        <m:sSub>
+          <m:e>
+            <m:r>
+              <m:t>T</m:t>
+            </m:r>
+          </m:e>
+          <m:sub>
+            <m:r>
+              <m:t>90</m:t>
+            </m:r>
+          </m:sub>
+        </m:sSub>
+      </m:oMath>
+      <w:r>
+        <w:t xml:space="preserve"> </w:t>
+      </w:r>
+      <w:r>
+        <w:t xml:space="preserve">is closer to a population-collapse threshold. As with</w:t>
+      </w:r>
+      <w:r>
+        <w:t xml:space="preserve"> </w:t>
+      </w:r>
+      <m:oMath>
+        <m:r>
+          <m:t>L</m:t>
+        </m:r>
+        <m:sSub>
+          <m:e>
+            <m:r>
+              <m:t>T</m:t>
+            </m:r>
+          </m:e>
+          <m:sub>
+            <m:r>
+              <m:t>50</m:t>
+            </m:r>
+          </m:sub>
+        </m:sSub>
+      </m:oMath>
+      <w:r>
+        <w:t xml:space="preserve">, every prediction inherits the joint posterior, so uncertainty bands can be reported alongside the population-level median.</w:t>
+      </w:r>
+    </w:p>
+    <w:p>
+      <w:pPr>
+        <w:pStyle w:val="BodyText"/>
+      </w:pPr>
+      <w:r>
         <w:t xml:space="preserve">Importantly, the slope</w:t>
       </w:r>
       <w:r>
@@ -5804,7 +6419,7 @@
           <w:rPr>
             <w:rStyle w:val="Hyperlink"/>
           </w:rPr>
-          <w:t xml:space="preserve">Equation 5</w:t>
+          <w:t xml:space="preserve">Equation 6</w:t>
         </w:r>
       </w:hyperlink>
       <w:r>
@@ -5880,7 +6495,7 @@
           <w:rPr>
             <w:rStyle w:val="Hyperlink"/>
           </w:rPr>
-          <w:t xml:space="preserve">Equation 6</w:t>
+          <w:t xml:space="preserve">Equation 7</w:t>
         </w:r>
       </w:hyperlink>
       <w:r>
@@ -5891,7 +6506,7 @@
       <w:pPr>
         <w:pStyle w:val="BodyText"/>
       </w:pPr>
-      <w:bookmarkStart w:id="27" w:name="eq-lt50-corrected"/>
+      <w:bookmarkStart w:id="28" w:name="eq-lt50-corrected"/>
       <m:oMathPara>
         <m:oMathParaPr>
           <m:jc m:val="center"/>
@@ -6143,19 +6758,19 @@
             </m:dPr>
             <m:e>
               <m:r>
-                <m:t>5</m:t>
+                <m:t>6</m:t>
               </m:r>
             </m:e>
           </m:d>
         </m:oMath>
       </m:oMathPara>
-      <w:bookmarkEnd w:id="27"/>
+      <w:bookmarkEnd w:id="28"/>
     </w:p>
     <w:p>
       <w:pPr>
         <w:pStyle w:val="FirstParagraph"/>
       </w:pPr>
-      <w:bookmarkStart w:id="28" w:name="eq-ctmax-corrected"/>
+      <w:bookmarkStart w:id="29" w:name="eq-ctmax-corrected"/>
       <m:oMathPara>
         <m:oMathParaPr>
           <m:jc m:val="center"/>
@@ -6488,642 +7103,6 @@
             </m:dPr>
             <m:e>
               <m:r>
-                <m:t>6</m:t>
-              </m:r>
-            </m:e>
-          </m:d>
-        </m:oMath>
-      </m:oMathPara>
-      <w:bookmarkEnd w:id="28"/>
-    </w:p>
-    <w:p>
-      <w:pPr>
-        <w:pStyle w:val="FirstParagraph"/>
-      </w:pPr>
-      <w:r>
-        <w:t xml:space="preserve">In practice, however, these corrections may not be needed so long as the experimental design includes treatments that span the full mortality range which anchors</w:t>
-      </w:r>
-      <w:r>
-        <w:t xml:space="preserve"> </w:t>
-      </w:r>
-      <m:oMath>
-        <m:r>
-          <m:rPr>
-            <m:sty m:val="p"/>
-          </m:rPr>
-          <m:t>ℓ</m:t>
-        </m:r>
-      </m:oMath>
-      <w:r>
-        <w:t xml:space="preserve"> </w:t>
-      </w:r>
-      <w:r>
-        <w:t xml:space="preserve">and</w:t>
-      </w:r>
-      <w:r>
-        <w:t xml:space="preserve"> </w:t>
-      </w:r>
-      <m:oMath>
-        <m:r>
-          <m:t>u</m:t>
-        </m:r>
-      </m:oMath>
-      <w:r>
-        <w:t xml:space="preserve"> </w:t>
-      </w:r>
-      <w:r>
-        <w:t xml:space="preserve">tightly near 1 and 0 and makes the correction term effectively zero. When this is the case,</w:t>
-      </w:r>
-      <w:r>
-        <w:t xml:space="preserve"> </w:t>
-      </w:r>
-      <m:oMath>
-        <m:sSub>
-          <m:e>
-            <m:r>
-              <m:rPr>
-                <m:sty m:val="p"/>
-              </m:rPr>
-              <m:t>log</m:t>
-            </m:r>
-          </m:e>
-          <m:sub>
-            <m:r>
-              <m:t>10</m:t>
-            </m:r>
-          </m:sub>
-        </m:sSub>
-        <m:r>
-          <m:rPr>
-            <m:nor/>
-            <m:sty m:val="p"/>
-          </m:rPr>
-          <m:t>LT50</m:t>
-        </m:r>
-      </m:oMath>
-      <w:r>
-        <w:t xml:space="preserve"> </w:t>
-      </w:r>
-      <w:r>
-        <w:t xml:space="preserve">and</w:t>
-      </w:r>
-      <w:r>
-        <w:t xml:space="preserve"> </w:t>
-      </w:r>
-      <m:oMath>
-        <m:r>
-          <m:t>C</m:t>
-        </m:r>
-        <m:sSub>
-          <m:e>
-            <m:r>
-              <m:t>T</m:t>
-            </m:r>
-          </m:e>
-          <m:sub>
-            <m:r>
-              <m:t>m</m:t>
-            </m:r>
-            <m:r>
-              <m:t>a</m:t>
-            </m:r>
-            <m:r>
-              <m:t>x</m:t>
-            </m:r>
-          </m:sub>
-        </m:sSub>
-      </m:oMath>
-      <w:r>
-        <w:t xml:space="preserve"> </w:t>
-      </w:r>
-      <w:r>
-        <w:t xml:space="preserve">can be read directly from the naive forms in</w:t>
-      </w:r>
-      <w:r>
-        <w:t xml:space="preserve"> </w:t>
-      </w:r>
-      <w:hyperlink w:anchor="eq-lt50-corrected">
-        <w:r>
-          <w:rPr>
-            <w:rStyle w:val="Hyperlink"/>
-          </w:rPr>
-          <w:t xml:space="preserve">Equation 5</w:t>
-        </w:r>
-      </w:hyperlink>
-      <w:r>
-        <w:t xml:space="preserve"> </w:t>
-      </w:r>
-      <w:r>
-        <w:t xml:space="preserve">and</w:t>
-      </w:r>
-      <w:r>
-        <w:t xml:space="preserve"> </w:t>
-      </w:r>
-      <w:hyperlink w:anchor="eq-ctmax-corrected">
-        <w:r>
-          <w:rPr>
-            <w:rStyle w:val="Hyperlink"/>
-          </w:rPr>
-          <w:t xml:space="preserve">Equation 6</w:t>
-        </w:r>
-      </w:hyperlink>
-      <w:r>
-        <w:t xml:space="preserve">. Regardless, we recommend using the correction factor as a safeguard. However, computing both the naive and corrected estimates and comparing them is a useful sensitivity check for whether the correction is needed in any given dataset.</w:t>
-      </w:r>
-    </w:p>
-    <w:p>
-      <w:pPr>
-        <w:pStyle w:val="BodyText"/>
-      </w:pPr>
-      <w:r>
-        <w:t xml:space="preserve">The same derivation generalises beyond the median: the Bayesian dose-response fit gives access to</w:t>
-      </w:r>
-      <w:r>
-        <w:t xml:space="preserve"> </w:t>
-      </w:r>
-      <w:r>
-        <w:rPr>
-          <w:i/>
-          <w:iCs/>
-        </w:rPr>
-        <w:t xml:space="preserve">any</w:t>
-      </w:r>
-      <w:r>
-        <w:t xml:space="preserve"> </w:t>
-      </w:r>
-      <w:r>
-        <w:t xml:space="preserve">mortality percentile, not just</w:t>
-      </w:r>
-      <w:r>
-        <w:t xml:space="preserve"> </w:t>
-      </w:r>
-      <m:oMath>
-        <m:r>
-          <m:t>L</m:t>
-        </m:r>
-        <m:sSub>
-          <m:e>
-            <m:r>
-              <m:t>T</m:t>
-            </m:r>
-          </m:e>
-          <m:sub>
-            <m:r>
-              <m:t>50</m:t>
-            </m:r>
-          </m:sub>
-        </m:sSub>
-      </m:oMath>
-      <w:r>
-        <w:t xml:space="preserve"> </w:t>
-      </w:r>
-      <w:r>
-        <w:t xml:space="preserve">(</w:t>
-      </w:r>
-      <w:hyperlink w:anchor="ref-jorgensen_unifying_2021">
-        <w:r>
-          <w:rPr>
-            <w:rStyle w:val="Hyperlink"/>
-          </w:rPr>
-          <w:t xml:space="preserve">Jørgensen</w:t>
-        </w:r>
-        <w:r>
-          <w:rPr>
-            <w:rStyle w:val="Hyperlink"/>
-          </w:rPr>
-          <w:t xml:space="preserve"> </w:t>
-        </w:r>
-        <w:r>
-          <w:rPr>
-            <w:rStyle w:val="Hyperlink"/>
-            <w:i/>
-            <w:iCs/>
-          </w:rPr>
-          <w:t xml:space="preserve">et al.</w:t>
-        </w:r>
-        <w:r>
-          <w:rPr>
-            <w:rStyle w:val="Hyperlink"/>
-          </w:rPr>
-          <w:t xml:space="preserve"> </w:t>
-        </w:r>
-        <w:r>
-          <w:rPr>
-            <w:rStyle w:val="Hyperlink"/>
-          </w:rPr>
-          <w:t xml:space="preserve">2021</w:t>
-        </w:r>
-      </w:hyperlink>
-      <w:r>
-        <w:t xml:space="preserve">;</w:t>
-      </w:r>
-      <w:r>
-        <w:t xml:space="preserve"> </w:t>
-      </w:r>
-      <w:hyperlink w:anchor="ref-rezende_drosophila_mortality_2020">
-        <w:r>
-          <w:rPr>
-            <w:rStyle w:val="Hyperlink"/>
-          </w:rPr>
-          <w:t xml:space="preserve">Rezende</w:t>
-        </w:r>
-        <w:r>
-          <w:rPr>
-            <w:rStyle w:val="Hyperlink"/>
-          </w:rPr>
-          <w:t xml:space="preserve"> </w:t>
-        </w:r>
-        <w:r>
-          <w:rPr>
-            <w:rStyle w:val="Hyperlink"/>
-            <w:i/>
-            <w:iCs/>
-          </w:rPr>
-          <w:t xml:space="preserve">et al.</w:t>
-        </w:r>
-        <w:r>
-          <w:rPr>
-            <w:rStyle w:val="Hyperlink"/>
-          </w:rPr>
-          <w:t xml:space="preserve"> </w:t>
-        </w:r>
-        <w:r>
-          <w:rPr>
-            <w:rStyle w:val="Hyperlink"/>
-          </w:rPr>
-          <w:t xml:space="preserve">2020</w:t>
-        </w:r>
-      </w:hyperlink>
-      <w:r>
-        <w:t xml:space="preserve">)</w:t>
-      </w:r>
-      <w:r>
-        <w:t xml:space="preserve">. Setting</w:t>
-      </w:r>
-      <w:r>
-        <w:t xml:space="preserve"> </w:t>
-      </w:r>
-      <m:oMath>
-        <m:sSub>
-          <m:e>
-            <m:r>
-              <m:t>p</m:t>
-            </m:r>
-          </m:e>
-          <m:sub>
-            <m:r>
-              <m:t>i</m:t>
-            </m:r>
-            <m:r>
-              <m:t>j</m:t>
-            </m:r>
-          </m:sub>
-        </m:sSub>
-        <m:r>
-          <m:rPr>
-            <m:sty m:val="p"/>
-          </m:rPr>
-          <m:t>=</m:t>
-        </m:r>
-        <m:r>
-          <m:t>x</m:t>
-        </m:r>
-        <m:r>
-          <m:rPr>
-            <m:sty m:val="p"/>
-          </m:rPr>
-          <m:t>/</m:t>
-        </m:r>
-        <m:r>
-          <m:t>100</m:t>
-        </m:r>
-      </m:oMath>
-      <w:r>
-        <w:t xml:space="preserve"> </w:t>
-      </w:r>
-      <w:r>
-        <w:t xml:space="preserve">in</w:t>
-      </w:r>
-      <w:r>
-        <w:t xml:space="preserve"> </w:t>
-      </w:r>
-      <w:hyperlink w:anchor="eq-4pl">
-        <w:r>
-          <w:rPr>
-            <w:rStyle w:val="Hyperlink"/>
-          </w:rPr>
-          <w:t xml:space="preserve">Equation 2</w:t>
-        </w:r>
-      </w:hyperlink>
-      <w:r>
-        <w:t xml:space="preserve"> </w:t>
-      </w:r>
-      <w:r>
-        <w:t xml:space="preserve">and following the same algebra used for</w:t>
-      </w:r>
-      <w:r>
-        <w:t xml:space="preserve"> </w:t>
-      </w:r>
-      <m:oMath>
-        <m:r>
-          <m:t>L</m:t>
-        </m:r>
-        <m:sSub>
-          <m:e>
-            <m:r>
-              <m:t>T</m:t>
-            </m:r>
-          </m:e>
-          <m:sub>
-            <m:r>
-              <m:t>50</m:t>
-            </m:r>
-          </m:sub>
-        </m:sSub>
-      </m:oMath>
-      <w:r>
-        <w:t xml:space="preserve">, the posterior samples of</w:t>
-      </w:r>
-      <w:r>
-        <w:t xml:space="preserve"> </w:t>
-      </w:r>
-      <m:oMath>
-        <m:d>
-          <m:dPr>
-            <m:begChr m:val="("/>
-            <m:sepChr m:val=""/>
-            <m:endChr m:val=")"/>
-            <m:grow/>
-          </m:dPr>
-          <m:e>
-            <m:r>
-              <m:rPr>
-                <m:sty m:val="p"/>
-              </m:rPr>
-              <m:t>ℓ</m:t>
-            </m:r>
-            <m:r>
-              <m:rPr>
-                <m:sty m:val="p"/>
-              </m:rPr>
-              <m:t>,</m:t>
-            </m:r>
-            <m:r>
-              <m:t>u</m:t>
-            </m:r>
-            <m:r>
-              <m:rPr>
-                <m:sty m:val="p"/>
-              </m:rPr>
-              <m:t>,</m:t>
-            </m:r>
-            <m:r>
-              <m:t>k</m:t>
-            </m:r>
-            <m:r>
-              <m:rPr>
-                <m:sty m:val="p"/>
-              </m:rPr>
-              <m:t>,</m:t>
-            </m:r>
-            <m:r>
-              <m:t>m</m:t>
-            </m:r>
-            <m:d>
-              <m:dPr>
-                <m:begChr m:val="("/>
-                <m:sepChr m:val=""/>
-                <m:endChr m:val=")"/>
-                <m:grow/>
-              </m:dPr>
-              <m:e>
-                <m:r>
-                  <m:t>T</m:t>
-                </m:r>
-              </m:e>
-            </m:d>
-          </m:e>
-        </m:d>
-      </m:oMath>
-      <w:r>
-        <w:t xml:space="preserve"> </w:t>
-      </w:r>
-      <w:r>
-        <w:t xml:space="preserve">deliver the time at which</w:t>
-      </w:r>
-      <w:r>
-        <w:t xml:space="preserve"> </w:t>
-      </w:r>
-      <m:oMath>
-        <m:r>
-          <m:t>x</m:t>
-        </m:r>
-        <m:r>
-          <m:rPr>
-            <m:sty m:val="p"/>
-          </m:rPr>
-          <m:t>%</m:t>
-        </m:r>
-      </m:oMath>
-      <w:r>
-        <w:t xml:space="preserve"> </w:t>
-      </w:r>
-      <w:r>
-        <w:t xml:space="preserve">of the population reaches the assayed endpoint:</w:t>
-      </w:r>
-    </w:p>
-    <w:p>
-      <w:pPr>
-        <w:pStyle w:val="BodyText"/>
-      </w:pPr>
-      <w:bookmarkStart w:id="29" w:name="eq-LTx"/>
-      <m:oMathPara>
-        <m:oMathParaPr>
-          <m:jc m:val="center"/>
-        </m:oMathParaPr>
-        <m:oMath>
-          <m:sSub>
-            <m:e>
-              <m:r>
-                <m:rPr>
-                  <m:sty m:val="p"/>
-                </m:rPr>
-                <m:t>log</m:t>
-              </m:r>
-            </m:e>
-            <m:sub>
-              <m:r>
-                <m:t>10</m:t>
-              </m:r>
-            </m:sub>
-          </m:sSub>
-          <m:r>
-            <m:t>L</m:t>
-          </m:r>
-          <m:sSub>
-            <m:e>
-              <m:r>
-                <m:t>T</m:t>
-              </m:r>
-            </m:e>
-            <m:sub>
-              <m:r>
-                <m:t>x</m:t>
-              </m:r>
-            </m:sub>
-          </m:sSub>
-          <m:d>
-            <m:dPr>
-              <m:begChr m:val="("/>
-              <m:sepChr m:val=""/>
-              <m:endChr m:val=")"/>
-              <m:grow/>
-            </m:dPr>
-            <m:e>
-              <m:r>
-                <m:t>T</m:t>
-              </m:r>
-            </m:e>
-          </m:d>
-          <m:r>
-            <m:t> </m:t>
-          </m:r>
-          <m:r>
-            <m:rPr>
-              <m:sty m:val="p"/>
-            </m:rPr>
-            <m:t>=</m:t>
-          </m:r>
-          <m:r>
-            <m:t> </m:t>
-          </m:r>
-          <m:r>
-            <m:t>m</m:t>
-          </m:r>
-          <m:d>
-            <m:dPr>
-              <m:begChr m:val="("/>
-              <m:sepChr m:val=""/>
-              <m:endChr m:val=")"/>
-              <m:grow/>
-            </m:dPr>
-            <m:e>
-              <m:r>
-                <m:t>T</m:t>
-              </m:r>
-            </m:e>
-          </m:d>
-          <m:r>
-            <m:t> </m:t>
-          </m:r>
-          <m:r>
-            <m:rPr>
-              <m:sty m:val="p"/>
-            </m:rPr>
-            <m:t>−</m:t>
-          </m:r>
-          <m:r>
-            <m:t> </m:t>
-          </m:r>
-          <m:f>
-            <m:fPr>
-              <m:type m:val="bar"/>
-            </m:fPr>
-            <m:num>
-              <m:r>
-                <m:t>1</m:t>
-              </m:r>
-            </m:num>
-            <m:den>
-              <m:r>
-                <m:t>k</m:t>
-              </m:r>
-            </m:den>
-          </m:f>
-          <m:r>
-            <m:t> </m:t>
-          </m:r>
-          <m:r>
-            <m:rPr>
-              <m:sty m:val="p"/>
-            </m:rPr>
-            <m:t>ln</m:t>
-          </m:r>
-          <m:r>
-            <m:t>​</m:t>
-          </m:r>
-          <m:f>
-            <m:fPr>
-              <m:type m:val="bar"/>
-            </m:fPr>
-            <m:num>
-              <m:r>
-                <m:t>u</m:t>
-              </m:r>
-              <m:r>
-                <m:rPr>
-                  <m:sty m:val="p"/>
-                </m:rPr>
-                <m:t>−</m:t>
-              </m:r>
-              <m:r>
-                <m:t>x</m:t>
-              </m:r>
-              <m:r>
-                <m:rPr>
-                  <m:sty m:val="p"/>
-                </m:rPr>
-                <m:t>/</m:t>
-              </m:r>
-              <m:r>
-                <m:t>100</m:t>
-              </m:r>
-            </m:num>
-            <m:den>
-              <m:r>
-                <m:t>x</m:t>
-              </m:r>
-              <m:r>
-                <m:rPr>
-                  <m:sty m:val="p"/>
-                </m:rPr>
-                <m:t>/</m:t>
-              </m:r>
-              <m:r>
-                <m:t>100</m:t>
-              </m:r>
-              <m:r>
-                <m:rPr>
-                  <m:sty m:val="p"/>
-                </m:rPr>
-                <m:t>−</m:t>
-              </m:r>
-              <m:r>
-                <m:rPr>
-                  <m:sty m:val="p"/>
-                </m:rPr>
-                <m:t>ℓ</m:t>
-              </m:r>
-            </m:den>
-          </m:f>
-          <m:r>
-            <m:rPr>
-              <m:sty m:val="p"/>
-            </m:rPr>
-            <m:t>,</m:t>
-          </m:r>
-          <m:r>
-            <m:t>  </m:t>
-          </m:r>
-          <m:d>
-            <m:dPr>
-              <m:begChr m:val="("/>
-              <m:sepChr m:val=""/>
-              <m:endChr m:val=")"/>
-              <m:grow/>
-            </m:dPr>
-            <m:e>
-              <m:r>
                 <m:t>7</m:t>
               </m:r>
             </m:e>
@@ -7137,45 +7116,78 @@
         <w:pStyle w:val="FirstParagraph"/>
       </w:pPr>
       <w:r>
-        <w:t xml:space="preserve">Varying</w:t>
+        <w:t xml:space="preserve">In practice, however, these corrections may not be needed so long as the experimental design includes treatments that span the full mortality range which anchors</w:t>
       </w:r>
       <w:r>
         <w:t xml:space="preserve"> </w:t>
       </w:r>
       <m:oMath>
         <m:r>
-          <m:t>x</m:t>
+          <m:rPr>
+            <m:sty m:val="p"/>
+          </m:rPr>
+          <m:t>ℓ</m:t>
         </m:r>
       </m:oMath>
       <w:r>
         <w:t xml:space="preserve"> </w:t>
       </w:r>
       <w:r>
-        <w:t xml:space="preserve">in</w:t>
-      </w:r>
-      <w:r>
-        <w:t xml:space="preserve"> </w:t>
-      </w:r>
-      <w:hyperlink w:anchor="eq-LTx">
-        <w:r>
-          <w:rPr>
-            <w:rStyle w:val="Hyperlink"/>
-          </w:rPr>
-          <w:t xml:space="preserve">Equation 7</w:t>
-        </w:r>
-      </w:hyperlink>
-      <w:r>
-        <w:t xml:space="preserve"> </w:t>
-      </w:r>
-      <w:r>
-        <w:t xml:space="preserve">then yields any threshold of interest. For instance,</w:t>
+        <w:t xml:space="preserve">and</w:t>
       </w:r>
       <w:r>
         <w:t xml:space="preserve"> </w:t>
       </w:r>
       <m:oMath>
         <m:r>
-          <m:t>L</m:t>
+          <m:t>u</m:t>
+        </m:r>
+      </m:oMath>
+      <w:r>
+        <w:t xml:space="preserve"> </w:t>
+      </w:r>
+      <w:r>
+        <w:t xml:space="preserve">tightly near 1 and 0 and makes the correction term effectively zero. When this is the case,</w:t>
+      </w:r>
+      <w:r>
+        <w:t xml:space="preserve"> </w:t>
+      </w:r>
+      <m:oMath>
+        <m:sSub>
+          <m:e>
+            <m:r>
+              <m:rPr>
+                <m:sty m:val="p"/>
+              </m:rPr>
+              <m:t>log</m:t>
+            </m:r>
+          </m:e>
+          <m:sub>
+            <m:r>
+              <m:t>10</m:t>
+            </m:r>
+          </m:sub>
+        </m:sSub>
+        <m:r>
+          <m:rPr>
+            <m:nor/>
+            <m:sty m:val="p"/>
+          </m:rPr>
+          <m:t>LT50</m:t>
+        </m:r>
+      </m:oMath>
+      <w:r>
+        <w:t xml:space="preserve"> </w:t>
+      </w:r>
+      <w:r>
+        <w:t xml:space="preserve">and</w:t>
+      </w:r>
+      <w:r>
+        <w:t xml:space="preserve"> </w:t>
+      </w:r>
+      <m:oMath>
+        <m:r>
+          <m:t>C</m:t>
         </m:r>
         <m:sSub>
           <m:e>
@@ -7185,7 +7197,13 @@
           </m:e>
           <m:sub>
             <m:r>
-              <m:t>10</m:t>
+              <m:t>m</m:t>
+            </m:r>
+            <m:r>
+              <m:t>a</m:t>
+            </m:r>
+            <m:r>
+              <m:t>x</m:t>
             </m:r>
           </m:sub>
         </m:sSub>
@@ -7194,56 +7212,38 @@
         <w:t xml:space="preserve"> </w:t>
       </w:r>
       <w:r>
-        <w:t xml:space="preserve">marks the onset of early mortality — useful for risk management — while</w:t>
-      </w:r>
-      <w:r>
-        <w:t xml:space="preserve"> </w:t>
-      </w:r>
-      <m:oMath>
-        <m:r>
-          <m:t>L</m:t>
-        </m:r>
-        <m:sSub>
-          <m:e>
-            <m:r>
-              <m:t>T</m:t>
-            </m:r>
-          </m:e>
-          <m:sub>
-            <m:r>
-              <m:t>90</m:t>
-            </m:r>
-          </m:sub>
-        </m:sSub>
-      </m:oMath>
-      <w:r>
-        <w:t xml:space="preserve"> </w:t>
-      </w:r>
-      <w:r>
-        <w:t xml:space="preserve">is closer to a population-collapse threshold. As with</w:t>
-      </w:r>
-      <w:r>
-        <w:t xml:space="preserve"> </w:t>
-      </w:r>
-      <m:oMath>
-        <m:r>
-          <m:t>L</m:t>
-        </m:r>
-        <m:sSub>
-          <m:e>
-            <m:r>
-              <m:t>T</m:t>
-            </m:r>
-          </m:e>
-          <m:sub>
-            <m:r>
-              <m:t>50</m:t>
-            </m:r>
-          </m:sub>
-        </m:sSub>
-      </m:oMath>
-      <w:r>
-        <w:t xml:space="preserve">, every prediction inherits the joint posterior, so uncertainty bands can be reported alongside the population-level median.</w:t>
+        <w:t xml:space="preserve">can be read directly from the naive forms in</w:t>
+      </w:r>
+      <w:r>
+        <w:t xml:space="preserve"> </w:t>
+      </w:r>
+      <w:hyperlink w:anchor="eq-lt50-corrected">
+        <w:r>
+          <w:rPr>
+            <w:rStyle w:val="Hyperlink"/>
+          </w:rPr>
+          <w:t xml:space="preserve">Equation 6</w:t>
+        </w:r>
+      </w:hyperlink>
+      <w:r>
+        <w:t xml:space="preserve"> </w:t>
+      </w:r>
+      <w:r>
+        <w:t xml:space="preserve">and</w:t>
+      </w:r>
+      <w:r>
+        <w:t xml:space="preserve"> </w:t>
+      </w:r>
+      <w:hyperlink w:anchor="eq-ctmax-corrected">
+        <w:r>
+          <w:rPr>
+            <w:rStyle w:val="Hyperlink"/>
+          </w:rPr>
+          <w:t xml:space="preserve">Equation 7</w:t>
+        </w:r>
+      </w:hyperlink>
+      <w:r>
+        <w:t xml:space="preserve">. Regardless, we recommend using the correction factor as a safeguard. However, computing both the naive and corrected estimates and comparing them is a useful sensitivity check for whether the correction is needed in any given dataset.</w:t>
       </w:r>
     </w:p>
     <w:bookmarkEnd w:id="30"/>

</xml_diff>

<commit_message>
Integrated key sim results in the main MS. Rest in supplement
</commit_message>
<xml_diff>
--- a/_output/ms.docx
+++ b/_output/ms.docx
@@ -389,7 +389,7 @@
         <w:t xml:space="preserve">thermal-death-time; thermal tolerance landscape; multilevel model; 4-parameter logistic; heat injury; heat tolerance; critical thermal maximum; ectotherm</w:t>
       </w:r>
     </w:p>
-    <w:bookmarkStart w:id="20" w:name="introduction"/>
+    <w:bookmarkStart w:id="24" w:name="introduction"/>
     <w:p>
       <w:pPr>
         <w:pStyle w:val="Heading1"/>
@@ -1901,14 +1901,38 @@
       <w:r>
         <w:t xml:space="preserve"> </w:t>
       </w:r>
-      <w:hyperlink w:anchor="ref-zamora2026predicting">
-        <w:r>
-          <w:rPr>
-            <w:rStyle w:val="Hyperlink"/>
-            <w:b/>
-            <w:bCs/>
-          </w:rPr>
-          <w:t xml:space="preserve">zamora2026predicting?</w:t>
+      <w:hyperlink w:anchor="ref-zamora2026">
+        <w:r>
+          <w:rPr>
+            <w:rStyle w:val="Hyperlink"/>
+          </w:rPr>
+          <w:t xml:space="preserve">Zamora</w:t>
+        </w:r>
+        <w:r>
+          <w:rPr>
+            <w:rStyle w:val="Hyperlink"/>
+          </w:rPr>
+          <w:t xml:space="preserve"> </w:t>
+        </w:r>
+        <w:r>
+          <w:rPr>
+            <w:rStyle w:val="Hyperlink"/>
+            <w:i/>
+            <w:iCs/>
+          </w:rPr>
+          <w:t xml:space="preserve">et al.</w:t>
+        </w:r>
+        <w:r>
+          <w:rPr>
+            <w:rStyle w:val="Hyperlink"/>
+          </w:rPr>
+          <w:t xml:space="preserve"> </w:t>
+        </w:r>
+        <w:r>
+          <w:rPr>
+            <w:rStyle w:val="Hyperlink"/>
+          </w:rPr>
+          <w:t xml:space="preserve">2026</w:t>
         </w:r>
       </w:hyperlink>
       <w:r>
@@ -3420,8 +3444,443 @@
         <w:t xml:space="preserve">), and XXX (XXX), we demonstrate how to implement, validate, and expand this new modelling approach.</w:t>
       </w:r>
     </w:p>
-    <w:bookmarkEnd w:id="20"/>
-    <w:bookmarkStart w:id="24" w:name="X4ae69e6473582f743e31b9e3b0100c4bac3c9f9"/>
+    <w:tbl>
+      <w:tblPr>
+        <w:tblStyle w:val="Table"/>
+        <w:tblW w:type="pct" w:w="5000"/>
+        <w:tblLayout w:type="fixed"/>
+        <w:tblLook w:firstRow="0" w:lastRow="0" w:firstColumn="0" w:lastColumn="0" w:noHBand="0" w:noVBand="0" w:val="0000"/>
+      </w:tblPr>
+      <w:tblGrid>
+        <w:gridCol w:w="7920"/>
+      </w:tblGrid>
+      <w:tr>
+        <w:tc>
+          <w:tcPr/>
+          <w:bookmarkStart w:id="23" w:name="fig-joint-4pl-conceptual"/>
+          <w:p>
+            <w:pPr>
+              <w:pStyle w:val="Compact"/>
+              <w:jc w:val="center"/>
+            </w:pPr>
+            <w:r>
+              <w:drawing>
+                <wp:inline>
+                  <wp:extent cx="5943600" cy="7868496"/>
+                  <wp:effectExtent b="0" l="0" r="0" t="0"/>
+                  <wp:docPr descr="" title="" id="21" name="Picture"/>
+                  <a:graphic>
+                    <a:graphicData uri="http://schemas.openxmlformats.org/drawingml/2006/picture">
+                      <pic:pic>
+                        <pic:nvPicPr>
+                          <pic:cNvPr descr="../../../CloudStorage/Dropbox/1_Research/1_Manuscripts/In_Preparation/tls_model_equivalence/output/figs/fig1.png" id="22" name="Picture"/>
+                          <pic:cNvPicPr>
+                            <a:picLocks noChangeArrowheads="1" noChangeAspect="1"/>
+                          </pic:cNvPicPr>
+                        </pic:nvPicPr>
+                        <pic:blipFill>
+                          <a:blip r:embed="rId20"/>
+                          <a:stretch>
+                            <a:fillRect/>
+                          </a:stretch>
+                        </pic:blipFill>
+                        <pic:spPr bwMode="auto">
+                          <a:xfrm>
+                            <a:off x="0" y="0"/>
+                            <a:ext cx="5943600" cy="7868496"/>
+                          </a:xfrm>
+                          <a:prstGeom prst="rect">
+                            <a:avLst/>
+                          </a:prstGeom>
+                          <a:noFill/>
+                          <a:ln w="9525">
+                            <a:noFill/>
+                            <a:headEnd/>
+                            <a:tailEnd/>
+                          </a:ln>
+                        </pic:spPr>
+                      </pic:pic>
+                    </a:graphicData>
+                  </a:graphic>
+                </wp:inline>
+              </w:drawing>
+            </w:r>
+          </w:p>
+          <w:p>
+            <w:pPr>
+              <w:jc w:val="center"/>
+            </w:pPr>
+            <w:pPr>
+              <w:jc w:val="start"/>
+              <w:spacing w:before="200"/>
+              <w:pStyle w:val="ImageCaption"/>
+            </w:pPr>
+            <w:r>
+              <w:t xml:space="preserve">Figure 1: Conceptual comparison of the classical two-stage TDT/TLS workflow and the joint Bayesian four-parameter logistic (4PL) model. (a) In the two-stage workflow, separate dose-response curves are fit at each assay temperature and the resulting</w:t>
+            </w:r>
+            <w:r>
+              <w:t xml:space="preserve"> </w:t>
+            </w:r>
+            <m:oMath>
+              <m:sSub>
+                <m:e>
+                  <m:r>
+                    <m:t>t</m:t>
+                  </m:r>
+                </m:e>
+                <m:sub>
+                  <m:r>
+                    <m:t>50</m:t>
+                  </m:r>
+                </m:sub>
+              </m:sSub>
+            </m:oMath>
+            <w:r>
+              <w:t xml:space="preserve"> </w:t>
+            </w:r>
+            <w:r>
+              <w:t xml:space="preserve">estimates are regressed against temperature. This can fail when assays do not bracket</w:t>
+            </w:r>
+            <w:r>
+              <w:t xml:space="preserve"> </w:t>
+            </w:r>
+            <m:oMath>
+              <m:sSub>
+                <m:e>
+                  <m:r>
+                    <m:t>t</m:t>
+                  </m:r>
+                </m:e>
+                <m:sub>
+                  <m:r>
+                    <m:t>50</m:t>
+                  </m:r>
+                </m:sub>
+              </m:sSub>
+            </m:oMath>
+            <w:r>
+              <w:t xml:space="preserve">, treats first-stage estimates as fixed and independent, and does not naturally propagate uncertainty, covariates, or hierarchical structure into</w:t>
+            </w:r>
+            <w:r>
+              <w:t xml:space="preserve"> </w:t>
+            </w:r>
+            <m:oMath>
+              <m:r>
+                <m:t>z</m:t>
+              </m:r>
+            </m:oMath>
+            <w:r>
+              <w:t xml:space="preserve"> </w:t>
+            </w:r>
+            <w:r>
+              <w:t xml:space="preserve">and</w:t>
+            </w:r>
+            <w:r>
+              <w:t xml:space="preserve"> </w:t>
+            </w:r>
+            <m:oMath>
+              <m:r>
+                <m:t>C</m:t>
+              </m:r>
+              <m:sSub>
+                <m:e>
+                  <m:r>
+                    <m:t>T</m:t>
+                  </m:r>
+                </m:e>
+                <m:sub>
+                  <m:r>
+                    <m:t>m</m:t>
+                  </m:r>
+                  <m:r>
+                    <m:t>a</m:t>
+                  </m:r>
+                  <m:r>
+                    <m:t>x</m:t>
+                  </m:r>
+                  <m:r>
+                    <m:rPr>
+                      <m:sty m:val="p"/>
+                    </m:rPr>
+                    <m:t>,</m:t>
+                  </m:r>
+                  <m:r>
+                    <m:t>1</m:t>
+                  </m:r>
+                  <m:r>
+                    <m:t>h</m:t>
+                  </m:r>
+                </m:sub>
+              </m:sSub>
+            </m:oMath>
+            <w:r>
+              <w:t xml:space="preserve">. (b) The joint 4PL model estimates the full survival surface in one model. Coloured curves show posterior median survival probabilities at assay temperatures, with shaded pointwise 95% credible intervals. Filled circles mark the model midpoint,</w:t>
+            </w:r>
+            <w:r>
+              <w:t xml:space="preserve"> </w:t>
+            </w:r>
+            <w:r>
+              <w:rPr>
+                <w:rStyle w:val="VerbatimChar"/>
+              </w:rPr>
+              <w:t xml:space="preserve">mid(T)</w:t>
+            </w:r>
+            <w:r>
+              <w:t xml:space="preserve">, defining relative</w:t>
+            </w:r>
+            <w:r>
+              <w:t xml:space="preserve"> </w:t>
+            </w:r>
+            <m:oMath>
+              <m:sSub>
+                <m:e>
+                  <m:r>
+                    <m:rPr>
+                      <m:sty m:val="p"/>
+                    </m:rPr>
+                    <m:t>log</m:t>
+                  </m:r>
+                </m:e>
+                <m:sub>
+                  <m:r>
+                    <m:t>10</m:t>
+                  </m:r>
+                </m:sub>
+              </m:sSub>
+              <m:sSub>
+                <m:e>
+                  <m:r>
+                    <m:t>t</m:t>
+                  </m:r>
+                </m:e>
+                <m:sub>
+                  <m:r>
+                    <m:t>50</m:t>
+                  </m:r>
+                </m:sub>
+              </m:sSub>
+            </m:oMath>
+            <w:r>
+              <w:t xml:space="preserve">; open triangles mark the absolute 50% survival crossing. The black and steelblue trajectories give the relative and absolute</w:t>
+            </w:r>
+            <w:r>
+              <w:t xml:space="preserve"> </w:t>
+            </w:r>
+            <m:oMath>
+              <m:sSub>
+                <m:e>
+                  <m:r>
+                    <m:t>t</m:t>
+                  </m:r>
+                </m:e>
+                <m:sub>
+                  <m:r>
+                    <m:t>50</m:t>
+                  </m:r>
+                </m:sub>
+              </m:sSub>
+            </m:oMath>
+            <w:r>
+              <w:t xml:space="preserve"> </w:t>
+            </w:r>
+            <w:r>
+              <w:t xml:space="preserve">relationships used to derive</w:t>
+            </w:r>
+            <w:r>
+              <w:t xml:space="preserve"> </w:t>
+            </w:r>
+            <m:oMath>
+              <m:sSub>
+                <m:e>
+                  <m:r>
+                    <m:t>z</m:t>
+                  </m:r>
+                </m:e>
+                <m:sub>
+                  <m:r>
+                    <m:t>r</m:t>
+                  </m:r>
+                  <m:r>
+                    <m:t>e</m:t>
+                  </m:r>
+                  <m:r>
+                    <m:t>l</m:t>
+                  </m:r>
+                </m:sub>
+              </m:sSub>
+            </m:oMath>
+            <w:r>
+              <w:t xml:space="preserve">,</w:t>
+            </w:r>
+            <w:r>
+              <w:t xml:space="preserve"> </w:t>
+            </w:r>
+            <m:oMath>
+              <m:sSub>
+                <m:e>
+                  <m:r>
+                    <m:t>z</m:t>
+                  </m:r>
+                </m:e>
+                <m:sub>
+                  <m:r>
+                    <m:t>a</m:t>
+                  </m:r>
+                  <m:r>
+                    <m:t>b</m:t>
+                  </m:r>
+                  <m:r>
+                    <m:t>s</m:t>
+                  </m:r>
+                </m:sub>
+              </m:sSub>
+            </m:oMath>
+            <w:r>
+              <w:t xml:space="preserve">, and</w:t>
+            </w:r>
+            <w:r>
+              <w:t xml:space="preserve"> </w:t>
+            </w:r>
+            <m:oMath>
+              <m:r>
+                <m:t>C</m:t>
+              </m:r>
+              <m:sSub>
+                <m:e>
+                  <m:r>
+                    <m:t>T</m:t>
+                  </m:r>
+                </m:e>
+                <m:sub>
+                  <m:r>
+                    <m:t>m</m:t>
+                  </m:r>
+                  <m:r>
+                    <m:t>a</m:t>
+                  </m:r>
+                  <m:r>
+                    <m:t>x</m:t>
+                  </m:r>
+                  <m:r>
+                    <m:rPr>
+                      <m:sty m:val="p"/>
+                    </m:rPr>
+                    <m:t>,</m:t>
+                  </m:r>
+                  <m:r>
+                    <m:t>1</m:t>
+                  </m:r>
+                  <m:r>
+                    <m:t>h</m:t>
+                  </m:r>
+                </m:sub>
+              </m:sSub>
+            </m:oMath>
+            <w:r>
+              <w:t xml:space="preserve"> </w:t>
+            </w:r>
+            <w:r>
+              <w:t xml:space="preserve">at the 60-min reference. Dashed ghost curves show the fitted dose response at the corresponding relative and absolute</w:t>
+            </w:r>
+            <w:r>
+              <w:t xml:space="preserve"> </w:t>
+            </w:r>
+            <m:oMath>
+              <m:r>
+                <m:t>C</m:t>
+              </m:r>
+              <m:sSub>
+                <m:e>
+                  <m:r>
+                    <m:t>T</m:t>
+                  </m:r>
+                </m:e>
+                <m:sub>
+                  <m:r>
+                    <m:t>m</m:t>
+                  </m:r>
+                  <m:r>
+                    <m:t>a</m:t>
+                  </m:r>
+                  <m:r>
+                    <m:t>x</m:t>
+                  </m:r>
+                  <m:r>
+                    <m:rPr>
+                      <m:sty m:val="p"/>
+                    </m:rPr>
+                    <m:t>,</m:t>
+                  </m:r>
+                  <m:r>
+                    <m:t>1</m:t>
+                  </m:r>
+                  <m:r>
+                    <m:t>h</m:t>
+                  </m:r>
+                </m:sub>
+              </m:sSub>
+            </m:oMath>
+            <w:r>
+              <w:t xml:space="preserve"> </w:t>
+            </w:r>
+            <w:r>
+              <w:t xml:space="preserve">values. Inset: the 4PL parameters</w:t>
+            </w:r>
+            <w:r>
+              <w:t xml:space="preserve"> </w:t>
+            </w:r>
+            <w:r>
+              <w:rPr>
+                <w:rStyle w:val="VerbatimChar"/>
+              </w:rPr>
+              <w:t xml:space="preserve">low</w:t>
+            </w:r>
+            <w:r>
+              <w:t xml:space="preserve">,</w:t>
+            </w:r>
+            <w:r>
+              <w:t xml:space="preserve"> </w:t>
+            </w:r>
+            <w:r>
+              <w:rPr>
+                <w:rStyle w:val="VerbatimChar"/>
+              </w:rPr>
+              <w:t xml:space="preserve">up</w:t>
+            </w:r>
+            <w:r>
+              <w:t xml:space="preserve">,</w:t>
+            </w:r>
+            <w:r>
+              <w:t xml:space="preserve"> </w:t>
+            </w:r>
+            <w:r>
+              <w:rPr>
+                <w:rStyle w:val="VerbatimChar"/>
+              </w:rPr>
+              <w:t xml:space="preserve">mid</w:t>
+            </w:r>
+            <w:r>
+              <w:t xml:space="preserve">, and</w:t>
+            </w:r>
+            <w:r>
+              <w:t xml:space="preserve"> </w:t>
+            </w:r>
+            <w:r>
+              <w:rPr>
+                <w:rStyle w:val="VerbatimChar"/>
+              </w:rPr>
+              <w:t xml:space="preserve">k</w:t>
+            </w:r>
+            <w:r>
+              <w:t xml:space="preserve">. Values are illustrative.</w:t>
+            </w:r>
+          </w:p>
+          <w:bookmarkEnd w:id="23"/>
+        </w:tc>
+      </w:tr>
+    </w:tbl>
+    <w:bookmarkEnd w:id="24"/>
+    <w:bookmarkStart w:id="28" w:name="X4ae69e6473582f743e31b9e3b0100c4bac3c9f9"/>
     <w:p>
       <w:pPr>
         <w:pStyle w:val="Heading1"/>
@@ -3430,7 +3889,7 @@
         <w:t xml:space="preserve">A non-linear Bayesian hierarchical model for characterizing thermal load sensitivity</w:t>
       </w:r>
     </w:p>
-    <w:bookmarkStart w:id="23" w:name="model-specification"/>
+    <w:bookmarkStart w:id="27" w:name="model-specification"/>
     <w:p>
       <w:pPr>
         <w:pStyle w:val="Heading2"/>
@@ -3507,7 +3966,7 @@
       <w:pPr>
         <w:pStyle w:val="BodyText"/>
       </w:pPr>
-      <w:bookmarkStart w:id="21" w:name="eq-likelihood"/>
+      <w:bookmarkStart w:id="25" w:name="eq-likelihood"/>
       <m:oMathPara>
         <m:oMathParaPr>
           <m:jc m:val="center"/>
@@ -3602,7 +4061,7 @@
           </m:d>
         </m:oMath>
       </m:oMathPara>
-      <w:bookmarkEnd w:id="21"/>
+      <w:bookmarkEnd w:id="25"/>
     </w:p>
     <w:p>
       <w:pPr>
@@ -3653,7 +4112,7 @@
       <w:pPr>
         <w:pStyle w:val="BodyText"/>
       </w:pPr>
-      <w:bookmarkStart w:id="22" w:name="eq-4pl"/>
+      <w:bookmarkStart w:id="26" w:name="eq-4pl"/>
       <m:oMathPara>
         <m:oMathParaPr>
           <m:jc m:val="center"/>
@@ -3821,7 +4280,7 @@
           </m:d>
         </m:oMath>
       </m:oMathPara>
-      <w:bookmarkEnd w:id="22"/>
+      <w:bookmarkEnd w:id="26"/>
     </w:p>
     <w:p>
       <w:pPr>
@@ -4211,9 +4670,9 @@
         <w:t xml:space="preserve">comparisons (e.g., do sexes or species differ in midpoints?), with correct inference (e.g., do species differ significantly from each other?) and allows for variance decomposition to help identify key sources of variance in the data (e.g., estimating variances explained across individuals, species, trials etc.). Such models are most flexibly fit within a Bayesian framework with intuitive interpretation of these parameters and a highly flexible path for error propagation. We show below how such a model can be used to derive all thermal load sensitivity parameters of interest to ecophysiologists.</w:t>
       </w:r>
     </w:p>
-    <w:bookmarkEnd w:id="23"/>
-    <w:bookmarkEnd w:id="24"/>
-    <w:bookmarkStart w:id="29" w:name="X46eb6268dcffa0b752ad63ad3dfd63180af2bd8"/>
+    <w:bookmarkEnd w:id="27"/>
+    <w:bookmarkEnd w:id="28"/>
+    <w:bookmarkStart w:id="33" w:name="X46eb6268dcffa0b752ad63ad3dfd63180af2bd8"/>
     <w:p>
       <w:pPr>
         <w:pStyle w:val="Heading1"/>
@@ -4384,7 +4843,7 @@
       <w:pPr>
         <w:pStyle w:val="BodyText"/>
       </w:pPr>
-      <w:bookmarkStart w:id="25" w:name="eq-mid-temp"/>
+      <w:bookmarkStart w:id="29" w:name="eq-mid-temp"/>
       <m:oMathPara>
         <m:oMathParaPr>
           <m:jc m:val="center"/>
@@ -4489,7 +4948,7 @@
           </m:d>
         </m:oMath>
       </m:oMathPara>
-      <w:bookmarkEnd w:id="25"/>
+      <w:bookmarkEnd w:id="29"/>
     </w:p>
     <w:p>
       <w:pPr>
@@ -5281,7 +5740,7 @@
       <w:pPr>
         <w:pStyle w:val="BodyText"/>
       </w:pPr>
-      <w:bookmarkStart w:id="26" w:name="eq-t50"/>
+      <w:bookmarkStart w:id="30" w:name="eq-t50"/>
       <m:oMathPara>
         <m:oMathParaPr>
           <m:jc m:val="center"/>
@@ -5460,7 +5919,7 @@
           </m:d>
         </m:oMath>
       </m:oMathPara>
-      <w:bookmarkEnd w:id="26"/>
+      <w:bookmarkEnd w:id="30"/>
     </w:p>
     <w:p>
       <w:pPr>
@@ -5584,7 +6043,7 @@
       <w:pPr>
         <w:pStyle w:val="BodyText"/>
       </w:pPr>
-      <w:bookmarkStart w:id="27" w:name="eq-ctmax-corrected"/>
+      <w:bookmarkStart w:id="31" w:name="eq-ctmax-corrected"/>
       <m:oMathPara>
         <m:oMathParaPr>
           <m:jc m:val="center"/>
@@ -5866,7 +6325,7 @@
           </m:d>
         </m:oMath>
       </m:oMathPara>
-      <w:bookmarkEnd w:id="27"/>
+      <w:bookmarkEnd w:id="31"/>
     </w:p>
     <w:p>
       <w:pPr>
@@ -5978,7 +6437,7 @@
       <w:pPr>
         <w:pStyle w:val="BodyText"/>
       </w:pPr>
-      <w:bookmarkStart w:id="28" w:name="eq-LTx"/>
+      <w:bookmarkStart w:id="32" w:name="eq-LTx"/>
       <m:oMathPara>
         <m:oMathParaPr>
           <m:jc m:val="center"/>
@@ -6178,7 +6637,7 @@
           </m:d>
         </m:oMath>
       </m:oMathPara>
-      <w:bookmarkEnd w:id="28"/>
+      <w:bookmarkEnd w:id="32"/>
     </w:p>
     <w:p>
       <w:pPr>
@@ -6820,8 +7279,8 @@
         <w:t xml:space="preserve">below).</w:t>
       </w:r>
     </w:p>
-    <w:bookmarkEnd w:id="29"/>
-    <w:bookmarkStart w:id="33" w:name="X748caa9d6c5389c1517c1b3b0c0fd7ca3896022"/>
+    <w:bookmarkEnd w:id="33"/>
+    <w:bookmarkStart w:id="37" w:name="X748caa9d6c5389c1517c1b3b0c0fd7ca3896022"/>
     <w:p>
       <w:pPr>
         <w:pStyle w:val="Heading1"/>
@@ -7049,7 +7508,7 @@
       <w:pPr>
         <w:pStyle w:val="BodyText"/>
       </w:pPr>
-      <w:bookmarkStart w:id="30" w:name="eq-hi"/>
+      <w:bookmarkStart w:id="34" w:name="eq-hi"/>
       <m:oMathPara>
         <m:oMathParaPr>
           <m:jc m:val="center"/>
@@ -7238,7 +7697,7 @@
           </m:d>
         </m:oMath>
       </m:oMathPara>
-      <w:bookmarkEnd w:id="30"/>
+      <w:bookmarkEnd w:id="34"/>
     </w:p>
     <w:p>
       <w:pPr>
@@ -8093,7 +8552,7 @@
       <w:pPr>
         <w:pStyle w:val="BodyText"/>
       </w:pPr>
-      <w:bookmarkStart w:id="31" w:name="eq-tau-eff"/>
+      <w:bookmarkStart w:id="35" w:name="eq-tau-eff"/>
       <m:oMathPara>
         <m:oMathParaPr>
           <m:jc m:val="center"/>
@@ -8262,7 +8721,7 @@
           </m:d>
         </m:oMath>
       </m:oMathPara>
-      <w:bookmarkEnd w:id="31"/>
+      <w:bookmarkEnd w:id="35"/>
     </w:p>
     <w:p>
       <w:pPr>
@@ -8276,7 +8735,7 @@
       <w:pPr>
         <w:pStyle w:val="BodyText"/>
       </w:pPr>
-      <w:bookmarkStart w:id="32" w:name="eq-S-pred"/>
+      <w:bookmarkStart w:id="36" w:name="eq-S-pred"/>
       <m:oMathPara>
         <m:oMathParaPr>
           <m:jc m:val="center"/>
@@ -8417,7 +8876,7 @@
           </m:d>
         </m:oMath>
       </m:oMathPara>
-      <w:bookmarkEnd w:id="32"/>
+      <w:bookmarkEnd w:id="36"/>
     </w:p>
     <w:p>
       <w:pPr>
@@ -8577,8 +9036,1950 @@
         <w:t xml:space="preserve">.</w:t>
       </w:r>
     </w:p>
-    <w:bookmarkEnd w:id="33"/>
-    <w:bookmarkStart w:id="37" w:name="Xabbe56c6b0f09d0a23600010df7f295a0cf446d"/>
+    <w:bookmarkEnd w:id="37"/>
+    <w:bookmarkStart w:id="47" w:name="simulations"/>
+    <w:p>
+      <w:pPr>
+        <w:pStyle w:val="Heading1"/>
+      </w:pPr>
+      <w:r>
+        <w:t xml:space="preserve">Simulations</w:t>
+      </w:r>
+    </w:p>
+    <w:p>
+      <w:pPr>
+        <w:pStyle w:val="FirstParagraph"/>
+      </w:pPr>
+      <w:r>
+        <w:t xml:space="preserve">We assessed the performance of the 4PL and two-stage approaches by estimating empirical bias and 95% interval coverage for</w:t>
+      </w:r>
+      <w:r>
+        <w:t xml:space="preserve"> </w:t>
+      </w:r>
+      <w:r>
+        <w:rPr>
+          <w:i/>
+          <w:iCs/>
+        </w:rPr>
+        <w:t xml:space="preserve">z</w:t>
+      </w:r>
+      <w:r>
+        <w:t xml:space="preserve"> </w:t>
+      </w:r>
+      <w:r>
+        <w:t xml:space="preserve">and</w:t>
+      </w:r>
+      <w:r>
+        <w:t xml:space="preserve"> </w:t>
+      </w:r>
+      <m:oMath>
+        <m:r>
+          <m:t>C</m:t>
+        </m:r>
+        <m:sSub>
+          <m:e>
+            <m:r>
+              <m:t>T</m:t>
+            </m:r>
+          </m:e>
+          <m:sub>
+            <m:r>
+              <m:t>m</m:t>
+            </m:r>
+            <m:r>
+              <m:t>a</m:t>
+            </m:r>
+            <m:sSub>
+              <m:e>
+                <m:r>
+                  <m:t>x</m:t>
+                </m:r>
+              </m:e>
+              <m:sub>
+                <m:r>
+                  <m:t>1</m:t>
+                </m:r>
+                <m:r>
+                  <m:t>h</m:t>
+                </m:r>
+                <m:r>
+                  <m:t>r</m:t>
+                </m:r>
+              </m:sub>
+            </m:sSub>
+          </m:sub>
+        </m:sSub>
+      </m:oMath>
+      <w:r>
+        <w:t xml:space="preserve"> </w:t>
+      </w:r>
+      <w:r>
+        <w:t xml:space="preserve">across simulation replicates. Bias was calculated as the estimated value minus the true value, whereas coverage was defined as the proportion of intervals containing the true parameter value. The 4PL approach estimated parameter uncertainty directly from the fitted model. In contrast, the two-stage approach required uncertainty to be propagated across both estimation stages, which we did using the Delta method. For the two-stage estimates, we constructed intervals using both normal and</w:t>
+      </w:r>
+      <w:r>
+        <w:t xml:space="preserve"> </w:t>
+      </w:r>
+      <w:r>
+        <w:rPr>
+          <w:i/>
+          <w:iCs/>
+        </w:rPr>
+        <w:t xml:space="preserve">t</w:t>
+      </w:r>
+      <w:r>
+        <w:t xml:space="preserve">-distribution quantiles to evaluate the sensitivity of coverage to different assumptions about sampling uncertainty.</w:t>
+      </w:r>
+    </w:p>
+    <w:p>
+      <w:pPr>
+        <w:pStyle w:val="BodyText"/>
+      </w:pPr>
+      <w:r>
+        <w:t xml:space="preserve">We tested the performance of the two-stage and 4PL approaches across scenarios designed to separate different sources of estimator bias and uncertainty. First, we simulated a strict-equivalence baseline in which survival spanned the full 0–1 range, there was no overdispersion, and only the dose-response midpoint varied with temperature. This scenario tests whether the two approaches recover the same quantities when the assumptions of the classical two-stage model are met. Second, we introduced beta-binomial overdispersion while keeping the same underlying dose-response shape, allowing us to isolate the cost of likelihood misspecification when binomial models are applied to overdispersed count data. Third, we simulated departures from the classical dose-response assumptions by allowing the upper asymptote to decline with temperature, both asymptotes to compress with temperature, or the curve steepness to change with temperature. These scenarios reflect empirical cases in which survival or sublethal responses do not span the full response range, or where the shape of the dose-response curve changes across assay temperatures. Finally, we ran sensitivity analyses that varied the strength of upper-asymptote drift, the overall level of the upper asymptote, and the intensity of the experimental design.</w:t>
+      </w:r>
+    </w:p>
+    <w:p>
+      <w:pPr>
+        <w:pStyle w:val="BodyText"/>
+      </w:pPr>
+      <w:r>
+        <w:t xml:space="preserve">Experimental designs were chosen to span the scale of published TDT/TLS assays, which often estimate response curves from several static temperatures and exposure durations with modest numbers of individuals, samples, or replicate vials per treatment</w:t>
+      </w:r>
+      <w:r>
+        <w:t xml:space="preserve"> </w:t>
+      </w:r>
+      <w:r>
+        <w:t xml:space="preserve">(</w:t>
+      </w:r>
+      <w:hyperlink w:anchor="ref-faber_tdt_plants_2024">
+        <w:r>
+          <w:rPr>
+            <w:rStyle w:val="Hyperlink"/>
+          </w:rPr>
+          <w:t xml:space="preserve">Faber</w:t>
+        </w:r>
+        <w:r>
+          <w:rPr>
+            <w:rStyle w:val="Hyperlink"/>
+          </w:rPr>
+          <w:t xml:space="preserve"> </w:t>
+        </w:r>
+        <w:r>
+          <w:rPr>
+            <w:rStyle w:val="Hyperlink"/>
+            <w:i/>
+            <w:iCs/>
+          </w:rPr>
+          <w:t xml:space="preserve">et al.</w:t>
+        </w:r>
+        <w:r>
+          <w:rPr>
+            <w:rStyle w:val="Hyperlink"/>
+          </w:rPr>
+          <w:t xml:space="preserve"> </w:t>
+        </w:r>
+        <w:r>
+          <w:rPr>
+            <w:rStyle w:val="Hyperlink"/>
+          </w:rPr>
+          <w:t xml:space="preserve">2024</w:t>
+        </w:r>
+      </w:hyperlink>
+      <w:r>
+        <w:t xml:space="preserve">;</w:t>
+      </w:r>
+      <w:r>
+        <w:t xml:space="preserve"> </w:t>
+      </w:r>
+      <w:hyperlink w:anchor="ref-jorgensen_drosophila_2019">
+        <w:r>
+          <w:rPr>
+            <w:rStyle w:val="Hyperlink"/>
+          </w:rPr>
+          <w:t xml:space="preserve">Jørgensen</w:t>
+        </w:r>
+        <w:r>
+          <w:rPr>
+            <w:rStyle w:val="Hyperlink"/>
+          </w:rPr>
+          <w:t xml:space="preserve"> </w:t>
+        </w:r>
+        <w:r>
+          <w:rPr>
+            <w:rStyle w:val="Hyperlink"/>
+            <w:i/>
+            <w:iCs/>
+          </w:rPr>
+          <w:t xml:space="preserve">et al.</w:t>
+        </w:r>
+        <w:r>
+          <w:rPr>
+            <w:rStyle w:val="Hyperlink"/>
+          </w:rPr>
+          <w:t xml:space="preserve"> </w:t>
+        </w:r>
+        <w:r>
+          <w:rPr>
+            <w:rStyle w:val="Hyperlink"/>
+          </w:rPr>
+          <w:t xml:space="preserve">2019</w:t>
+        </w:r>
+      </w:hyperlink>
+      <w:r>
+        <w:t xml:space="preserve">;</w:t>
+      </w:r>
+      <w:r>
+        <w:t xml:space="preserve"> </w:t>
+      </w:r>
+      <w:hyperlink w:anchor="ref-li2023">
+        <w:r>
+          <w:rPr>
+            <w:rStyle w:val="Hyperlink"/>
+          </w:rPr>
+          <w:t xml:space="preserve">Li</w:t>
+        </w:r>
+        <w:r>
+          <w:rPr>
+            <w:rStyle w:val="Hyperlink"/>
+          </w:rPr>
+          <w:t xml:space="preserve"> </w:t>
+        </w:r>
+        <w:r>
+          <w:rPr>
+            <w:rStyle w:val="Hyperlink"/>
+            <w:i/>
+            <w:iCs/>
+          </w:rPr>
+          <w:t xml:space="preserve">et al.</w:t>
+        </w:r>
+        <w:r>
+          <w:rPr>
+            <w:rStyle w:val="Hyperlink"/>
+          </w:rPr>
+          <w:t xml:space="preserve"> </w:t>
+        </w:r>
+        <w:r>
+          <w:rPr>
+            <w:rStyle w:val="Hyperlink"/>
+          </w:rPr>
+          <w:t xml:space="preserve">2023</w:t>
+        </w:r>
+      </w:hyperlink>
+      <w:r>
+        <w:t xml:space="preserve">;</w:t>
+      </w:r>
+      <w:r>
+        <w:t xml:space="preserve"> </w:t>
+      </w:r>
+      <w:hyperlink w:anchor="ref-orsted_suzukii_2024">
+        <w:r>
+          <w:rPr>
+            <w:rStyle w:val="Hyperlink"/>
+          </w:rPr>
+          <w:t xml:space="preserve">Ørsted</w:t>
+        </w:r>
+        <w:r>
+          <w:rPr>
+            <w:rStyle w:val="Hyperlink"/>
+          </w:rPr>
+          <w:t xml:space="preserve"> </w:t>
+        </w:r>
+        <w:r>
+          <w:rPr>
+            <w:rStyle w:val="Hyperlink"/>
+            <w:i/>
+            <w:iCs/>
+          </w:rPr>
+          <w:t xml:space="preserve">et al.</w:t>
+        </w:r>
+        <w:r>
+          <w:rPr>
+            <w:rStyle w:val="Hyperlink"/>
+          </w:rPr>
+          <w:t xml:space="preserve"> </w:t>
+        </w:r>
+        <w:r>
+          <w:rPr>
+            <w:rStyle w:val="Hyperlink"/>
+          </w:rPr>
+          <w:t xml:space="preserve">2024</w:t>
+        </w:r>
+      </w:hyperlink>
+      <w:r>
+        <w:t xml:space="preserve">;</w:t>
+      </w:r>
+      <w:r>
+        <w:t xml:space="preserve"> </w:t>
+      </w:r>
+      <w:hyperlink w:anchor="ref-truebano2018">
+        <w:r>
+          <w:rPr>
+            <w:rStyle w:val="Hyperlink"/>
+          </w:rPr>
+          <w:t xml:space="preserve">Truebano</w:t>
+        </w:r>
+        <w:r>
+          <w:rPr>
+            <w:rStyle w:val="Hyperlink"/>
+          </w:rPr>
+          <w:t xml:space="preserve"> </w:t>
+        </w:r>
+        <w:r>
+          <w:rPr>
+            <w:rStyle w:val="Hyperlink"/>
+            <w:i/>
+            <w:iCs/>
+          </w:rPr>
+          <w:t xml:space="preserve">et al.</w:t>
+        </w:r>
+        <w:r>
+          <w:rPr>
+            <w:rStyle w:val="Hyperlink"/>
+          </w:rPr>
+          <w:t xml:space="preserve"> </w:t>
+        </w:r>
+        <w:r>
+          <w:rPr>
+            <w:rStyle w:val="Hyperlink"/>
+          </w:rPr>
+          <w:t xml:space="preserve">2018</w:t>
+        </w:r>
+      </w:hyperlink>
+      <w:r>
+        <w:t xml:space="preserve">)</w:t>
+      </w:r>
+      <w:r>
+        <w:t xml:space="preserve">. In the simulations, designs included one to five replicate cups per temperature-by-time treatment, with 10 to 20 organisms per cup sampled from a uniform distribution. For each scenario-by-design combination, we simulated 1,000 datasets and fit both the two-stage and 4PL approaches. Overall, we ran 25,000 simulations and were limited to 1000 simulations per run. We report Monte Carlo standard errors (MCSE) for the bias and coverage summaries to better understand across simulation uncertainty</w:t>
+      </w:r>
+      <w:r>
+        <w:t xml:space="preserve"> </w:t>
+      </w:r>
+      <w:r>
+        <w:t xml:space="preserve">(</w:t>
+      </w:r>
+      <w:hyperlink w:anchor="ref-direnzo2023">
+        <w:r>
+          <w:rPr>
+            <w:rStyle w:val="Hyperlink"/>
+          </w:rPr>
+          <w:t xml:space="preserve">DiRenzo</w:t>
+        </w:r>
+        <w:r>
+          <w:rPr>
+            <w:rStyle w:val="Hyperlink"/>
+          </w:rPr>
+          <w:t xml:space="preserve"> </w:t>
+        </w:r>
+        <w:r>
+          <w:rPr>
+            <w:rStyle w:val="Hyperlink"/>
+            <w:i/>
+            <w:iCs/>
+          </w:rPr>
+          <w:t xml:space="preserve">et al.</w:t>
+        </w:r>
+        <w:r>
+          <w:rPr>
+            <w:rStyle w:val="Hyperlink"/>
+          </w:rPr>
+          <w:t xml:space="preserve"> </w:t>
+        </w:r>
+        <w:r>
+          <w:rPr>
+            <w:rStyle w:val="Hyperlink"/>
+          </w:rPr>
+          <w:t xml:space="preserve">2023</w:t>
+        </w:r>
+      </w:hyperlink>
+      <w:r>
+        <w:t xml:space="preserve">;</w:t>
+      </w:r>
+      <w:r>
+        <w:t xml:space="preserve"> </w:t>
+      </w:r>
+      <w:hyperlink w:anchor="ref-koehler2009">
+        <w:r>
+          <w:rPr>
+            <w:rStyle w:val="Hyperlink"/>
+          </w:rPr>
+          <w:t xml:space="preserve">Koehler</w:t>
+        </w:r>
+        <w:r>
+          <w:rPr>
+            <w:rStyle w:val="Hyperlink"/>
+          </w:rPr>
+          <w:t xml:space="preserve"> </w:t>
+        </w:r>
+        <w:r>
+          <w:rPr>
+            <w:rStyle w:val="Hyperlink"/>
+            <w:i/>
+            <w:iCs/>
+          </w:rPr>
+          <w:t xml:space="preserve">et al.</w:t>
+        </w:r>
+        <w:r>
+          <w:rPr>
+            <w:rStyle w:val="Hyperlink"/>
+          </w:rPr>
+          <w:t xml:space="preserve"> </w:t>
+        </w:r>
+        <w:r>
+          <w:rPr>
+            <w:rStyle w:val="Hyperlink"/>
+          </w:rPr>
+          <w:t xml:space="preserve">2009</w:t>
+        </w:r>
+      </w:hyperlink>
+      <w:r>
+        <w:t xml:space="preserve">;</w:t>
+      </w:r>
+      <w:r>
+        <w:t xml:space="preserve"> </w:t>
+      </w:r>
+      <w:hyperlink w:anchor="ref-williams2024">
+        <w:r>
+          <w:rPr>
+            <w:rStyle w:val="Hyperlink"/>
+          </w:rPr>
+          <w:t xml:space="preserve">Williams</w:t>
+        </w:r>
+        <w:r>
+          <w:rPr>
+            <w:rStyle w:val="Hyperlink"/>
+          </w:rPr>
+          <w:t xml:space="preserve"> </w:t>
+        </w:r>
+        <w:r>
+          <w:rPr>
+            <w:rStyle w:val="Hyperlink"/>
+            <w:i/>
+            <w:iCs/>
+          </w:rPr>
+          <w:t xml:space="preserve">et al.</w:t>
+        </w:r>
+        <w:r>
+          <w:rPr>
+            <w:rStyle w:val="Hyperlink"/>
+          </w:rPr>
+          <w:t xml:space="preserve"> </w:t>
+        </w:r>
+        <w:r>
+          <w:rPr>
+            <w:rStyle w:val="Hyperlink"/>
+          </w:rPr>
+          <w:t xml:space="preserve">2024</w:t>
+        </w:r>
+      </w:hyperlink>
+      <w:r>
+        <w:t xml:space="preserve">)</w:t>
+      </w:r>
+      <w:r>
+        <w:t xml:space="preserve">.</w:t>
+      </w:r>
+    </w:p>
+    <w:bookmarkStart w:id="46" w:name="simulation-results"/>
+    <w:p>
+      <w:pPr>
+        <w:pStyle w:val="Heading4"/>
+      </w:pPr>
+      <w:r>
+        <w:rPr>
+          <w:i/>
+          <w:iCs/>
+        </w:rPr>
+        <w:t xml:space="preserve">Simulation results</w:t>
+      </w:r>
+    </w:p>
+    <w:p>
+      <w:pPr>
+        <w:pStyle w:val="FirstParagraph"/>
+      </w:pPr>
+      <w:r>
+        <w:t xml:space="preserve">When the data-generating process matched the classical assumptions, with survival spanning the full 0-1 range and temperature affecting only the dose-response midpoint, the two-stage approach performed similarly to the joint 4PL model, producing little bias and near-nominal coverage when confidence intervals were constructed with t-distribution quantiles. This distinction was important: using normal (z) quantiles instead produced anti-conservative intervals with coverage well below the nominal 95% level (see Supplement).</w:t>
+      </w:r>
+    </w:p>
+    <w:p>
+      <w:pPr>
+        <w:pStyle w:val="BodyText"/>
+      </w:pPr>
+      <w:r>
+        <w:t xml:space="preserve">In contrast, the two-stage approach resulted in biased</w:t>
+      </w:r>
+      <w:r>
+        <w:t xml:space="preserve"> </w:t>
+      </w:r>
+      <w:r>
+        <w:rPr>
+          <w:i/>
+          <w:iCs/>
+        </w:rPr>
+        <w:t xml:space="preserve">z</w:t>
+      </w:r>
+      <w:r>
+        <w:t xml:space="preserve"> </w:t>
+      </w:r>
+      <w:r>
+        <w:t xml:space="preserve">and</w:t>
+      </w:r>
+      <w:r>
+        <w:t xml:space="preserve"> </w:t>
+      </w:r>
+      <m:oMath>
+        <m:r>
+          <m:t>C</m:t>
+        </m:r>
+        <m:sSub>
+          <m:e>
+            <m:r>
+              <m:t>T</m:t>
+            </m:r>
+          </m:e>
+          <m:sub>
+            <m:r>
+              <m:t>m</m:t>
+            </m:r>
+            <m:r>
+              <m:t>a</m:t>
+            </m:r>
+            <m:sSub>
+              <m:e>
+                <m:r>
+                  <m:t>x</m:t>
+                </m:r>
+              </m:e>
+              <m:sub>
+                <m:r>
+                  <m:t>1</m:t>
+                </m:r>
+                <m:r>
+                  <m:t>h</m:t>
+                </m:r>
+                <m:r>
+                  <m:t>r</m:t>
+                </m:r>
+              </m:sub>
+            </m:sSub>
+          </m:sub>
+        </m:sSub>
+      </m:oMath>
+      <w:r>
+        <w:t xml:space="preserve">, often with poor coverage, when temperature impacted upper thresholds (up) and rate of decline (k) (</w:t>
+      </w:r>
+      <w:hyperlink w:anchor="fig-sims">
+        <w:r>
+          <w:rPr>
+            <w:rStyle w:val="Hyperlink"/>
+          </w:rPr>
+          <w:t xml:space="preserve">Figure 2</w:t>
+        </w:r>
+      </w:hyperlink>
+      <w:r>
+        <w:t xml:space="preserve">). These biases were consistent with larger sample sizes (</w:t>
+      </w:r>
+      <w:hyperlink w:anchor="fig-sims">
+        <w:r>
+          <w:rPr>
+            <w:rStyle w:val="Hyperlink"/>
+          </w:rPr>
+          <w:t xml:space="preserve">Figure 2</w:t>
+        </w:r>
+      </w:hyperlink>
+      <w:r>
+        <w:t xml:space="preserve">). Bias for both</w:t>
+      </w:r>
+      <w:r>
+        <w:t xml:space="preserve"> </w:t>
+      </w:r>
+      <w:r>
+        <w:rPr>
+          <w:i/>
+          <w:iCs/>
+        </w:rPr>
+        <w:t xml:space="preserve">z</w:t>
+      </w:r>
+      <w:r>
+        <w:t xml:space="preserve"> </w:t>
+      </w:r>
+      <w:r>
+        <w:t xml:space="preserve">and</w:t>
+      </w:r>
+      <w:r>
+        <w:t xml:space="preserve"> </w:t>
+      </w:r>
+      <m:oMath>
+        <m:r>
+          <m:t>C</m:t>
+        </m:r>
+        <m:sSub>
+          <m:e>
+            <m:r>
+              <m:t>T</m:t>
+            </m:r>
+          </m:e>
+          <m:sub>
+            <m:r>
+              <m:t>m</m:t>
+            </m:r>
+            <m:r>
+              <m:t>a</m:t>
+            </m:r>
+            <m:sSub>
+              <m:e>
+                <m:r>
+                  <m:t>x</m:t>
+                </m:r>
+              </m:e>
+              <m:sub>
+                <m:r>
+                  <m:t>1</m:t>
+                </m:r>
+                <m:r>
+                  <m:t>h</m:t>
+                </m:r>
+                <m:r>
+                  <m:t>r</m:t>
+                </m:r>
+              </m:sub>
+            </m:sSub>
+          </m:sub>
+        </m:sSub>
+      </m:oMath>
+      <w:r>
+        <w:t xml:space="preserve"> </w:t>
+      </w:r>
+      <w:r>
+        <w:t xml:space="preserve">from the two-stage approaches were particularly severe as the upper survival threshold decreased (see Supplement). Overall, these results confirm that any model misspecfication requires the 4PL to properly recover true</w:t>
+      </w:r>
+      <w:r>
+        <w:t xml:space="preserve"> </w:t>
+      </w:r>
+      <w:r>
+        <w:rPr>
+          <w:i/>
+          <w:iCs/>
+        </w:rPr>
+        <w:t xml:space="preserve">z</w:t>
+      </w:r>
+      <w:r>
+        <w:t xml:space="preserve"> </w:t>
+      </w:r>
+      <w:r>
+        <w:t xml:space="preserve">and</w:t>
+      </w:r>
+      <w:r>
+        <w:t xml:space="preserve"> </w:t>
+      </w:r>
+      <m:oMath>
+        <m:r>
+          <m:t>C</m:t>
+        </m:r>
+        <m:sSub>
+          <m:e>
+            <m:r>
+              <m:t>T</m:t>
+            </m:r>
+          </m:e>
+          <m:sub>
+            <m:r>
+              <m:t>m</m:t>
+            </m:r>
+            <m:r>
+              <m:t>a</m:t>
+            </m:r>
+            <m:r>
+              <m:t>x</m:t>
+            </m:r>
+          </m:sub>
+        </m:sSub>
+      </m:oMath>
+      <w:r>
+        <w:t xml:space="preserve">, with correct uncertainty.</w:t>
+      </w:r>
+    </w:p>
+    <w:tbl>
+      <w:tblPr>
+        <w:tblStyle w:val="Table"/>
+        <w:tblW w:type="pct" w:w="5000"/>
+        <w:tblLayout w:type="fixed"/>
+        <w:tblLook w:firstRow="0" w:lastRow="0" w:firstColumn="0" w:lastColumn="0" w:noHBand="0" w:noVBand="0" w:val="0000"/>
+      </w:tblPr>
+      <w:tblGrid>
+        <w:gridCol w:w="7920"/>
+      </w:tblGrid>
+      <w:tr>
+        <w:tc>
+          <w:tcPr/>
+          <w:bookmarkStart w:id="41" w:name="fig-sims"/>
+          <w:p>
+            <w:pPr>
+              <w:pStyle w:val="Compact"/>
+              <w:jc w:val="center"/>
+            </w:pPr>
+            <w:r>
+              <w:drawing>
+                <wp:inline>
+                  <wp:extent cx="5943600" cy="4292600"/>
+                  <wp:effectExtent b="0" l="0" r="0" t="0"/>
+                  <wp:docPr descr="" title="" id="39" name="Picture"/>
+                  <a:graphic>
+                    <a:graphicData uri="http://schemas.openxmlformats.org/drawingml/2006/picture">
+                      <pic:pic>
+                        <pic:nvPicPr>
+                          <pic:cNvPr descr="ms_files/figure-docx/fig-sims-1.png" id="40" name="Picture"/>
+                          <pic:cNvPicPr>
+                            <a:picLocks noChangeArrowheads="1" noChangeAspect="1"/>
+                          </pic:cNvPicPr>
+                        </pic:nvPicPr>
+                        <pic:blipFill>
+                          <a:blip r:embed="rId38"/>
+                          <a:stretch>
+                            <a:fillRect/>
+                          </a:stretch>
+                        </pic:blipFill>
+                        <pic:spPr bwMode="auto">
+                          <a:xfrm>
+                            <a:off x="0" y="0"/>
+                            <a:ext cx="5943600" cy="4292600"/>
+                          </a:xfrm>
+                          <a:prstGeom prst="rect">
+                            <a:avLst/>
+                          </a:prstGeom>
+                          <a:noFill/>
+                          <a:ln w="9525">
+                            <a:noFill/>
+                            <a:headEnd/>
+                            <a:tailEnd/>
+                          </a:ln>
+                        </pic:spPr>
+                      </pic:pic>
+                    </a:graphicData>
+                  </a:graphic>
+                </wp:inline>
+              </w:drawing>
+            </w:r>
+          </w:p>
+          <w:p>
+            <w:pPr>
+              <w:jc w:val="center"/>
+            </w:pPr>
+            <w:pPr>
+              <w:jc w:val="start"/>
+              <w:spacing w:before="200"/>
+              <w:pStyle w:val="ImageCaption"/>
+            </w:pPr>
+            <w:r>
+              <w:t xml:space="preserve">Figure 2: Simulation performance when the data-generating process violates classical TDT shape assumptions. Row labelled</w:t>
+            </w:r>
+            <w:r>
+              <w:t xml:space="preserve"> </w:t>
+            </w:r>
+            <w:r>
+              <w:rPr>
+                <w:b/>
+                <w:bCs/>
+              </w:rPr>
+              <w:t xml:space="preserve">‘u varies with T’</w:t>
+            </w:r>
+            <w:r>
+              <w:t xml:space="preserve">: upper asymptote</w:t>
+            </w:r>
+            <w:r>
+              <w:t xml:space="preserve"> </w:t>
+            </w:r>
+            <m:oMath>
+              <m:r>
+                <m:t>u</m:t>
+              </m:r>
+            </m:oMath>
+            <w:r>
+              <w:t xml:space="preserve"> </w:t>
+            </w:r>
+            <w:r>
+              <w:t xml:space="preserve">declines 0.01 per °C from 0.92 at</w:t>
+            </w:r>
+            <w:r>
+              <w:t xml:space="preserve"> </w:t>
+            </w:r>
+            <m:oMath>
+              <m:r>
+                <m:t>T</m:t>
+              </m:r>
+              <m:r>
+                <m:rPr>
+                  <m:sty m:val="p"/>
+                </m:rPr>
+                <m:t>=</m:t>
+              </m:r>
+              <m:r>
+                <m:t>34</m:t>
+              </m:r>
+            </m:oMath>
+            <w:r>
+              <w:t xml:space="preserve"> </w:t>
+            </w:r>
+            <w:r>
+              <w:t xml:space="preserve">°C, with</w:t>
+            </w:r>
+            <w:r>
+              <w:t xml:space="preserve"> </w:t>
+            </w:r>
+            <m:oMath>
+              <m:r>
+                <m:rPr>
+                  <m:nor/>
+                  <m:sty m:val="p"/>
+                </m:rPr>
+                <m:t>low</m:t>
+              </m:r>
+              <m:r>
+                <m:rPr>
+                  <m:sty m:val="p"/>
+                </m:rPr>
+                <m:t>=</m:t>
+              </m:r>
+              <m:r>
+                <m:t>0.05</m:t>
+              </m:r>
+            </m:oMath>
+            <w:r>
+              <w:t xml:space="preserve"> </w:t>
+            </w:r>
+            <w:r>
+              <w:t xml:space="preserve">and</w:t>
+            </w:r>
+            <w:r>
+              <w:t xml:space="preserve"> </w:t>
+            </w:r>
+            <m:oMath>
+              <m:r>
+                <m:t>k</m:t>
+              </m:r>
+              <m:r>
+                <m:rPr>
+                  <m:sty m:val="p"/>
+                </m:rPr>
+                <m:t>=</m:t>
+              </m:r>
+              <m:r>
+                <m:t>8</m:t>
+              </m:r>
+            </m:oMath>
+            <w:r>
+              <w:t xml:space="preserve"> </w:t>
+            </w:r>
+            <w:r>
+              <w:t xml:space="preserve">constant in</w:t>
+            </w:r>
+            <w:r>
+              <w:t xml:space="preserve"> </w:t>
+            </w:r>
+            <m:oMath>
+              <m:r>
+                <m:t>T</m:t>
+              </m:r>
+            </m:oMath>
+            <w:r>
+              <w:t xml:space="preserve">. Row labelled</w:t>
+            </w:r>
+            <w:r>
+              <w:t xml:space="preserve"> </w:t>
+            </w:r>
+            <w:r>
+              <w:rPr>
+                <w:b/>
+                <w:bCs/>
+              </w:rPr>
+              <w:t xml:space="preserve">‘k varies with T’</w:t>
+            </w:r>
+            <w:r>
+              <w:t xml:space="preserve">: slope</w:t>
+            </w:r>
+            <w:r>
+              <w:t xml:space="preserve"> </w:t>
+            </w:r>
+            <m:oMath>
+              <m:r>
+                <m:t>k</m:t>
+              </m:r>
+            </m:oMath>
+            <w:r>
+              <w:t xml:space="preserve"> </w:t>
+            </w:r>
+            <w:r>
+              <w:t xml:space="preserve">ranges from 6 at 30 °C to 10 at 38 °C, with</w:t>
+            </w:r>
+            <w:r>
+              <w:t xml:space="preserve"> </w:t>
+            </w:r>
+            <m:oMath>
+              <m:r>
+                <m:t>u</m:t>
+              </m:r>
+              <m:r>
+                <m:rPr>
+                  <m:sty m:val="p"/>
+                </m:rPr>
+                <m:t>=</m:t>
+              </m:r>
+              <m:r>
+                <m:t>0.92</m:t>
+              </m:r>
+            </m:oMath>
+            <w:r>
+              <w:t xml:space="preserve"> </w:t>
+            </w:r>
+            <w:r>
+              <w:t xml:space="preserve">and</w:t>
+            </w:r>
+            <w:r>
+              <w:t xml:space="preserve"> </w:t>
+            </w:r>
+            <m:oMath>
+              <m:r>
+                <m:rPr>
+                  <m:nor/>
+                  <m:sty m:val="p"/>
+                </m:rPr>
+                <m:t>low</m:t>
+              </m:r>
+              <m:r>
+                <m:rPr>
+                  <m:sty m:val="p"/>
+                </m:rPr>
+                <m:t>=</m:t>
+              </m:r>
+              <m:r>
+                <m:t>0.05</m:t>
+              </m:r>
+            </m:oMath>
+            <w:r>
+              <w:t xml:space="preserve"> </w:t>
+            </w:r>
+            <w:r>
+              <w:t xml:space="preserve">constant. Both rows use 5 replicate cups per (T × duration) cell,</w:t>
+            </w:r>
+            <w:r>
+              <w:t xml:space="preserve"> </w:t>
+            </w:r>
+            <m:oMath>
+              <m:sSub>
+                <m:e>
+                  <m:r>
+                    <m:t>N</m:t>
+                  </m:r>
+                </m:e>
+                <m:sub>
+                  <m:r>
+                    <m:t>s</m:t>
+                  </m:r>
+                  <m:r>
+                    <m:t>i</m:t>
+                  </m:r>
+                  <m:r>
+                    <m:t>m</m:t>
+                  </m:r>
+                </m:sub>
+              </m:sSub>
+              <m:r>
+                <m:rPr>
+                  <m:sty m:val="p"/>
+                </m:rPr>
+                <m:t>=</m:t>
+              </m:r>
+              <m:r>
+                <m:t>1000</m:t>
+              </m:r>
+            </m:oMath>
+            <w:r>
+              <w:t xml:space="preserve"> </w:t>
+            </w:r>
+            <w:r>
+              <w:t xml:space="preserve">simulated datasets per row, and beta-binomial overdispersion (</w:t>
+            </w:r>
+            <m:oMath>
+              <m:r>
+                <m:t>ϕ</m:t>
+              </m:r>
+              <m:r>
+                <m:rPr>
+                  <m:sty m:val="p"/>
+                </m:rPr>
+                <m:t>=</m:t>
+              </m:r>
+              <m:r>
+                <m:t>5</m:t>
+              </m:r>
+            </m:oMath>
+            <w:r>
+              <w:t xml:space="preserve">). Panel (a): mean signed bias in</w:t>
+            </w:r>
+            <w:r>
+              <w:t xml:space="preserve"> </w:t>
+            </w:r>
+            <m:oMath>
+              <m:r>
+                <m:t>z</m:t>
+              </m:r>
+            </m:oMath>
+            <w:r>
+              <w:t xml:space="preserve"> </w:t>
+            </w:r>
+            <w:r>
+              <w:t xml:space="preserve">(left column) and</w:t>
+            </w:r>
+            <w:r>
+              <w:t xml:space="preserve"> </w:t>
+            </w:r>
+            <m:oMath>
+              <m:r>
+                <m:t>C</m:t>
+              </m:r>
+              <m:sSub>
+                <m:e>
+                  <m:r>
+                    <m:t>T</m:t>
+                  </m:r>
+                </m:e>
+                <m:sub>
+                  <m:r>
+                    <m:t>m</m:t>
+                  </m:r>
+                  <m:r>
+                    <m:t>a</m:t>
+                  </m:r>
+                  <m:r>
+                    <m:t>x</m:t>
+                  </m:r>
+                  <m:r>
+                    <m:rPr>
+                      <m:sty m:val="p"/>
+                    </m:rPr>
+                    <m:t>,</m:t>
+                  </m:r>
+                  <m:r>
+                    <m:t>1</m:t>
+                  </m:r>
+                  <m:r>
+                    <m:t>h</m:t>
+                  </m:r>
+                </m:sub>
+              </m:sSub>
+            </m:oMath>
+            <w:r>
+              <w:t xml:space="preserve"> </w:t>
+            </w:r>
+            <w:r>
+              <w:t xml:space="preserve">(right column) with 95% Monte Carlo SE bars. Panel (b): empirical 95% interval coverage with the same column layout. Dashed lines mark zero bias and nominal coverage. Absolute-scale methods (</w:t>
+            </w:r>
+            <w:r>
+              <w:rPr>
+                <w:rStyle w:val="VerbatimChar"/>
+              </w:rPr>
+              <w:t xml:space="preserve">joint_4pl_abs</w:t>
+            </w:r>
+            <w:r>
+              <w:t xml:space="preserve"> </w:t>
+            </w:r>
+            <w:r>
+              <w:t xml:space="preserve">and all two-stage variants) are evaluated against the analytical absolute-50% truth;</w:t>
+            </w:r>
+            <w:r>
+              <w:t xml:space="preserve"> </w:t>
+            </w:r>
+            <w:r>
+              <w:rPr>
+                <w:rStyle w:val="VerbatimChar"/>
+              </w:rPr>
+              <w:t xml:space="preserve">joint_4pl</w:t>
+            </w:r>
+            <w:r>
+              <w:t xml:space="preserve"> </w:t>
+            </w:r>
+            <w:r>
+              <w:t xml:space="preserve">is evaluated against the relative midpoint truth. Two-stage normal- and t-quantile variants share point estimates and differ only in Stage-2 delta-method interval construction.</w:t>
+            </w:r>
+          </w:p>
+          <w:bookmarkEnd w:id="41"/>
+        </w:tc>
+      </w:tr>
+    </w:tbl>
+    <w:tbl>
+      <w:tblPr>
+        <w:tblStyle w:val="Table"/>
+        <w:tblW w:type="pct" w:w="5000"/>
+        <w:tblLayout w:type="fixed"/>
+        <w:tblLook w:firstRow="0" w:lastRow="0" w:firstColumn="0" w:lastColumn="0" w:noHBand="0" w:noVBand="0" w:val="0000"/>
+      </w:tblPr>
+      <w:tblGrid>
+        <w:gridCol w:w="7920"/>
+      </w:tblGrid>
+      <w:tr>
+        <w:tc>
+          <w:tcPr/>
+          <w:bookmarkStart w:id="45" w:name="fig-sims2"/>
+          <w:p>
+            <w:pPr>
+              <w:pStyle w:val="Compact"/>
+              <w:jc w:val="center"/>
+            </w:pPr>
+            <w:r>
+              <w:drawing>
+                <wp:inline>
+                  <wp:extent cx="5943600" cy="4622800"/>
+                  <wp:effectExtent b="0" l="0" r="0" t="0"/>
+                  <wp:docPr descr="" title="" id="43" name="Picture"/>
+                  <a:graphic>
+                    <a:graphicData uri="http://schemas.openxmlformats.org/drawingml/2006/picture">
+                      <pic:pic>
+                        <pic:nvPicPr>
+                          <pic:cNvPr descr="ms_files/figure-docx/fig-sims2-1.png" id="44" name="Picture"/>
+                          <pic:cNvPicPr>
+                            <a:picLocks noChangeArrowheads="1" noChangeAspect="1"/>
+                          </pic:cNvPicPr>
+                        </pic:nvPicPr>
+                        <pic:blipFill>
+                          <a:blip r:embed="rId42"/>
+                          <a:stretch>
+                            <a:fillRect/>
+                          </a:stretch>
+                        </pic:blipFill>
+                        <pic:spPr bwMode="auto">
+                          <a:xfrm>
+                            <a:off x="0" y="0"/>
+                            <a:ext cx="5943600" cy="4622800"/>
+                          </a:xfrm>
+                          <a:prstGeom prst="rect">
+                            <a:avLst/>
+                          </a:prstGeom>
+                          <a:noFill/>
+                          <a:ln w="9525">
+                            <a:noFill/>
+                            <a:headEnd/>
+                            <a:tailEnd/>
+                          </a:ln>
+                        </pic:spPr>
+                      </pic:pic>
+                    </a:graphicData>
+                  </a:graphic>
+                </wp:inline>
+              </w:drawing>
+            </w:r>
+          </w:p>
+          <w:p>
+            <w:pPr>
+              <w:jc w:val="center"/>
+            </w:pPr>
+            <w:pPr>
+              <w:jc w:val="start"/>
+              <w:spacing w:before="200"/>
+              <w:pStyle w:val="ImageCaption"/>
+            </w:pPr>
+            <w:r>
+              <w:t xml:space="preserve">Figure 3: Bias in</w:t>
+            </w:r>
+            <w:r>
+              <w:t xml:space="preserve"> </w:t>
+            </w:r>
+            <m:oMath>
+              <m:r>
+                <m:t>z</m:t>
+              </m:r>
+            </m:oMath>
+            <w:r>
+              <w:t xml:space="preserve"> </w:t>
+            </w:r>
+            <w:r>
+              <w:t xml:space="preserve">and</w:t>
+            </w:r>
+            <w:r>
+              <w:t xml:space="preserve"> </w:t>
+            </w:r>
+            <m:oMath>
+              <m:r>
+                <m:t>C</m:t>
+              </m:r>
+              <m:sSub>
+                <m:e>
+                  <m:r>
+                    <m:t>T</m:t>
+                  </m:r>
+                </m:e>
+                <m:sub>
+                  <m:r>
+                    <m:t>m</m:t>
+                  </m:r>
+                  <m:r>
+                    <m:t>a</m:t>
+                  </m:r>
+                  <m:r>
+                    <m:t>x</m:t>
+                  </m:r>
+                  <m:r>
+                    <m:rPr>
+                      <m:sty m:val="p"/>
+                    </m:rPr>
+                    <m:t>,</m:t>
+                  </m:r>
+                  <m:r>
+                    <m:t>1</m:t>
+                  </m:r>
+                  <m:r>
+                    <m:t>h</m:t>
+                  </m:r>
+                </m:sub>
+              </m:sSub>
+            </m:oMath>
+            <w:r>
+              <w:t xml:space="preserve"> </w:t>
+            </w:r>
+            <w:r>
+              <w:t xml:space="preserve">as the partial-mortality regime is swept along two orthogonal axes. Row labelled</w:t>
+            </w:r>
+            <w:r>
+              <w:t xml:space="preserve"> </w:t>
+            </w:r>
+            <w:r>
+              <w:rPr>
+                <w:b/>
+                <w:bCs/>
+              </w:rPr>
+              <w:t xml:space="preserve">‘u drifts with T (varying</w:t>
+            </w:r>
+            <w:r>
+              <w:rPr>
+                <w:b/>
+                <w:bCs/>
+              </w:rPr>
+              <w:t xml:space="preserve"> </w:t>
+            </w:r>
+            <m:oMath>
+              <m:sSub>
+                <m:e>
+                  <m:r>
+                    <m:t>β</m:t>
+                  </m:r>
+                </m:e>
+                <m:sub>
+                  <m:r>
+                    <m:t>u</m:t>
+                  </m:r>
+                </m:sub>
+              </m:sSub>
+            </m:oMath>
+            <w:r>
+              <w:rPr>
+                <w:b/>
+                <w:bCs/>
+              </w:rPr>
+              <w:t xml:space="preserve">)’</w:t>
+            </w:r>
+            <w:r>
+              <w:t xml:space="preserve">: upper asymptote at</w:t>
+            </w:r>
+            <w:r>
+              <w:t xml:space="preserve"> </w:t>
+            </w:r>
+            <m:oMath>
+              <m:r>
+                <m:t>T</m:t>
+              </m:r>
+              <m:r>
+                <m:rPr>
+                  <m:sty m:val="p"/>
+                </m:rPr>
+                <m:t>=</m:t>
+              </m:r>
+              <m:acc>
+                <m:accPr>
+                  <m:chr m:val="‾"/>
+                </m:accPr>
+                <m:e>
+                  <m:r>
+                    <m:t>T</m:t>
+                  </m:r>
+                </m:e>
+              </m:acc>
+            </m:oMath>
+            <w:r>
+              <w:t xml:space="preserve"> </w:t>
+            </w:r>
+            <w:r>
+              <w:t xml:space="preserve">fixed at</w:t>
+            </w:r>
+            <w:r>
+              <w:t xml:space="preserve"> </w:t>
+            </w:r>
+            <m:oMath>
+              <m:sSub>
+                <m:e>
+                  <m:r>
+                    <m:t>u</m:t>
+                  </m:r>
+                </m:e>
+                <m:sub>
+                  <m:r>
+                    <m:t>0</m:t>
+                  </m:r>
+                </m:sub>
+              </m:sSub>
+              <m:r>
+                <m:rPr>
+                  <m:sty m:val="p"/>
+                </m:rPr>
+                <m:t>=</m:t>
+              </m:r>
+              <m:r>
+                <m:t>0.92</m:t>
+              </m:r>
+            </m:oMath>
+            <w:r>
+              <w:t xml:space="preserve">, slope</w:t>
+            </w:r>
+            <w:r>
+              <w:t xml:space="preserve"> </w:t>
+            </w:r>
+            <m:oMath>
+              <m:sSub>
+                <m:e>
+                  <m:r>
+                    <m:t>β</m:t>
+                  </m:r>
+                </m:e>
+                <m:sub>
+                  <m:r>
+                    <m:t>u</m:t>
+                  </m:r>
+                </m:sub>
+              </m:sSub>
+            </m:oMath>
+            <w:r>
+              <w:t xml:space="preserve"> </w:t>
+            </w:r>
+            <w:r>
+              <w:t xml:space="preserve">varied across</w:t>
+            </w:r>
+            <w:r>
+              <w:t xml:space="preserve"> </w:t>
+            </w:r>
+            <m:oMath>
+              <m:r>
+                <m:rPr>
+                  <m:sty m:val="p"/>
+                </m:rPr>
+                <m:t>{</m:t>
+              </m:r>
+              <m:r>
+                <m:rPr>
+                  <m:sty m:val="p"/>
+                </m:rPr>
+                <m:t>−</m:t>
+              </m:r>
+              <m:r>
+                <m:t>0.005</m:t>
+              </m:r>
+              <m:r>
+                <m:rPr>
+                  <m:sty m:val="p"/>
+                </m:rPr>
+                <m:t>,</m:t>
+              </m:r>
+              <m:r>
+                <m:rPr>
+                  <m:sty m:val="p"/>
+                </m:rPr>
+                <m:t>−</m:t>
+              </m:r>
+              <m:r>
+                <m:t>0.010</m:t>
+              </m:r>
+              <m:r>
+                <m:rPr>
+                  <m:sty m:val="p"/>
+                </m:rPr>
+                <m:t>,</m:t>
+              </m:r>
+              <m:r>
+                <m:rPr>
+                  <m:sty m:val="p"/>
+                </m:rPr>
+                <m:t>−</m:t>
+              </m:r>
+              <m:r>
+                <m:t>0.015</m:t>
+              </m:r>
+              <m:r>
+                <m:rPr>
+                  <m:sty m:val="p"/>
+                </m:rPr>
+                <m:t>,</m:t>
+              </m:r>
+              <m:r>
+                <m:rPr>
+                  <m:sty m:val="p"/>
+                </m:rPr>
+                <m:t>−</m:t>
+              </m:r>
+              <m:r>
+                <m:t>0.019</m:t>
+              </m:r>
+              <m:r>
+                <m:rPr>
+                  <m:sty m:val="p"/>
+                </m:rPr>
+                <m:t>}</m:t>
+              </m:r>
+            </m:oMath>
+            <w:r>
+              <w:t xml:space="preserve"> </w:t>
+            </w:r>
+            <w:r>
+              <w:t xml:space="preserve">pp/°C — i.e.,</w:t>
+            </w:r>
+            <w:r>
+              <w:t xml:space="preserve"> </w:t>
+            </w:r>
+            <m:oMath>
+              <m:r>
+                <m:t>u</m:t>
+              </m:r>
+            </m:oMath>
+            <w:r>
+              <w:t xml:space="preserve"> </w:t>
+            </w:r>
+            <w:r>
+              <w:t xml:space="preserve">stays high at cool assays and declines progressively at hotter ones. Row labelled</w:t>
+            </w:r>
+            <w:r>
+              <w:t xml:space="preserve"> </w:t>
+            </w:r>
+            <w:r>
+              <w:rPr>
+                <w:b/>
+                <w:bCs/>
+              </w:rPr>
+              <w:t xml:space="preserve">‘u is constant but reduced (varying</w:t>
+            </w:r>
+            <w:r>
+              <w:rPr>
+                <w:b/>
+                <w:bCs/>
+              </w:rPr>
+              <w:t xml:space="preserve"> </w:t>
+            </w:r>
+            <m:oMath>
+              <m:sSub>
+                <m:e>
+                  <m:r>
+                    <m:t>u</m:t>
+                  </m:r>
+                </m:e>
+                <m:sub>
+                  <m:r>
+                    <m:t>0</m:t>
+                  </m:r>
+                </m:sub>
+              </m:sSub>
+            </m:oMath>
+            <w:r>
+              <w:rPr>
+                <w:b/>
+                <w:bCs/>
+              </w:rPr>
+              <w:t xml:space="preserve">)’</w:t>
+            </w:r>
+            <w:r>
+              <w:t xml:space="preserve">:</w:t>
+            </w:r>
+            <w:r>
+              <w:t xml:space="preserve"> </w:t>
+            </w:r>
+            <m:oMath>
+              <m:sSub>
+                <m:e>
+                  <m:r>
+                    <m:t>β</m:t>
+                  </m:r>
+                </m:e>
+                <m:sub>
+                  <m:r>
+                    <m:t>u</m:t>
+                  </m:r>
+                </m:sub>
+              </m:sSub>
+              <m:r>
+                <m:rPr>
+                  <m:sty m:val="p"/>
+                </m:rPr>
+                <m:t>=</m:t>
+              </m:r>
+              <m:r>
+                <m:t>0</m:t>
+              </m:r>
+            </m:oMath>
+            <w:r>
+              <w:t xml:space="preserve"> </w:t>
+            </w:r>
+            <w:r>
+              <w:t xml:space="preserve">(no temperature drift); the baseline level itself is swept across</w:t>
+            </w:r>
+            <w:r>
+              <w:t xml:space="preserve"> </w:t>
+            </w:r>
+            <m:oMath>
+              <m:r>
+                <m:rPr>
+                  <m:sty m:val="p"/>
+                </m:rPr>
+                <m:t>{</m:t>
+              </m:r>
+              <m:r>
+                <m:t>0.65</m:t>
+              </m:r>
+              <m:r>
+                <m:rPr>
+                  <m:sty m:val="p"/>
+                </m:rPr>
+                <m:t>,</m:t>
+              </m:r>
+              <m:r>
+                <m:t>0.75</m:t>
+              </m:r>
+              <m:r>
+                <m:rPr>
+                  <m:sty m:val="p"/>
+                </m:rPr>
+                <m:t>,</m:t>
+              </m:r>
+              <m:r>
+                <m:t>0.85</m:t>
+              </m:r>
+              <m:r>
+                <m:rPr>
+                  <m:sty m:val="p"/>
+                </m:rPr>
+                <m:t>,</m:t>
+              </m:r>
+              <m:r>
+                <m:t>0.95</m:t>
+              </m:r>
+              <m:r>
+                <m:rPr>
+                  <m:sty m:val="p"/>
+                </m:rPr>
+                <m:t>,</m:t>
+              </m:r>
+              <m:r>
+                <m:t>0.99</m:t>
+              </m:r>
+              <m:r>
+                <m:rPr>
+                  <m:sty m:val="p"/>
+                </m:rPr>
+                <m:t>}</m:t>
+              </m:r>
+            </m:oMath>
+            <w:r>
+              <w:t xml:space="preserve"> </w:t>
+            </w:r>
+            <w:r>
+              <w:t xml:space="preserve">— i.e., a constant fraction of the cohort is never susceptible, regardless of temperature. Both rows:</w:t>
+            </w:r>
+            <w:r>
+              <w:t xml:space="preserve"> </w:t>
+            </w:r>
+            <m:oMath>
+              <m:r>
+                <m:rPr>
+                  <m:nor/>
+                  <m:sty m:val="p"/>
+                </m:rPr>
+                <m:t>low</m:t>
+              </m:r>
+              <m:r>
+                <m:rPr>
+                  <m:sty m:val="p"/>
+                </m:rPr>
+                <m:t>=</m:t>
+              </m:r>
+              <m:r>
+                <m:t>0.05</m:t>
+              </m:r>
+            </m:oMath>
+            <w:r>
+              <w:t xml:space="preserve">,</w:t>
+            </w:r>
+            <w:r>
+              <w:t xml:space="preserve"> </w:t>
+            </w:r>
+            <m:oMath>
+              <m:r>
+                <m:t>k</m:t>
+              </m:r>
+              <m:r>
+                <m:rPr>
+                  <m:sty m:val="p"/>
+                </m:rPr>
+                <m:t>=</m:t>
+              </m:r>
+              <m:r>
+                <m:t>8</m:t>
+              </m:r>
+            </m:oMath>
+            <w:r>
+              <w:t xml:space="preserve">, mid linear in</w:t>
+            </w:r>
+            <w:r>
+              <w:t xml:space="preserve"> </w:t>
+            </w:r>
+            <m:oMath>
+              <m:r>
+                <m:t>T</m:t>
+              </m:r>
+            </m:oMath>
+            <w:r>
+              <w:t xml:space="preserve"> </w:t>
+            </w:r>
+            <w:r>
+              <w:t xml:space="preserve">with slope</w:t>
+            </w:r>
+            <w:r>
+              <w:t xml:space="preserve"> </w:t>
+            </w:r>
+            <m:oMath>
+              <m:r>
+                <m:rPr>
+                  <m:sty m:val="p"/>
+                </m:rPr>
+                <m:t>−</m:t>
+              </m:r>
+              <m:r>
+                <m:t>0.15</m:t>
+              </m:r>
+            </m:oMath>
+            <w:r>
+              <w:t xml:space="preserve">, beta-binomial likelihood (</w:t>
+            </w:r>
+            <m:oMath>
+              <m:r>
+                <m:t>ϕ</m:t>
+              </m:r>
+              <m:r>
+                <m:rPr>
+                  <m:sty m:val="p"/>
+                </m:rPr>
+                <m:t>=</m:t>
+              </m:r>
+              <m:r>
+                <m:t>5</m:t>
+              </m:r>
+            </m:oMath>
+            <w:r>
+              <w:t xml:space="preserve">),</w:t>
+            </w:r>
+            <w:r>
+              <w:t xml:space="preserve"> </w:t>
+            </w:r>
+            <m:oMath>
+              <m:sSub>
+                <m:e>
+                  <m:r>
+                    <m:t>n</m:t>
+                  </m:r>
+                </m:e>
+                <m:sub>
+                  <m:r>
+                    <m:t>r</m:t>
+                  </m:r>
+                  <m:r>
+                    <m:t>e</m:t>
+                  </m:r>
+                  <m:r>
+                    <m:t>p</m:t>
+                  </m:r>
+                  <m:r>
+                    <m:t>s</m:t>
+                  </m:r>
+                </m:sub>
+              </m:sSub>
+              <m:r>
+                <m:rPr>
+                  <m:sty m:val="p"/>
+                </m:rPr>
+                <m:t>=</m:t>
+              </m:r>
+              <m:r>
+                <m:t>5</m:t>
+              </m:r>
+            </m:oMath>
+            <w:r>
+              <w:t xml:space="preserve">,</w:t>
+            </w:r>
+            <w:r>
+              <w:t xml:space="preserve"> </w:t>
+            </w:r>
+            <m:oMath>
+              <m:sSub>
+                <m:e>
+                  <m:r>
+                    <m:t>N</m:t>
+                  </m:r>
+                </m:e>
+                <m:sub>
+                  <m:r>
+                    <m:t>s</m:t>
+                  </m:r>
+                  <m:r>
+                    <m:t>i</m:t>
+                  </m:r>
+                  <m:r>
+                    <m:t>m</m:t>
+                  </m:r>
+                </m:sub>
+              </m:sSub>
+              <m:r>
+                <m:rPr>
+                  <m:sty m:val="p"/>
+                </m:rPr>
+                <m:t>=</m:t>
+              </m:r>
+              <m:r>
+                <m:t>1000</m:t>
+              </m:r>
+            </m:oMath>
+            <w:r>
+              <w:t xml:space="preserve"> </w:t>
+            </w:r>
+            <w:r>
+              <w:t xml:space="preserve">datasets per cell. Points are mean signed bias with 95% Monte Carlo SE bars; dashed lines mark zero bias. Left column:</w:t>
+            </w:r>
+            <w:r>
+              <w:t xml:space="preserve"> </w:t>
+            </w:r>
+            <m:oMath>
+              <m:r>
+                <m:t>z</m:t>
+              </m:r>
+            </m:oMath>
+            <w:r>
+              <w:t xml:space="preserve">; right column:</w:t>
+            </w:r>
+            <w:r>
+              <w:t xml:space="preserve"> </w:t>
+            </w:r>
+            <m:oMath>
+              <m:r>
+                <m:t>C</m:t>
+              </m:r>
+              <m:sSub>
+                <m:e>
+                  <m:r>
+                    <m:t>T</m:t>
+                  </m:r>
+                </m:e>
+                <m:sub>
+                  <m:r>
+                    <m:t>m</m:t>
+                  </m:r>
+                  <m:r>
+                    <m:t>a</m:t>
+                  </m:r>
+                  <m:r>
+                    <m:t>x</m:t>
+                  </m:r>
+                  <m:r>
+                    <m:rPr>
+                      <m:sty m:val="p"/>
+                    </m:rPr>
+                    <m:t>,</m:t>
+                  </m:r>
+                  <m:r>
+                    <m:t>1</m:t>
+                  </m:r>
+                  <m:r>
+                    <m:t>h</m:t>
+                  </m:r>
+                </m:sub>
+              </m:sSub>
+            </m:oMath>
+            <w:r>
+              <w:t xml:space="preserve">. Only the four distinct point-estimate methods are shown: the two-stage Normal-CI and t-CI variants share point estimates within each Stage-1 family, so bias is identical between them; coverage differences appear in the supplementary writeup. Methods are evaluated against the truth on their own threshold scale (see Methods). The two failure signatures differ: drifting</w:t>
+            </w:r>
+            <w:r>
+              <w:t xml:space="preserve"> </w:t>
+            </w:r>
+            <m:oMath>
+              <m:r>
+                <m:t>u</m:t>
+              </m:r>
+            </m:oMath>
+            <w:r>
+              <w:t xml:space="preserve"> </w:t>
+            </w:r>
+            <w:r>
+              <w:t xml:space="preserve">tilts the Stage-2 slope (large</w:t>
+            </w:r>
+            <w:r>
+              <w:t xml:space="preserve"> </w:t>
+            </w:r>
+            <m:oMath>
+              <m:r>
+                <m:t>z</m:t>
+              </m:r>
+            </m:oMath>
+            <w:r>
+              <w:t xml:space="preserve"> </w:t>
+            </w:r>
+            <w:r>
+              <w:t xml:space="preserve">bias, modest</w:t>
+            </w:r>
+            <w:r>
+              <w:t xml:space="preserve"> </w:t>
+            </w:r>
+            <m:oMath>
+              <m:r>
+                <m:t>C</m:t>
+              </m:r>
+              <m:sSub>
+                <m:e>
+                  <m:r>
+                    <m:t>T</m:t>
+                  </m:r>
+                </m:e>
+                <m:sub>
+                  <m:r>
+                    <m:t>m</m:t>
+                  </m:r>
+                  <m:r>
+                    <m:t>a</m:t>
+                  </m:r>
+                  <m:r>
+                    <m:t>x</m:t>
+                  </m:r>
+                  <m:r>
+                    <m:rPr>
+                      <m:sty m:val="p"/>
+                    </m:rPr>
+                    <m:t>,</m:t>
+                  </m:r>
+                  <m:r>
+                    <m:t>1</m:t>
+                  </m:r>
+                  <m:r>
+                    <m:t>h</m:t>
+                  </m:r>
+                </m:sub>
+              </m:sSub>
+            </m:oMath>
+            <w:r>
+              <w:t xml:space="preserve"> </w:t>
+            </w:r>
+            <w:r>
+              <w:t xml:space="preserve">bias); constant low</w:t>
+            </w:r>
+            <w:r>
+              <w:t xml:space="preserve"> </w:t>
+            </w:r>
+            <m:oMath>
+              <m:r>
+                <m:t>u</m:t>
+              </m:r>
+            </m:oMath>
+            <w:r>
+              <w:t xml:space="preserve"> </w:t>
+            </w:r>
+            <w:r>
+              <w:t xml:space="preserve">shifts the Stage-2 intercept (large</w:t>
+            </w:r>
+            <w:r>
+              <w:t xml:space="preserve"> </w:t>
+            </w:r>
+            <m:oMath>
+              <m:r>
+                <m:t>C</m:t>
+              </m:r>
+              <m:sSub>
+                <m:e>
+                  <m:r>
+                    <m:t>T</m:t>
+                  </m:r>
+                </m:e>
+                <m:sub>
+                  <m:r>
+                    <m:t>m</m:t>
+                  </m:r>
+                  <m:r>
+                    <m:t>a</m:t>
+                  </m:r>
+                  <m:r>
+                    <m:t>x</m:t>
+                  </m:r>
+                  <m:r>
+                    <m:rPr>
+                      <m:sty m:val="p"/>
+                    </m:rPr>
+                    <m:t>,</m:t>
+                  </m:r>
+                  <m:r>
+                    <m:t>1</m:t>
+                  </m:r>
+                  <m:r>
+                    <m:t>h</m:t>
+                  </m:r>
+                </m:sub>
+              </m:sSub>
+            </m:oMath>
+            <w:r>
+              <w:t xml:space="preserve"> </w:t>
+            </w:r>
+            <w:r>
+              <w:t xml:space="preserve">bias, with</w:t>
+            </w:r>
+            <w:r>
+              <w:t xml:space="preserve"> </w:t>
+            </w:r>
+            <m:oMath>
+              <m:r>
+                <m:t>z</m:t>
+              </m:r>
+            </m:oMath>
+            <w:r>
+              <w:t xml:space="preserve"> </w:t>
+            </w:r>
+            <w:r>
+              <w:t xml:space="preserve">bias of opposite sign growing as</w:t>
+            </w:r>
+            <w:r>
+              <w:t xml:space="preserve"> </w:t>
+            </w:r>
+            <m:oMath>
+              <m:sSub>
+                <m:e>
+                  <m:r>
+                    <m:t>u</m:t>
+                  </m:r>
+                </m:e>
+                <m:sub>
+                  <m:r>
+                    <m:t>0</m:t>
+                  </m:r>
+                </m:sub>
+              </m:sSub>
+            </m:oMath>
+            <w:r>
+              <w:t xml:space="preserve"> </w:t>
+            </w:r>
+            <w:r>
+              <w:t xml:space="preserve">falls).</w:t>
+            </w:r>
+          </w:p>
+          <w:bookmarkEnd w:id="45"/>
+        </w:tc>
+      </w:tr>
+    </w:tbl>
+    <w:bookmarkEnd w:id="46"/>
+    <w:bookmarkEnd w:id="47"/>
+    <w:bookmarkStart w:id="51" w:name="Xabbe56c6b0f09d0a23600010df7f295a0cf446d"/>
     <w:p>
       <w:pPr>
         <w:pStyle w:val="Heading1"/>
@@ -8819,7 +11220,7 @@
       <w:pPr>
         <w:pStyle w:val="BodyText"/>
       </w:pPr>
-      <w:bookmarkStart w:id="34" w:name="eq-reparam"/>
+      <w:bookmarkStart w:id="48" w:name="eq-reparam"/>
       <m:oMathPara>
         <m:oMathParaPr>
           <m:jc m:val="center"/>
@@ -9034,7 +11435,7 @@
           </m:d>
         </m:oMath>
       </m:oMathPara>
-      <w:bookmarkEnd w:id="34"/>
+      <w:bookmarkEnd w:id="48"/>
     </w:p>
     <w:p>
       <w:pPr>
@@ -9343,7 +11744,7 @@
       <w:pPr>
         <w:pStyle w:val="BodyText"/>
       </w:pPr>
-      <w:bookmarkStart w:id="35" w:name="eq-linpred"/>
+      <w:bookmarkStart w:id="49" w:name="eq-linpred"/>
       <m:oMathPara>
         <m:oMathParaPr>
           <m:jc m:val="center"/>
@@ -9579,7 +11980,7 @@
           </m:d>
         </m:oMath>
       </m:oMathPara>
-      <w:bookmarkEnd w:id="35"/>
+      <w:bookmarkEnd w:id="49"/>
     </w:p>
     <w:p>
       <w:pPr>
@@ -9901,7 +12302,7 @@
         <w:t xml:space="preserve">at any reference time, and the heat-injury integral — is recovered as a one-line posterior summary of this single joint fit, as derived in §[Equivalence with the classical pipeline].</w:t>
       </w:r>
     </w:p>
-    <w:bookmarkStart w:id="36" w:name="X83c280133a78de915d3b14a666f30d6a82dc387"/>
+    <w:bookmarkStart w:id="50" w:name="X83c280133a78de915d3b14a666f30d6a82dc387"/>
     <w:p>
       <w:pPr>
         <w:pStyle w:val="Heading2"/>
@@ -9910,9 +12311,9 @@
         <w:t xml:space="preserve">What the 4PL delivers that the two-step cannot</w:t>
       </w:r>
     </w:p>
-    <w:bookmarkEnd w:id="36"/>
-    <w:bookmarkEnd w:id="37"/>
-    <w:bookmarkStart w:id="44" w:name="X2a14174f4c72db593bce4e6516c6528cdb497de"/>
+    <w:bookmarkEnd w:id="50"/>
+    <w:bookmarkEnd w:id="51"/>
+    <w:bookmarkStart w:id="58" w:name="X2a14174f4c72db593bce4e6516c6528cdb497de"/>
     <w:p>
       <w:pPr>
         <w:pStyle w:val="Heading1"/>
@@ -9921,7 +12322,7 @@
         <w:t xml:space="preserve">Worked example: brown shrimp thermal tolerance</w:t>
       </w:r>
     </w:p>
-    <w:bookmarkStart w:id="38" w:name="data-and-experimental-design"/>
+    <w:bookmarkStart w:id="52" w:name="data-and-experimental-design"/>
     <w:p>
       <w:pPr>
         <w:pStyle w:val="Heading2"/>
@@ -9930,8 +12331,8 @@
         <w:t xml:space="preserve">Data and experimental design</w:t>
       </w:r>
     </w:p>
-    <w:bookmarkEnd w:id="38"/>
-    <w:bookmarkStart w:id="39" w:name="lethal-tdt-hierarchical-4pl-on-counts"/>
+    <w:bookmarkEnd w:id="52"/>
+    <w:bookmarkStart w:id="53" w:name="lethal-tdt-hierarchical-4pl-on-counts"/>
     <w:p>
       <w:pPr>
         <w:pStyle w:val="Heading2"/>
@@ -9940,8 +12341,8 @@
         <w:t xml:space="preserve">Lethal TDT — hierarchical 4PL on counts</w:t>
       </w:r>
     </w:p>
-    <w:bookmarkEnd w:id="39"/>
-    <w:bookmarkStart w:id="40" w:name="sublethal-time-to-death"/>
+    <w:bookmarkEnd w:id="53"/>
+    <w:bookmarkStart w:id="54" w:name="sublethal-time-to-death"/>
     <w:p>
       <w:pPr>
         <w:pStyle w:val="Heading2"/>
@@ -9950,8 +12351,8 @@
         <w:t xml:space="preserve">Sublethal time-to-death</w:t>
       </w:r>
     </w:p>
-    <w:bookmarkEnd w:id="40"/>
-    <w:bookmarkStart w:id="41" w:name="dynamic-ct_max-across-ramping-rates"/>
+    <w:bookmarkEnd w:id="54"/>
+    <w:bookmarkStart w:id="55" w:name="dynamic-ct_max-across-ramping-rates"/>
     <w:p>
       <w:pPr>
         <w:pStyle w:val="Heading2"/>
@@ -9992,8 +12393,8 @@
         <w:t xml:space="preserve">across ramping rates</w:t>
       </w:r>
     </w:p>
-    <w:bookmarkEnd w:id="41"/>
-    <w:bookmarkStart w:id="42" w:name="Xa764bbb0ef06e1b16f1b866442815364d0000f8"/>
+    <w:bookmarkEnd w:id="55"/>
+    <w:bookmarkStart w:id="56" w:name="Xa764bbb0ef06e1b16f1b866442815364d0000f8"/>
     <w:p>
       <w:pPr>
         <w:pStyle w:val="Heading2"/>
@@ -10002,8 +12403,8 @@
         <w:t xml:space="preserve">Reconciling the three endpoints via the Jørgensen ramping equation</w:t>
       </w:r>
     </w:p>
-    <w:bookmarkEnd w:id="42"/>
-    <w:bookmarkStart w:id="43" w:name="Xc9d8a39a8777a97080af0145482f0bf85ce7458"/>
+    <w:bookmarkEnd w:id="56"/>
+    <w:bookmarkStart w:id="57" w:name="Xc9d8a39a8777a97080af0145482f0bf85ce7458"/>
     <w:p>
       <w:pPr>
         <w:pStyle w:val="Heading2"/>
@@ -10012,9 +12413,9 @@
         <w:t xml:space="preserve">Field-temperature heat-injury projections under warming scenarios</w:t>
       </w:r>
     </w:p>
-    <w:bookmarkEnd w:id="43"/>
-    <w:bookmarkEnd w:id="44"/>
-    <w:bookmarkStart w:id="48" w:name="discussion"/>
+    <w:bookmarkEnd w:id="57"/>
+    <w:bookmarkEnd w:id="58"/>
+    <w:bookmarkStart w:id="62" w:name="discussion"/>
     <w:p>
       <w:pPr>
         <w:pStyle w:val="Heading1"/>
@@ -10023,7 +12424,7 @@
         <w:t xml:space="preserve">Discussion</w:t>
       </w:r>
     </w:p>
-    <w:bookmarkStart w:id="45" w:name="X5dac85fa1a4411486a220dbeaf8627ab0091f32"/>
+    <w:bookmarkStart w:id="59" w:name="X5dac85fa1a4411486a220dbeaf8627ab0091f32"/>
     <w:p>
       <w:pPr>
         <w:pStyle w:val="Heading2"/>
@@ -10032,8 +12433,8 @@
         <w:t xml:space="preserve">What changes for the field if the hierarchical 4PL becomes the default</w:t>
       </w:r>
     </w:p>
-    <w:bookmarkEnd w:id="45"/>
-    <w:bookmarkStart w:id="46" w:name="limits-of-the-present-analysis"/>
+    <w:bookmarkEnd w:id="59"/>
+    <w:bookmarkStart w:id="60" w:name="limits-of-the-present-analysis"/>
     <w:p>
       <w:pPr>
         <w:pStyle w:val="Heading2"/>
@@ -10042,8 +12443,8 @@
         <w:t xml:space="preserve">Limits of the present analysis</w:t>
       </w:r>
     </w:p>
-    <w:bookmarkEnd w:id="46"/>
-    <w:bookmarkStart w:id="47" w:name="Xf0d52b04feeaedf0b5abcee2b4d231c85971023"/>
+    <w:bookmarkEnd w:id="60"/>
+    <w:bookmarkStart w:id="61" w:name="Xf0d52b04feeaedf0b5abcee2b4d231c85971023"/>
     <w:p>
       <w:pPr>
         <w:pStyle w:val="Heading2"/>
@@ -10052,9 +12453,9 @@
         <w:t xml:space="preserve">Recommendations for primary studies and meta-analyses</w:t>
       </w:r>
     </w:p>
-    <w:bookmarkEnd w:id="47"/>
-    <w:bookmarkEnd w:id="48"/>
-    <w:bookmarkStart w:id="49" w:name="conclusions"/>
+    <w:bookmarkEnd w:id="61"/>
+    <w:bookmarkEnd w:id="62"/>
+    <w:bookmarkStart w:id="63" w:name="conclusions"/>
     <w:p>
       <w:pPr>
         <w:pStyle w:val="Heading1"/>
@@ -10063,8 +12464,8 @@
         <w:t xml:space="preserve">Conclusions</w:t>
       </w:r>
     </w:p>
-    <w:bookmarkEnd w:id="49"/>
-    <w:bookmarkStart w:id="50" w:name="acknowledgements"/>
+    <w:bookmarkEnd w:id="63"/>
+    <w:bookmarkStart w:id="64" w:name="acknowledgements"/>
     <w:p>
       <w:pPr>
         <w:pStyle w:val="Heading1"/>
@@ -10073,8 +12474,8 @@
         <w:t xml:space="preserve">Acknowledgements</w:t>
       </w:r>
     </w:p>
-    <w:bookmarkEnd w:id="50"/>
-    <w:bookmarkStart w:id="51" w:name="author-contributions"/>
+    <w:bookmarkEnd w:id="64"/>
+    <w:bookmarkStart w:id="65" w:name="author-contributions"/>
     <w:p>
       <w:pPr>
         <w:pStyle w:val="Heading1"/>
@@ -10083,8 +12484,8 @@
         <w:t xml:space="preserve">Author contributions</w:t>
       </w:r>
     </w:p>
-    <w:bookmarkEnd w:id="51"/>
-    <w:bookmarkStart w:id="52" w:name="data-and-code-availability"/>
+    <w:bookmarkEnd w:id="65"/>
+    <w:bookmarkStart w:id="66" w:name="data-and-code-availability"/>
     <w:p>
       <w:pPr>
         <w:pStyle w:val="Heading1"/>
@@ -10101,8 +12502,8 @@
         <w:t xml:space="preserve">All data, analysis scripts, and the rendered manuscript and supplement are available at https://github.com/daniel1noble/bayesTLS.</w:t>
       </w:r>
     </w:p>
-    <w:bookmarkEnd w:id="52"/>
-    <w:bookmarkStart w:id="53" w:name="conflict-of-interest"/>
+    <w:bookmarkEnd w:id="66"/>
+    <w:bookmarkStart w:id="67" w:name="conflict-of-interest"/>
     <w:p>
       <w:pPr>
         <w:pStyle w:val="Heading1"/>
@@ -10119,8 +12520,8 @@
         <w:t xml:space="preserve">The authors declare no competing interests.</w:t>
       </w:r>
     </w:p>
-    <w:bookmarkEnd w:id="53"/>
-    <w:bookmarkStart w:id="122" w:name="references"/>
+    <w:bookmarkEnd w:id="67"/>
+    <w:bookmarkStart w:id="146" w:name="references"/>
     <w:p>
       <w:pPr>
         <w:pStyle w:val="Heading1"/>
@@ -10129,8 +12530,8 @@
         <w:t xml:space="preserve">References</w:t>
       </w:r>
     </w:p>
-    <w:bookmarkStart w:id="121" w:name="refs"/>
-    <w:bookmarkStart w:id="55" w:name="ref-arnold_thermal_2025"/>
+    <w:bookmarkStart w:id="145" w:name="refs"/>
+    <w:bookmarkStart w:id="69" w:name="ref-arnold_thermal_2025"/>
     <w:p>
       <w:pPr>
         <w:pStyle w:val="Bibliography"/>
@@ -10154,7 +12555,7 @@
       <w:r>
         <w:t xml:space="preserve"> </w:t>
       </w:r>
-      <w:hyperlink r:id="rId54">
+      <w:hyperlink r:id="rId68">
         <w:r>
           <w:rPr>
             <w:rStyle w:val="Hyperlink"/>
@@ -10179,8 +12580,8 @@
         <w:t xml:space="preserve">, 31, e70315.</w:t>
       </w:r>
     </w:p>
-    <w:bookmarkEnd w:id="55"/>
-    <w:bookmarkStart w:id="56" w:name="ref-bolker_ecologicalmodels_2008"/>
+    <w:bookmarkEnd w:id="69"/>
+    <w:bookmarkStart w:id="70" w:name="ref-bolker_ecologicalmodels_2008"/>
     <w:p>
       <w:pPr>
         <w:pStyle w:val="Bibliography"/>
@@ -10216,8 +12617,8 @@
         <w:t xml:space="preserve">. Princeton University Press, Princeton, NJ.</w:t>
       </w:r>
     </w:p>
-    <w:bookmarkEnd w:id="56"/>
-    <w:bookmarkStart w:id="58" w:name="ref-buckley_damage_2025"/>
+    <w:bookmarkEnd w:id="70"/>
+    <w:bookmarkStart w:id="72" w:name="ref-buckley_damage_2025"/>
     <w:p>
       <w:pPr>
         <w:pStyle w:val="Bibliography"/>
@@ -10228,7 +12629,7 @@
       <w:r>
         <w:t xml:space="preserve"> </w:t>
       </w:r>
-      <w:hyperlink r:id="rId57">
+      <w:hyperlink r:id="rId71">
         <w:r>
           <w:rPr>
             <w:rStyle w:val="Hyperlink"/>
@@ -10253,8 +12654,8 @@
         <w:t xml:space="preserve">, 65, 1061–1075.</w:t>
       </w:r>
     </w:p>
-    <w:bookmarkEnd w:id="58"/>
-    <w:bookmarkStart w:id="60" w:name="ref-burke_ipd_2017"/>
+    <w:bookmarkEnd w:id="72"/>
+    <w:bookmarkStart w:id="74" w:name="ref-burke_ipd_2017"/>
     <w:p>
       <w:pPr>
         <w:pStyle w:val="Bibliography"/>
@@ -10265,7 +12666,7 @@
       <w:r>
         <w:t xml:space="preserve"> </w:t>
       </w:r>
-      <w:hyperlink r:id="rId59">
+      <w:hyperlink r:id="rId73">
         <w:r>
           <w:rPr>
             <w:rStyle w:val="Hyperlink"/>
@@ -10290,8 +12691,8 @@
         <w:t xml:space="preserve">, 36, 855–875.</w:t>
       </w:r>
     </w:p>
-    <w:bookmarkEnd w:id="60"/>
-    <w:bookmarkStart w:id="62" w:name="ref-carroll_measurement_2006"/>
+    <w:bookmarkEnd w:id="74"/>
+    <w:bookmarkStart w:id="76" w:name="ref-carroll_measurement_2006"/>
     <w:p>
       <w:pPr>
         <w:pStyle w:val="Bibliography"/>
@@ -10302,7 +12703,7 @@
       <w:r>
         <w:t xml:space="preserve"> </w:t>
       </w:r>
-      <w:hyperlink r:id="rId61">
+      <w:hyperlink r:id="rId75">
         <w:r>
           <w:rPr>
             <w:rStyle w:val="Hyperlink"/>
@@ -10325,8 +12726,8 @@
         <w:t xml:space="preserve">.</w:t>
       </w:r>
     </w:p>
-    <w:bookmarkEnd w:id="62"/>
-    <w:bookmarkStart w:id="64" w:name="ref-deutsch_latitude_2008"/>
+    <w:bookmarkEnd w:id="76"/>
+    <w:bookmarkStart w:id="78" w:name="ref-deutsch_latitude_2008"/>
     <w:p>
       <w:pPr>
         <w:pStyle w:val="Bibliography"/>
@@ -10350,7 +12751,7 @@
       <w:r>
         <w:t xml:space="preserve"> </w:t>
       </w:r>
-      <w:hyperlink r:id="rId63">
+      <w:hyperlink r:id="rId77">
         <w:r>
           <w:rPr>
             <w:rStyle w:val="Hyperlink"/>
@@ -10375,19 +12776,93 @@
         <w:t xml:space="preserve">, 105, 6668–6672.</w:t>
       </w:r>
     </w:p>
-    <w:bookmarkEnd w:id="64"/>
-    <w:bookmarkStart w:id="66" w:name="ref-gelman_priors_2006"/>
+    <w:bookmarkEnd w:id="78"/>
+    <w:bookmarkStart w:id="80" w:name="ref-direnzo2023"/>
     <w:p>
       <w:pPr>
         <w:pStyle w:val="Bibliography"/>
       </w:pPr>
       <w:r>
+        <w:t xml:space="preserve">DiRenzo, G.V., Hanks, E. &amp; Miller, D.A.W. (2023).</w:t>
+      </w:r>
+      <w:r>
+        <w:t xml:space="preserve"> </w:t>
+      </w:r>
+      <w:hyperlink r:id="rId79">
+        <w:r>
+          <w:rPr>
+            <w:rStyle w:val="Hyperlink"/>
+          </w:rPr>
+          <w:t xml:space="preserve">A practical guide to understanding and validating complex models using data simulations</w:t>
+        </w:r>
+      </w:hyperlink>
+      <w:r>
+        <w:t xml:space="preserve">.</w:t>
+      </w:r>
+      <w:r>
+        <w:t xml:space="preserve"> </w:t>
+      </w:r>
+      <w:r>
+        <w:rPr>
+          <w:i/>
+          <w:iCs/>
+        </w:rPr>
+        <w:t xml:space="preserve">Methods in Ecology and Evolution</w:t>
+      </w:r>
+      <w:r>
+        <w:t xml:space="preserve">, 14, 203–217.</w:t>
+      </w:r>
+    </w:p>
+    <w:bookmarkEnd w:id="80"/>
+    <w:bookmarkStart w:id="82" w:name="ref-faber_tdt_plants_2024"/>
+    <w:p>
+      <w:pPr>
+        <w:pStyle w:val="Bibliography"/>
+      </w:pPr>
+      <w:r>
+        <w:t xml:space="preserve">Faber, A.H., Ørsted, M. &amp; Ehlers, B.K. (2024).</w:t>
+      </w:r>
+      <w:r>
+        <w:t xml:space="preserve"> </w:t>
+      </w:r>
+      <w:hyperlink r:id="rId81">
+        <w:r>
+          <w:rPr>
+            <w:rStyle w:val="Hyperlink"/>
+          </w:rPr>
+          <w:t xml:space="preserve">Application of the thermal death time model in predicting thermal damage accumulation in plants</w:t>
+        </w:r>
+      </w:hyperlink>
+      <w:r>
+        <w:t xml:space="preserve">.</w:t>
+      </w:r>
+      <w:r>
+        <w:t xml:space="preserve"> </w:t>
+      </w:r>
+      <w:r>
+        <w:rPr>
+          <w:i/>
+          <w:iCs/>
+        </w:rPr>
+        <w:t xml:space="preserve">Journal of Experimental Botany</w:t>
+      </w:r>
+      <w:r>
+        <w:t xml:space="preserve">, 75, 3467–3482.</w:t>
+      </w:r>
+    </w:p>
+    <w:bookmarkEnd w:id="82"/>
+    <w:bookmarkStart w:id="84" w:name="ref-gelman_priors_2006"/>
+    <w:p>
+      <w:pPr>
+        <w:pStyle w:val="Bibliography"/>
+      </w:pPr>
+      <w:r>
         <w:t xml:space="preserve">Gelman, A. (2006).</w:t>
       </w:r>
       <w:r>
         <w:t xml:space="preserve"> </w:t>
       </w:r>
-      <w:hyperlink r:id="rId65">
+      <w:hyperlink r:id="rId83">
         <w:r>
           <w:rPr>
             <w:rStyle w:val="Hyperlink"/>
@@ -10454,8 +12929,8 @@
         <w:t xml:space="preserve">, 1, 515–534.</w:t>
       </w:r>
     </w:p>
-    <w:bookmarkEnd w:id="66"/>
-    <w:bookmarkStart w:id="68" w:name="ref-harrison_olre_2014"/>
+    <w:bookmarkEnd w:id="84"/>
+    <w:bookmarkStart w:id="86" w:name="ref-harrison_olre_2014"/>
     <w:p>
       <w:pPr>
         <w:pStyle w:val="Bibliography"/>
@@ -10466,7 +12941,7 @@
       <w:r>
         <w:t xml:space="preserve"> </w:t>
       </w:r>
-      <w:hyperlink r:id="rId67">
+      <w:hyperlink r:id="rId85">
         <w:r>
           <w:rPr>
             <w:rStyle w:val="Hyperlink"/>
@@ -10491,8 +12966,8 @@
         <w:t xml:space="preserve">, 2, e616.</w:t>
       </w:r>
     </w:p>
-    <w:bookmarkEnd w:id="68"/>
-    <w:bookmarkStart w:id="70" w:name="ref-harrison_mixed_2018"/>
+    <w:bookmarkEnd w:id="86"/>
+    <w:bookmarkStart w:id="88" w:name="ref-harrison_mixed_2018"/>
     <w:p>
       <w:pPr>
         <w:pStyle w:val="Bibliography"/>
@@ -10516,7 +12991,7 @@
       <w:r>
         <w:t xml:space="preserve"> </w:t>
       </w:r>
-      <w:hyperlink r:id="rId69">
+      <w:hyperlink r:id="rId87">
         <w:r>
           <w:rPr>
             <w:rStyle w:val="Hyperlink"/>
@@ -10541,8 +13016,8 @@
         <w:t xml:space="preserve">, 6, e4794.</w:t>
       </w:r>
     </w:p>
-    <w:bookmarkEnd w:id="70"/>
-    <w:bookmarkStart w:id="72" w:name="ref-jorgensen_drosophila_2019"/>
+    <w:bookmarkEnd w:id="88"/>
+    <w:bookmarkStart w:id="90" w:name="ref-jorgensen_drosophila_2019"/>
     <w:p>
       <w:pPr>
         <w:pStyle w:val="Bibliography"/>
@@ -10553,7 +13028,7 @@
       <w:r>
         <w:t xml:space="preserve"> </w:t>
       </w:r>
-      <w:hyperlink r:id="rId71">
+      <w:hyperlink r:id="rId89">
         <w:r>
           <w:rPr>
             <w:rStyle w:val="Hyperlink"/>
@@ -10602,8 +13077,8 @@
         <w:t xml:space="preserve">, 33, 629–642.</w:t>
       </w:r>
     </w:p>
-    <w:bookmarkEnd w:id="72"/>
-    <w:bookmarkStart w:id="74" w:name="ref-jorgensen_unifying_2021"/>
+    <w:bookmarkEnd w:id="90"/>
+    <w:bookmarkStart w:id="92" w:name="ref-jorgensen_unifying_2021"/>
     <w:p>
       <w:pPr>
         <w:pStyle w:val="Bibliography"/>
@@ -10614,7 +13089,7 @@
       <w:r>
         <w:t xml:space="preserve"> </w:t>
       </w:r>
-      <w:hyperlink r:id="rId73">
+      <w:hyperlink r:id="rId91">
         <w:r>
           <w:rPr>
             <w:rStyle w:val="Hyperlink"/>
@@ -10639,8 +13114,8 @@
         <w:t xml:space="preserve">, 11, 12840.</w:t>
       </w:r>
     </w:p>
-    <w:bookmarkEnd w:id="74"/>
-    <w:bookmarkStart w:id="76" w:name="ref-jorgensen_nature_2022"/>
+    <w:bookmarkEnd w:id="92"/>
+    <w:bookmarkStart w:id="94" w:name="ref-jorgensen_nature_2022"/>
     <w:p>
       <w:pPr>
         <w:pStyle w:val="Bibliography"/>
@@ -10651,7 +13126,7 @@
       <w:r>
         <w:t xml:space="preserve"> </w:t>
       </w:r>
-      <w:hyperlink r:id="rId75">
+      <w:hyperlink r:id="rId93">
         <w:r>
           <w:rPr>
             <w:rStyle w:val="Hyperlink"/>
@@ -10676,8 +13151,105 @@
         <w:t xml:space="preserve">, 611, 93–98.</w:t>
       </w:r>
     </w:p>
-    <w:bookmarkEnd w:id="76"/>
-    <w:bookmarkStart w:id="78" w:name="ref-li2023"/>
+    <w:bookmarkEnd w:id="94"/>
+    <w:bookmarkStart w:id="96" w:name="ref-koehler2009"/>
+    <w:p>
+      <w:pPr>
+        <w:pStyle w:val="Bibliography"/>
+      </w:pPr>
+      <w:r>
+        <w:t xml:space="preserve">Koehler, E., Brown, E. &amp; Haneuse, S.J.-P.A. (2009).</w:t>
+      </w:r>
+      <w:r>
+        <w:t xml:space="preserve"> </w:t>
+      </w:r>
+      <w:hyperlink r:id="rId95">
+        <w:r>
+          <w:rPr>
+            <w:rStyle w:val="Hyperlink"/>
+          </w:rPr>
+          <w:t xml:space="preserve">On the</w:t>
+        </w:r>
+        <w:r>
+          <w:rPr>
+            <w:rStyle w:val="Hyperlink"/>
+          </w:rPr>
+          <w:t xml:space="preserve"> </w:t>
+        </w:r>
+        <w:r>
+          <w:rPr>
+            <w:rStyle w:val="Hyperlink"/>
+          </w:rPr>
+          <w:t xml:space="preserve">Assessment</w:t>
+        </w:r>
+        <w:r>
+          <w:rPr>
+            <w:rStyle w:val="Hyperlink"/>
+          </w:rPr>
+          <w:t xml:space="preserve"> </w:t>
+        </w:r>
+        <w:r>
+          <w:rPr>
+            <w:rStyle w:val="Hyperlink"/>
+          </w:rPr>
+          <w:t xml:space="preserve">of</w:t>
+        </w:r>
+        <w:r>
+          <w:rPr>
+            <w:rStyle w:val="Hyperlink"/>
+          </w:rPr>
+          <w:t xml:space="preserve"> </w:t>
+        </w:r>
+        <w:r>
+          <w:rPr>
+            <w:rStyle w:val="Hyperlink"/>
+          </w:rPr>
+          <w:t xml:space="preserve">Monte Carlo Error</w:t>
+        </w:r>
+        <w:r>
+          <w:rPr>
+            <w:rStyle w:val="Hyperlink"/>
+          </w:rPr>
+          <w:t xml:space="preserve"> </w:t>
+        </w:r>
+        <w:r>
+          <w:rPr>
+            <w:rStyle w:val="Hyperlink"/>
+          </w:rPr>
+          <w:t xml:space="preserve">in</w:t>
+        </w:r>
+        <w:r>
+          <w:rPr>
+            <w:rStyle w:val="Hyperlink"/>
+          </w:rPr>
+          <w:t xml:space="preserve"> </w:t>
+        </w:r>
+        <w:r>
+          <w:rPr>
+            <w:rStyle w:val="Hyperlink"/>
+          </w:rPr>
+          <w:t xml:space="preserve">Simulation-Based Statistical Analyses</w:t>
+        </w:r>
+      </w:hyperlink>
+      <w:r>
+        <w:t xml:space="preserve">.</w:t>
+      </w:r>
+      <w:r>
+        <w:t xml:space="preserve"> </w:t>
+      </w:r>
+      <w:r>
+        <w:rPr>
+          <w:i/>
+          <w:iCs/>
+        </w:rPr>
+        <w:t xml:space="preserve">American Statistician</w:t>
+      </w:r>
+      <w:r>
+        <w:t xml:space="preserve">, 63, 155–162.</w:t>
+      </w:r>
+    </w:p>
+    <w:bookmarkEnd w:id="96"/>
+    <w:bookmarkStart w:id="98" w:name="ref-li2023"/>
     <w:p>
       <w:pPr>
         <w:pStyle w:val="Bibliography"/>
@@ -10701,7 +13273,7 @@
       <w:r>
         <w:t xml:space="preserve"> </w:t>
       </w:r>
-      <w:hyperlink r:id="rId77">
+      <w:hyperlink r:id="rId97">
         <w:r>
           <w:rPr>
             <w:rStyle w:val="Hyperlink"/>
@@ -10726,8 +13298,8 @@
         <w:t xml:space="preserve">, 114, 103583.</w:t>
       </w:r>
     </w:p>
-    <w:bookmarkEnd w:id="78"/>
-    <w:bookmarkStart w:id="80" w:name="ref-nakagawa_santos_2012"/>
+    <w:bookmarkEnd w:id="98"/>
+    <w:bookmarkStart w:id="100" w:name="ref-nakagawa_santos_2012"/>
     <w:p>
       <w:pPr>
         <w:pStyle w:val="Bibliography"/>
@@ -10738,7 +13310,7 @@
       <w:r>
         <w:t xml:space="preserve"> </w:t>
       </w:r>
-      <w:hyperlink r:id="rId79">
+      <w:hyperlink r:id="rId99">
         <w:r>
           <w:rPr>
             <w:rStyle w:val="Hyperlink"/>
@@ -10763,8 +13335,8 @@
         <w:t xml:space="preserve">, 26, 1253–1274.</w:t>
       </w:r>
     </w:p>
-    <w:bookmarkEnd w:id="80"/>
-    <w:bookmarkStart w:id="82" w:name="ref-nielsen_nlmm_2004"/>
+    <w:bookmarkEnd w:id="100"/>
+    <w:bookmarkStart w:id="102" w:name="ref-nielsen_nlmm_2004"/>
     <w:p>
       <w:pPr>
         <w:pStyle w:val="Bibliography"/>
@@ -10775,7 +13347,7 @@
       <w:r>
         <w:t xml:space="preserve"> </w:t>
       </w:r>
-      <w:hyperlink r:id="rId81">
+      <w:hyperlink r:id="rId101">
         <w:r>
           <w:rPr>
             <w:rStyle w:val="Hyperlink"/>
@@ -10800,8 +13372,8 @@
         <w:t xml:space="preserve">, 18, 30–37.</w:t>
       </w:r>
     </w:p>
-    <w:bookmarkEnd w:id="82"/>
-    <w:bookmarkStart w:id="84" w:name="ref-noble2026"/>
+    <w:bookmarkEnd w:id="102"/>
+    <w:bookmarkStart w:id="104" w:name="ref-noble2026"/>
     <w:p>
       <w:pPr>
         <w:pStyle w:val="Bibliography"/>
@@ -10825,7 +13397,7 @@
       <w:r>
         <w:t xml:space="preserve"> </w:t>
       </w:r>
-      <w:hyperlink r:id="rId83">
+      <w:hyperlink r:id="rId103">
         <w:r>
           <w:rPr>
             <w:rStyle w:val="Hyperlink"/>
@@ -10850,8 +13422,8 @@
         <w:t xml:space="preserve">, 41, 451–464.</w:t>
       </w:r>
     </w:p>
-    <w:bookmarkEnd w:id="84"/>
-    <w:bookmarkStart w:id="86" w:name="ref-orsted_finding_2022"/>
+    <w:bookmarkEnd w:id="104"/>
+    <w:bookmarkStart w:id="106" w:name="ref-orsted_finding_2022"/>
     <w:p>
       <w:pPr>
         <w:pStyle w:val="Bibliography"/>
@@ -10862,7 +13434,7 @@
       <w:r>
         <w:t xml:space="preserve"> </w:t>
       </w:r>
-      <w:hyperlink r:id="rId85">
+      <w:hyperlink r:id="rId105">
         <w:r>
           <w:rPr>
             <w:rStyle w:val="Hyperlink"/>
@@ -10911,8 +13483,8 @@
         <w:t xml:space="preserve">, 225, jeb244514.</w:t>
       </w:r>
     </w:p>
-    <w:bookmarkEnd w:id="86"/>
-    <w:bookmarkStart w:id="88" w:name="ref-orsted_suzukii_2024"/>
+    <w:bookmarkEnd w:id="106"/>
+    <w:bookmarkStart w:id="108" w:name="ref-orsted_suzukii_2024"/>
     <w:p>
       <w:pPr>
         <w:pStyle w:val="Bibliography"/>
@@ -10923,7 +13495,7 @@
       <w:r>
         <w:t xml:space="preserve"> </w:t>
       </w:r>
-      <w:hyperlink r:id="rId87">
+      <w:hyperlink r:id="rId107">
         <w:r>
           <w:rPr>
             <w:rStyle w:val="Hyperlink"/>
@@ -10972,8 +13544,8 @@
         <w:t xml:space="preserve">, 27, e14421.</w:t>
       </w:r>
     </w:p>
-    <w:bookmarkEnd w:id="88"/>
-    <w:bookmarkStart w:id="90" w:name="ref-pinsky_marine_2019"/>
+    <w:bookmarkEnd w:id="108"/>
+    <w:bookmarkStart w:id="110" w:name="ref-pinsky_marine_2019"/>
     <w:p>
       <w:pPr>
         <w:pStyle w:val="Bibliography"/>
@@ -10984,7 +13556,7 @@
       <w:r>
         <w:t xml:space="preserve"> </w:t>
       </w:r>
-      <w:hyperlink r:id="rId89">
+      <w:hyperlink r:id="rId109">
         <w:r>
           <w:rPr>
             <w:rStyle w:val="Hyperlink"/>
@@ -11009,8 +13581,8 @@
         <w:t xml:space="preserve">, 569, 108–111.</w:t>
       </w:r>
     </w:p>
-    <w:bookmarkEnd w:id="90"/>
-    <w:bookmarkStart w:id="92" w:name="ref-pottier_amphibians_2025"/>
+    <w:bookmarkEnd w:id="110"/>
+    <w:bookmarkStart w:id="112" w:name="ref-pottier_amphibians_2025"/>
     <w:p>
       <w:pPr>
         <w:pStyle w:val="Bibliography"/>
@@ -11034,7 +13606,7 @@
       <w:r>
         <w:t xml:space="preserve"> </w:t>
       </w:r>
-      <w:hyperlink r:id="rId91">
+      <w:hyperlink r:id="rId111">
         <w:r>
           <w:rPr>
             <w:rStyle w:val="Hyperlink"/>
@@ -11059,8 +13631,8 @@
         <w:t xml:space="preserve">, 639, 954–961.</w:t>
       </w:r>
     </w:p>
-    <w:bookmarkEnd w:id="92"/>
-    <w:bookmarkStart w:id="94" w:name="ref-rezende_drosophila_mortality_2020"/>
+    <w:bookmarkEnd w:id="112"/>
+    <w:bookmarkStart w:id="114" w:name="ref-rezende_drosophila_mortality_2020"/>
     <w:p>
       <w:pPr>
         <w:pStyle w:val="Bibliography"/>
@@ -11071,7 +13643,7 @@
       <w:r>
         <w:t xml:space="preserve"> </w:t>
       </w:r>
-      <w:hyperlink r:id="rId93">
+      <w:hyperlink r:id="rId113">
         <w:r>
           <w:rPr>
             <w:rStyle w:val="Hyperlink"/>
@@ -11120,8 +13692,8 @@
         <w:t xml:space="preserve">, 369, 1242–1245.</w:t>
       </w:r>
     </w:p>
-    <w:bookmarkEnd w:id="94"/>
-    <w:bookmarkStart w:id="96" w:name="ref-rezende_landscapes_2014"/>
+    <w:bookmarkEnd w:id="114"/>
+    <w:bookmarkStart w:id="116" w:name="ref-rezende_landscapes_2014"/>
     <w:p>
       <w:pPr>
         <w:pStyle w:val="Bibliography"/>
@@ -11132,7 +13704,7 @@
       <w:r>
         <w:t xml:space="preserve"> </w:t>
       </w:r>
-      <w:hyperlink r:id="rId95">
+      <w:hyperlink r:id="rId115">
         <w:r>
           <w:rPr>
             <w:rStyle w:val="Hyperlink"/>
@@ -11157,8 +13729,8 @@
         <w:t xml:space="preserve">, 28, 799–809.</w:t>
       </w:r>
     </w:p>
-    <w:bookmarkEnd w:id="96"/>
-    <w:bookmarkStart w:id="98" w:name="ref-ritz_ecotox_2010"/>
+    <w:bookmarkEnd w:id="116"/>
+    <w:bookmarkStart w:id="118" w:name="ref-ritz_ecotox_2010"/>
     <w:p>
       <w:pPr>
         <w:pStyle w:val="Bibliography"/>
@@ -11169,7 +13741,7 @@
       <w:r>
         <w:t xml:space="preserve"> </w:t>
       </w:r>
-      <w:hyperlink r:id="rId97">
+      <w:hyperlink r:id="rId117">
         <w:r>
           <w:rPr>
             <w:rStyle w:val="Hyperlink"/>
@@ -11194,8 +13766,8 @@
         <w:t xml:space="preserve">, 29, 220–229.</w:t>
       </w:r>
     </w:p>
-    <w:bookmarkEnd w:id="98"/>
-    <w:bookmarkStart w:id="100" w:name="ref-ritz_drc_2015"/>
+    <w:bookmarkEnd w:id="118"/>
+    <w:bookmarkStart w:id="120" w:name="ref-ritz_drc_2015"/>
     <w:p>
       <w:pPr>
         <w:pStyle w:val="Bibliography"/>
@@ -11206,7 +13778,7 @@
       <w:r>
         <w:t xml:space="preserve"> </w:t>
       </w:r>
-      <w:hyperlink r:id="rId99">
+      <w:hyperlink r:id="rId119">
         <w:r>
           <w:rPr>
             <w:rStyle w:val="Hyperlink"/>
@@ -11243,8 +13815,8 @@
         <w:t xml:space="preserve">, 10, e0146021.</w:t>
       </w:r>
     </w:p>
-    <w:bookmarkEnd w:id="100"/>
-    <w:bookmarkStart w:id="102" w:name="ref-ritz_streibig_2008"/>
+    <w:bookmarkEnd w:id="120"/>
+    <w:bookmarkStart w:id="122" w:name="ref-ritz_streibig_2008"/>
     <w:p>
       <w:pPr>
         <w:pStyle w:val="Bibliography"/>
@@ -11255,7 +13827,7 @@
       <w:r>
         <w:t xml:space="preserve"> </w:t>
       </w:r>
-      <w:hyperlink r:id="rId101">
+      <w:hyperlink r:id="rId121">
         <w:r>
           <w:rPr>
             <w:rStyle w:val="Hyperlink"/>
@@ -11285,8 +13857,8 @@
         <w:t xml:space="preserve">. Springer-Verlag, New York.</w:t>
       </w:r>
     </w:p>
-    <w:bookmarkEnd w:id="102"/>
-    <w:bookmarkStart w:id="104" w:name="ref-rudemo_random_1989"/>
+    <w:bookmarkEnd w:id="122"/>
+    <w:bookmarkStart w:id="124" w:name="ref-rudemo_random_1989"/>
     <w:p>
       <w:pPr>
         <w:pStyle w:val="Bibliography"/>
@@ -11297,7 +13869,7 @@
       <w:r>
         <w:t xml:space="preserve"> </w:t>
       </w:r>
-      <w:hyperlink r:id="rId103">
+      <w:hyperlink r:id="rId123">
         <w:r>
           <w:rPr>
             <w:rStyle w:val="Hyperlink"/>
@@ -11322,8 +13894,8 @@
         <w:t xml:space="preserve">, 45, 349–362.</w:t>
       </w:r>
     </w:p>
-    <w:bookmarkEnd w:id="104"/>
-    <w:bookmarkStart w:id="106" w:name="ref-schielzeth_centering_2010"/>
+    <w:bookmarkEnd w:id="124"/>
+    <w:bookmarkStart w:id="126" w:name="ref-schielzeth_centering_2010"/>
     <w:p>
       <w:pPr>
         <w:pStyle w:val="Bibliography"/>
@@ -11334,7 +13906,7 @@
       <w:r>
         <w:t xml:space="preserve"> </w:t>
       </w:r>
-      <w:hyperlink r:id="rId105">
+      <w:hyperlink r:id="rId125">
         <w:r>
           <w:rPr>
             <w:rStyle w:val="Hyperlink"/>
@@ -11359,8 +13931,8 @@
         <w:t xml:space="preserve">, 1, 103–113.</w:t>
       </w:r>
     </w:p>
-    <w:bookmarkEnd w:id="106"/>
-    <w:bookmarkStart w:id="108" w:name="ref-smale_marine_2019"/>
+    <w:bookmarkEnd w:id="126"/>
+    <w:bookmarkStart w:id="128" w:name="ref-smale_marine_2019"/>
     <w:p>
       <w:pPr>
         <w:pStyle w:val="Bibliography"/>
@@ -11384,7 +13956,7 @@
       <w:r>
         <w:t xml:space="preserve"> </w:t>
       </w:r>
-      <w:hyperlink r:id="rId107">
+      <w:hyperlink r:id="rId127">
         <w:r>
           <w:rPr>
             <w:rStyle w:val="Hyperlink"/>
@@ -11409,8 +13981,8 @@
         <w:t xml:space="preserve">, 9, 306–312.</w:t>
       </w:r>
     </w:p>
-    <w:bookmarkEnd w:id="108"/>
-    <w:bookmarkStart w:id="110" w:name="ref-snook_fertility_2026"/>
+    <w:bookmarkEnd w:id="128"/>
+    <w:bookmarkStart w:id="130" w:name="ref-snook_fertility_2026"/>
     <w:p>
       <w:pPr>
         <w:pStyle w:val="Bibliography"/>
@@ -11421,7 +13993,7 @@
       <w:r>
         <w:t xml:space="preserve"> </w:t>
       </w:r>
-      <w:hyperlink r:id="rId109">
+      <w:hyperlink r:id="rId129">
         <w:r>
           <w:rPr>
             <w:rStyle w:val="Hyperlink"/>
@@ -11446,8 +14018,8 @@
         <w:t xml:space="preserve">, 2, 225–241.</w:t>
       </w:r>
     </w:p>
-    <w:bookmarkEnd w:id="110"/>
-    <w:bookmarkStart w:id="112" w:name="ref-sunday_global_2011"/>
+    <w:bookmarkEnd w:id="130"/>
+    <w:bookmarkStart w:id="132" w:name="ref-sunday_global_2011"/>
     <w:p>
       <w:pPr>
         <w:pStyle w:val="Bibliography"/>
@@ -11458,7 +14030,7 @@
       <w:r>
         <w:t xml:space="preserve"> </w:t>
       </w:r>
-      <w:hyperlink r:id="rId111">
+      <w:hyperlink r:id="rId131">
         <w:r>
           <w:rPr>
             <w:rStyle w:val="Hyperlink"/>
@@ -11483,8 +14055,8 @@
         <w:t xml:space="preserve">, 278, 1823–1830.</w:t>
       </w:r>
     </w:p>
-    <w:bookmarkEnd w:id="112"/>
-    <w:bookmarkStart w:id="114" w:name="ref-sunday_redistribution_2012"/>
+    <w:bookmarkEnd w:id="132"/>
+    <w:bookmarkStart w:id="134" w:name="ref-sunday_redistribution_2012"/>
     <w:p>
       <w:pPr>
         <w:pStyle w:val="Bibliography"/>
@@ -11495,7 +14067,7 @@
       <w:r>
         <w:t xml:space="preserve"> </w:t>
       </w:r>
-      <w:hyperlink r:id="rId113">
+      <w:hyperlink r:id="rId133">
         <w:r>
           <w:rPr>
             <w:rStyle w:val="Hyperlink"/>
@@ -11520,8 +14092,8 @@
         <w:t xml:space="preserve">, 2, 686–690.</w:t>
       </w:r>
     </w:p>
-    <w:bookmarkEnd w:id="114"/>
-    <w:bookmarkStart w:id="116" w:name="ref-truebano2018"/>
+    <w:bookmarkEnd w:id="134"/>
+    <w:bookmarkStart w:id="136" w:name="ref-truebano2018"/>
     <w:p>
       <w:pPr>
         <w:pStyle w:val="Bibliography"/>
@@ -11532,7 +14104,7 @@
       <w:r>
         <w:t xml:space="preserve"> </w:t>
       </w:r>
-      <w:hyperlink r:id="rId115">
+      <w:hyperlink r:id="rId135">
         <w:r>
           <w:rPr>
             <w:rStyle w:val="Hyperlink"/>
@@ -11557,8 +14129,8 @@
         <w:t xml:space="preserve">, 221, jeb171629.</w:t>
       </w:r>
     </w:p>
-    <w:bookmarkEnd w:id="116"/>
-    <w:bookmarkStart w:id="118" w:name="ref-villeneuve_dynamic_2024"/>
+    <w:bookmarkEnd w:id="136"/>
+    <w:bookmarkStart w:id="138" w:name="ref-villeneuve_dynamic_2024"/>
     <w:p>
       <w:pPr>
         <w:pStyle w:val="Bibliography"/>
@@ -11569,7 +14141,7 @@
       <w:r>
         <w:t xml:space="preserve"> </w:t>
       </w:r>
-      <w:hyperlink r:id="rId117">
+      <w:hyperlink r:id="rId137">
         <w:r>
           <w:rPr>
             <w:rStyle w:val="Hyperlink"/>
@@ -11594,8 +14166,8 @@
         <w:t xml:space="preserve">, 94, 1515–1527.</w:t>
       </w:r>
     </w:p>
-    <w:bookmarkEnd w:id="118"/>
-    <w:bookmarkStart w:id="120" w:name="ref-wiens_localextinctions_2016"/>
+    <w:bookmarkEnd w:id="138"/>
+    <w:bookmarkStart w:id="140" w:name="ref-wiens_localextinctions_2016"/>
     <w:p>
       <w:pPr>
         <w:pStyle w:val="Bibliography"/>
@@ -11606,7 +14178,7 @@
       <w:r>
         <w:t xml:space="preserve"> </w:t>
       </w:r>
-      <w:hyperlink r:id="rId119">
+      <w:hyperlink r:id="rId139">
         <w:r>
           <w:rPr>
             <w:rStyle w:val="Hyperlink"/>
@@ -11631,9 +14203,96 @@
         <w:t xml:space="preserve">, 14, e2001104.</w:t>
       </w:r>
     </w:p>
-    <w:bookmarkEnd w:id="120"/>
-    <w:bookmarkEnd w:id="121"/>
-    <w:bookmarkEnd w:id="122"/>
+    <w:bookmarkEnd w:id="140"/>
+    <w:bookmarkStart w:id="142" w:name="ref-williams2024"/>
+    <w:p>
+      <w:pPr>
+        <w:pStyle w:val="Bibliography"/>
+      </w:pPr>
+      <w:r>
+        <w:t xml:space="preserve">Williams, C., Yang, Y., Lagisz, M., Morrison, K., Ricolfi, L., Warton, D.I.,</w:t>
+      </w:r>
+      <w:r>
+        <w:t xml:space="preserve"> </w:t>
+      </w:r>
+      <w:r>
+        <w:rPr>
+          <w:i/>
+          <w:iCs/>
+        </w:rPr>
+        <w:t xml:space="preserve">et al.</w:t>
+      </w:r>
+      <w:r>
+        <w:t xml:space="preserve"> (2024).</w:t>
+      </w:r>
+      <w:r>
+        <w:t xml:space="preserve"> </w:t>
+      </w:r>
+      <w:hyperlink r:id="rId141">
+        <w:r>
+          <w:rPr>
+            <w:rStyle w:val="Hyperlink"/>
+          </w:rPr>
+          <w:t xml:space="preserve">Transparent reporting items for simulation studies evaluating statistical methods: Foundations for reproducibility and reliability</w:t>
+        </w:r>
+      </w:hyperlink>
+      <w:r>
+        <w:t xml:space="preserve">.</w:t>
+      </w:r>
+      <w:r>
+        <w:t xml:space="preserve"> </w:t>
+      </w:r>
+      <w:r>
+        <w:rPr>
+          <w:i/>
+          <w:iCs/>
+        </w:rPr>
+        <w:t xml:space="preserve">Methods in Ecology and Evolution</w:t>
+      </w:r>
+      <w:r>
+        <w:t xml:space="preserve">, 15, 1926–1939.</w:t>
+      </w:r>
+    </w:p>
+    <w:bookmarkEnd w:id="142"/>
+    <w:bookmarkStart w:id="144" w:name="ref-zamora2026"/>
+    <w:p>
+      <w:pPr>
+        <w:pStyle w:val="Bibliography"/>
+      </w:pPr>
+      <w:r>
+        <w:t xml:space="preserve">Zamora, C.A., Avilés-Hernández, D., Molina, A.N., Carter, M.J. &amp; Rezende, E.L. (2026).</w:t>
+      </w:r>
+      <w:r>
+        <w:t xml:space="preserve"> </w:t>
+      </w:r>
+      <w:hyperlink r:id="rId143">
+        <w:r>
+          <w:rPr>
+            <w:rStyle w:val="Hyperlink"/>
+          </w:rPr>
+          <w:t xml:space="preserve">Predicting heat mortality in freshwater communities: Temperature and oxygen effects</w:t>
+        </w:r>
+      </w:hyperlink>
+      <w:r>
+        <w:t xml:space="preserve">.</w:t>
+      </w:r>
+      <w:r>
+        <w:t xml:space="preserve"> </w:t>
+      </w:r>
+      <w:r>
+        <w:rPr>
+          <w:i/>
+          <w:iCs/>
+        </w:rPr>
+        <w:t xml:space="preserve">Ecography</w:t>
+      </w:r>
+      <w:r>
+        <w:t xml:space="preserve">, 2026, e08277.</w:t>
+      </w:r>
+    </w:p>
+    <w:bookmarkEnd w:id="144"/>
+    <w:bookmarkEnd w:id="145"/>
+    <w:bookmarkEnd w:id="146"/>
     <w:sectPr>
       <w:pgSz w:h="15840" w:w="12240"/>
       <w:pgMar w:bottom="1440" w:footer="720" w:gutter="0" w:header="720" w:left="1440" w:right="1440" w:top="1440"/>

</xml_diff>